<commit_message>
Bản nộp: cân lại khoảng cách bìa, chỉ in đậm tên người hướng dẫn
Co-Authored-By: Claude Opus 5.5 <noreply@anthropic.com>
Claude-Session: https://claude.ai/code/session_012s8WfVyLuhc473yaQuJygq
</commit_message>
<xml_diff>
--- a/outputs/nop/DEM D2.2026 - Đề cương nghiên cứu - Nguyễn Văn Trung.docx
+++ b/outputs/nop/DEM D2.2026 - Đề cương nghiên cứu - Nguyễn Văn Trung.docx
@@ -40,7 +40,7 @@
     </w:p>
     <w:p>
       <w:pPr>
-        <w:spacing w:before="0" w:after="1700" w:line="240" w:lineRule="auto"/>
+        <w:spacing w:before="120" w:after="1000" w:line="240" w:lineRule="auto"/>
         <w:jc w:val="center"/>
         <w:rPr>
           <w:sz w:val="28"/>
@@ -95,14 +95,15 @@
         <w:spacing w:before="0" w:after="120" w:line="240" w:lineRule="auto"/>
         <w:jc w:val="center"/>
         <w:rPr>
-          <w:sz w:val="28"/>
-          <w:szCs w:val="28"/>
-        </w:rPr>
-      </w:pPr>
-      <w:r>
-        <w:rPr>
-          <w:sz w:val="28"/>
-          <w:szCs w:val="28"/>
+          <w:sz w:val="26"/>
+          <w:szCs w:val="26"/>
+        </w:rPr>
+      </w:pPr>
+      <w:r>
+        <w:rPr>
+          <w:i/>
+          <w:sz w:val="26"/>
+          <w:szCs w:val="26"/>
         </w:rPr>
         <w:t>Tên đề cương nghiên cứu:</w:t>
       </w:r>
@@ -134,7 +135,7 @@
     </w:p>
     <w:p>
       <w:pPr>
-        <w:spacing w:before="1400" w:after="1400" w:line="240" w:lineRule="auto"/>
+        <w:spacing w:before="1300" w:after="1300" w:line="240" w:lineRule="auto"/>
         <w:jc w:val="center"/>
         <w:rPr>
           <w:sz w:val="36"/>
@@ -262,17 +263,31 @@
       </w:pPr>
       <w:r>
         <w:rPr>
+          <w:sz w:val="28"/>
+          <w:szCs w:val="28"/>
+        </w:rPr>
+        <w:t xml:space="preserve">- </w:t>
+      </w:r>
+      <w:r>
+        <w:rPr>
           <w:b/>
           <w:bCs/>
           <w:sz w:val="28"/>
           <w:szCs w:val="28"/>
         </w:rPr>
-        <w:t xml:space="preserve">- PGS.TS. Hà Hồng Hạnh - Trường Đại học Kinh tế Quốc dân</w:t>
-      </w:r>
-    </w:p>
-    <w:p>
-      <w:pPr>
-        <w:spacing w:before="1300" w:after="0" w:line="240" w:lineRule="auto"/>
+        <w:t xml:space="preserve">PGS.TS. Hà Hồng Hạnh</w:t>
+      </w:r>
+      <w:r>
+        <w:rPr>
+          <w:sz w:val="28"/>
+          <w:szCs w:val="28"/>
+        </w:rPr>
+        <w:t xml:space="preserve"> - Trường Đại học Kinh tế Quốc dân</w:t>
+      </w:r>
+    </w:p>
+    <w:p>
+      <w:pPr>
+        <w:spacing w:before="2300" w:after="0" w:line="240" w:lineRule="auto"/>
         <w:jc w:val="center"/>
         <w:rPr>
           <w:sz w:val="28"/>

</xml_diff>

<commit_message>
Bản nộp: nới khung bìa ra gần mép giấy, cân lại khoảng cách
Co-Authored-By: Claude Opus 5.5 <noreply@anthropic.com>
Claude-Session: https://claude.ai/code/session_012s8WfVyLuhc473yaQuJygq
</commit_message>
<xml_diff>
--- a/outputs/nop/DEM D2.2026 - Đề cương nghiên cứu - Nguyễn Văn Trung.docx
+++ b/outputs/nop/DEM D2.2026 - Đề cương nghiên cứu - Nguyễn Văn Trung.docx
@@ -40,7 +40,7 @@
     </w:p>
     <w:p>
       <w:pPr>
-        <w:spacing w:before="120" w:after="1000" w:line="240" w:lineRule="auto"/>
+        <w:spacing w:before="120" w:after="1300" w:line="240" w:lineRule="auto"/>
         <w:jc w:val="center"/>
         <w:rPr>
           <w:sz w:val="28"/>
@@ -135,7 +135,7 @@
     </w:p>
     <w:p>
       <w:pPr>
-        <w:spacing w:before="1300" w:after="1300" w:line="240" w:lineRule="auto"/>
+        <w:spacing w:before="1600" w:after="1600" w:line="240" w:lineRule="auto"/>
         <w:jc w:val="center"/>
         <w:rPr>
           <w:sz w:val="36"/>
@@ -155,7 +155,7 @@
     <w:p>
       <w:pPr>
         <w:spacing w:before="0" w:after="100" w:line="240" w:lineRule="auto"/>
-        <w:ind w:left="1134"/>
+        <w:ind w:left="1800"/>
         <w:jc w:val="left"/>
         <w:rPr>
           <w:sz w:val="28"/>
@@ -173,7 +173,7 @@
     <w:p>
       <w:pPr>
         <w:spacing w:before="0" w:after="100" w:line="240" w:lineRule="auto"/>
-        <w:ind w:left="1134"/>
+        <w:ind w:left="1800"/>
         <w:jc w:val="left"/>
         <w:rPr>
           <w:sz w:val="28"/>
@@ -191,7 +191,7 @@
     <w:p>
       <w:pPr>
         <w:spacing w:before="0" w:after="100" w:line="240" w:lineRule="auto"/>
-        <w:ind w:left="1134"/>
+        <w:ind w:left="1800"/>
         <w:jc w:val="left"/>
         <w:rPr>
           <w:sz w:val="28"/>
@@ -218,7 +218,7 @@
     <w:p>
       <w:pPr>
         <w:spacing w:before="0" w:after="100" w:line="240" w:lineRule="auto"/>
-        <w:ind w:left="1134"/>
+        <w:ind w:left="1800"/>
         <w:jc w:val="left"/>
         <w:rPr>
           <w:sz w:val="28"/>
@@ -236,7 +236,7 @@
     <w:p>
       <w:pPr>
         <w:spacing w:before="0" w:after="100" w:line="240" w:lineRule="auto"/>
-        <w:ind w:left="1134"/>
+        <w:ind w:left="1800"/>
         <w:jc w:val="left"/>
         <w:rPr>
           <w:sz w:val="28"/>
@@ -254,7 +254,7 @@
     <w:p>
       <w:pPr>
         <w:spacing w:before="0" w:after="0" w:line="240" w:lineRule="auto"/>
-        <w:ind w:left="1134"/>
+        <w:ind w:left="1800"/>
         <w:jc w:val="left"/>
         <w:rPr>
           <w:sz w:val="28"/>
@@ -287,7 +287,7 @@
     </w:p>
     <w:p>
       <w:pPr>
-        <w:spacing w:before="2300" w:after="0" w:line="240" w:lineRule="auto"/>
+        <w:spacing w:before="2000" w:after="0" w:line="240" w:lineRule="auto"/>
         <w:jc w:val="center"/>
         <w:rPr>
           <w:sz w:val="28"/>
@@ -309,12 +309,12 @@
         <w:sectPr>
           <w:footerReference w:type="default" r:id="rId9"/>
           <w:pgSz w:w="11906" w:h="16838"/>
-          <w:pgMar w:top="1134" w:right="1134" w:bottom="1134" w:left="1701" w:header="567" w:footer="567" w:gutter="0"/>
+          <w:pgMar w:top="850" w:right="850" w:bottom="850" w:left="1134" w:header="567" w:footer="567" w:gutter="0"/>
           <w:pgBorders w:offsetFrom="text">
-            <w:top w:val="thinThickSmallGap" w:sz="24" w:space="8" w:color="auto"/>
-            <w:left w:val="thinThickSmallGap" w:sz="24" w:space="8" w:color="auto"/>
-            <w:bottom w:val="thickThinSmallGap" w:sz="24" w:space="8" w:color="auto"/>
-            <w:right w:val="thickThinSmallGap" w:sz="24" w:space="8" w:color="auto"/>
+            <w:top w:val="thinThickSmallGap" w:sz="24" w:space="4" w:color="auto"/>
+            <w:left w:val="thinThickSmallGap" w:sz="24" w:space="4" w:color="auto"/>
+            <w:bottom w:val="thickThinSmallGap" w:sz="24" w:space="4" w:color="auto"/>
+            <w:right w:val="thickThinSmallGap" w:sz="24" w:space="4" w:color="auto"/>
           </w:pgBorders>
           <w:cols w:space="720"/>
           <w:docGrid w:linePitch="360"/>

</xml_diff>

<commit_message>
Bản nộp: chú thích hình dùng Heading 4, chú thích bảng dùng Heading 5, đánh số tự động; danh mục lấy theo hai style này
Co-Authored-By: Claude Opus 5.5 <noreply@anthropic.com>
Claude-Session: https://claude.ai/code/session_012s8WfVyLuhc473yaQuJygq
</commit_message>
<xml_diff>
--- a/outputs/nop/DEM D2.2026 - Đề cương nghiên cứu - Nguyễn Văn Trung.docx
+++ b/outputs/nop/DEM D2.2026 - Đề cương nghiên cứu - Nguyễn Văn Trung.docx
@@ -2502,7 +2502,7 @@
         <w:fldChar w:fldCharType="begin"/>
       </w:r>
       <w:r>
-        <w:instrText xml:space="preserve"> TOC \h \z \c "Bảng" </w:instrText>
+        <w:instrText xml:space="preserve"> TOC \o "5-5" \h \z </w:instrText>
       </w:r>
       <w:r>
         <w:fldChar w:fldCharType="separate"/>
@@ -3029,7 +3029,7 @@
         <w:fldChar w:fldCharType="begin"/>
       </w:r>
       <w:r>
-        <w:instrText xml:space="preserve"> TOC \h \z \c "Hình" </w:instrText>
+        <w:instrText xml:space="preserve"> TOC \o "4-4" \h \z </w:instrText>
       </w:r>
       <w:r>
         <w:fldChar w:fldCharType="separate"/>
@@ -4288,22 +4288,11 @@
     </w:p>
     <w:p>
       <w:pPr>
-        <w:pStyle w:val="TableCaption"/>
+        <w:pStyle w:val="Heading5"/>
       </w:pPr>
       <w:bookmarkStart w:id="6" w:name="_Toc242353156"/>
       <w:r>
-        <w:t xml:space="preserve">Bảng </w:t>
-      </w:r>
-      <w:fldSimple w:instr=" SEQ Bảng \* ARABIC ">
-        <w:r>
-          <w:rPr>
-            <w:noProof/>
-          </w:rPr>
-          <w:t>1</w:t>
-        </w:r>
-      </w:fldSimple>
-      <w:r>
-        <w:t>. Các nhóm nghiên cứu gần nhất và khoảng trống nghiên cứu</w:t>
+        <w:t>Các nhóm nghiên cứu gần nhất và khoảng trống nghiên cứu</w:t>
       </w:r>
       <w:bookmarkEnd w:id="6"/>
     </w:p>
@@ -6110,10 +6099,10 @@
     </w:p>
     <w:p>
       <w:pPr>
-        <w:pStyle w:val="FigureCaption"/>
-      </w:pPr>
-      <w:r>
-        <w:t>Hình 1. Khung phân tích: hợp nhất sàn, chất lượng thị trường và khả năng đầu tư</w:t>
+        <w:pStyle w:val="Heading4"/>
+      </w:pPr>
+      <w:r>
+        <w:t>Khung phân tích: hợp nhất sàn, chất lượng thị trường và khả năng đầu tư</w:t>
       </w:r>
     </w:p>
     <w:p>
@@ -6135,21 +6124,10 @@
     </w:p>
     <w:p>
       <w:pPr>
-        <w:pStyle w:val="TableCaption"/>
-      </w:pPr>
-      <w:r>
-        <w:t xml:space="preserve">Bảng </w:t>
-      </w:r>
-      <w:fldSimple w:instr=" SEQ Bảng \* ARABIC ">
-        <w:r>
-          <w:rPr>
-            <w:noProof/>
-          </w:rPr>
-          <w:t>2</w:t>
-        </w:r>
-      </w:fldSimple>
-      <w:r>
-        <w:t>. Giả thuyết, thước đo và cơ sở lý thuyết</w:t>
+        <w:pStyle w:val="Heading5"/>
+      </w:pPr>
+      <w:r>
+        <w:t>Giả thuyết, thước đo và cơ sở lý thuyết</w:t>
       </w:r>
       <w:bookmarkEnd w:id="13"/>
     </w:p>
@@ -7112,22 +7090,11 @@
     </w:p>
     <w:p>
       <w:pPr>
-        <w:pStyle w:val="TableCaption"/>
+        <w:pStyle w:val="Heading5"/>
       </w:pPr>
       <w:bookmarkStart w:id="18" w:name="_Toc242353158"/>
       <w:r>
-        <w:t xml:space="preserve">Bảng </w:t>
-      </w:r>
-      <w:fldSimple w:instr=" SEQ Bảng \* ARABIC ">
-        <w:r>
-          <w:rPr>
-            <w:noProof/>
-          </w:rPr>
-          <w:t>3</w:t>
-        </w:r>
-      </w:fldSimple>
-      <w:r>
-        <w:t>. Bảy mô hình phân bổ dùng làm công cụ đo khả năng đầu tư</w:t>
+        <w:t>Bảy mô hình phân bổ dùng làm công cụ đo khả năng đầu tư</w:t>
       </w:r>
       <w:bookmarkEnd w:id="18"/>
     </w:p>
@@ -9189,22 +9156,11 @@
     </w:p>
     <w:p>
       <w:pPr>
-        <w:pStyle w:val="FigureCaption"/>
+        <w:pStyle w:val="Heading4"/>
       </w:pPr>
       <w:bookmarkStart w:id="21" w:name="_Toc242353164"/>
       <w:r>
-        <w:t xml:space="preserve">Hình </w:t>
-      </w:r>
-      <w:fldSimple w:instr=" SEQ Hình \* ARABIC ">
-        <w:r>
-          <w:rPr>
-            <w:noProof/>
-          </w:rPr>
-          <w:t>2</w:t>
-        </w:r>
-      </w:fldSimple>
-      <w:r>
-        <w:t>. Cửa sổ ước lượng, cửa sổ đánh giá và cách tính khoảng cách khả năng đầu tư</w:t>
+        <w:t>Cửa sổ ước lượng, cửa sổ đánh giá và cách tính khoảng cách khả năng đầu tư</w:t>
       </w:r>
       <w:bookmarkEnd w:id="21"/>
     </w:p>
@@ -10786,22 +10742,11 @@
     </w:p>
     <w:p>
       <w:pPr>
-        <w:pStyle w:val="FigureCaption"/>
+        <w:pStyle w:val="Heading4"/>
       </w:pPr>
       <w:bookmarkStart w:id="28" w:name="_Toc242353165"/>
       <w:r>
-        <w:t xml:space="preserve">Hình </w:t>
-      </w:r>
-      <w:fldSimple w:instr=" SEQ Hình \* ARABIC ">
-        <w:r>
-          <w:rPr>
-            <w:noProof/>
-          </w:rPr>
-          <w:t>3</w:t>
-        </w:r>
-      </w:fldSimple>
-      <w:r>
-        <w:t>. Quy trình nghiên cứu</w:t>
+        <w:t>Quy trình nghiên cứu</w:t>
       </w:r>
       <w:bookmarkEnd w:id="28"/>
     </w:p>
@@ -11113,22 +11058,11 @@
     </w:p>
     <w:p>
       <w:pPr>
-        <w:pStyle w:val="TableCaption"/>
+        <w:pStyle w:val="Heading5"/>
       </w:pPr>
       <w:bookmarkStart w:id="35" w:name="_Toc242353159"/>
       <w:r>
-        <w:t xml:space="preserve">Bảng </w:t>
-      </w:r>
-      <w:fldSimple w:instr=" SEQ Bảng \* ARABIC ">
-        <w:r>
-          <w:rPr>
-            <w:noProof/>
-          </w:rPr>
-          <w:t>4</w:t>
-        </w:r>
-      </w:fldSimple>
-      <w:r>
-        <w:t>. Dự kiến bố cục các chương và tiểu mục của luận án</w:t>
+        <w:t>Dự kiến bố cục các chương và tiểu mục của luận án</w:t>
       </w:r>
       <w:bookmarkEnd w:id="35"/>
     </w:p>
@@ -12332,22 +12266,11 @@
     </w:p>
     <w:p>
       <w:pPr>
-        <w:pStyle w:val="TableCaption"/>
+        <w:pStyle w:val="Heading5"/>
       </w:pPr>
       <w:bookmarkStart w:id="50" w:name="_Toc242353160"/>
       <w:r>
-        <w:t xml:space="preserve">Bảng </w:t>
-      </w:r>
-      <w:fldSimple w:instr=" SEQ Bảng \* ARABIC ">
-        <w:r>
-          <w:rPr>
-            <w:noProof/>
-          </w:rPr>
-          <w:t>5</w:t>
-        </w:r>
-      </w:fldSimple>
-      <w:r>
-        <w:t>. Kế hoạch thực hiện luận án theo bốn năm và sản phẩm dự kiến</w:t>
+        <w:t>Kế hoạch thực hiện luận án theo bốn năm và sản phẩm dự kiến</w:t>
       </w:r>
       <w:bookmarkEnd w:id="50"/>
     </w:p>
@@ -12891,22 +12814,11 @@
     </w:p>
     <w:p>
       <w:pPr>
-        <w:pStyle w:val="TableCaption"/>
+        <w:pStyle w:val="Heading5"/>
       </w:pPr>
       <w:bookmarkStart w:id="55" w:name="_Toc242353161"/>
       <w:r>
-        <w:t xml:space="preserve">Bảng </w:t>
-      </w:r>
-      <w:fldSimple w:instr=" SEQ Bảng \* ARABIC ">
-        <w:r>
-          <w:rPr>
-            <w:noProof/>
-          </w:rPr>
-          <w:t>6</w:t>
-        </w:r>
-      </w:fldSimple>
-      <w:r>
-        <w:t>. Công trình đã công bố hoặc đã được chấp nhận đăng</w:t>
+        <w:t>Công trình đã công bố hoặc đã được chấp nhận đăng</w:t>
       </w:r>
       <w:bookmarkEnd w:id="55"/>
     </w:p>
@@ -13396,22 +13308,11 @@
     </w:p>
     <w:p>
       <w:pPr>
-        <w:pStyle w:val="TableCaption"/>
+        <w:pStyle w:val="Heading5"/>
       </w:pPr>
       <w:bookmarkStart w:id="56" w:name="_Toc242353162"/>
       <w:r>
-        <w:t xml:space="preserve">Bảng </w:t>
-      </w:r>
-      <w:fldSimple w:instr=" SEQ Bảng \* ARABIC ">
-        <w:r>
-          <w:rPr>
-            <w:noProof/>
-          </w:rPr>
-          <w:t>7</w:t>
-        </w:r>
-      </w:fldSimple>
-      <w:r>
-        <w:t>. Bản thảo đã gửi tạp chí, chưa công bố tại ngày 30/9/2026</w:t>
+        <w:t>Bản thảo đã gửi tạp chí, chưa công bố tại ngày 30/9/2026</w:t>
       </w:r>
       <w:bookmarkEnd w:id="56"/>
     </w:p>
@@ -19210,6 +19111,34 @@
       </w:rPr>
     </w:lvl>
   </w:abstractNum>
+  <w:abstractNum w:abstractNumId="90">
+    <w:multiLevelType w:val="singleLevel"/>
+    <w:lvl w:ilvl="0">
+      <w:start w:val="1"/>
+      <w:numFmt w:val="decimal"/>
+      <w:pStyle w:val="Heading4"/>
+      <w:suff w:val="space"/>
+      <w:lvlText w:val="Hình %1."/>
+      <w:lvlJc w:val="left"/>
+      <w:pPr>
+        <w:ind w:left="0" w:firstLine="0"/>
+      </w:pPr>
+    </w:lvl>
+  </w:abstractNum>
+  <w:abstractNum w:abstractNumId="91">
+    <w:multiLevelType w:val="singleLevel"/>
+    <w:lvl w:ilvl="0">
+      <w:start w:val="1"/>
+      <w:numFmt w:val="decimal"/>
+      <w:pStyle w:val="Heading5"/>
+      <w:suff w:val="space"/>
+      <w:lvlText w:val="Bảng %1."/>
+      <w:lvlJc w:val="left"/>
+      <w:pPr>
+        <w:ind w:left="0" w:firstLine="0"/>
+      </w:pPr>
+    </w:lvl>
+  </w:abstractNum>
   <w:num w:numId="1" w16cid:durableId="1646162494">
     <w:abstractNumId w:val="0"/>
   </w:num>
@@ -19236,6 +19165,12 @@
   </w:num>
   <w:num w:numId="9" w16cid:durableId="1111169948">
     <w:abstractNumId w:val="7"/>
+  </w:num>
+  <w:num w:numId="90">
+    <w:abstractNumId w:val="90"/>
+  </w:num>
+  <w:num w:numId="91">
+    <w:abstractNumId w:val="91"/>
   </w:num>
 </w:numbering>
 </file>
@@ -20510,6 +20445,52 @@
         <w:bCs/>
       </w:rPr>
     </w:tblStylePr>
+  </w:style>
+  <w:style w:type="paragraph" w:styleId="Heading4">
+    <w:name w:val="heading 4"/>
+    <w:basedOn w:val="Normal"/>
+    <w:next w:val="Normal"/>
+    <w:uiPriority w:val="9"/>
+    <w:unhideWhenUsed/>
+    <w:qFormat/>
+    <w:pPr>
+      <w:keepNext/>
+      <w:numPr>
+        <w:numId w:val="90"/>
+      </w:numPr>
+      <w:spacing w:before="60" w:line="312" w:lineRule="auto"/>
+      <w:jc w:val="center"/>
+      <w:outlineLvl w:val="3"/>
+    </w:pPr>
+    <w:rPr>
+      <w:b/>
+      <w:bCs/>
+      <w:i w:val="0"/>
+      <w:iCs w:val="0"/>
+    </w:rPr>
+  </w:style>
+  <w:style w:type="paragraph" w:styleId="Heading5">
+    <w:name w:val="heading 5"/>
+    <w:basedOn w:val="Normal"/>
+    <w:next w:val="Normal"/>
+    <w:uiPriority w:val="9"/>
+    <w:unhideWhenUsed/>
+    <w:qFormat/>
+    <w:pPr>
+      <w:keepNext/>
+      <w:numPr>
+        <w:numId w:val="91"/>
+      </w:numPr>
+      <w:spacing w:before="120" w:after="60" w:line="312" w:lineRule="auto"/>
+      <w:jc w:val="center"/>
+      <w:outlineLvl w:val="4"/>
+    </w:pPr>
+    <w:rPr>
+      <w:b/>
+      <w:bCs/>
+      <w:i w:val="0"/>
+      <w:iCs w:val="0"/>
+    </w:rPr>
   </w:style>
 </w:styles>
 </file>

</xml_diff>

<commit_message>
Thư mục nộp: thay bằng bản người dùng đã sửa, thêm bản dài v15 (PDF)
Co-Authored-By: Claude Opus 5.5 <noreply@anthropic.com>
Claude-Session: https://claude.ai/code/session_012s8WfVyLuhc473yaQuJygq
</commit_message>
<xml_diff>
--- a/outputs/nop/DEM D2.2026 - Đề cương nghiên cứu - Nguyễn Văn Trung.docx
+++ b/outputs/nop/DEM D2.2026 - Đề cương nghiên cứu - Nguyễn Văn Trung.docx
@@ -4,54 +4,119 @@
   <w:body>
     <w:p>
       <w:pPr>
-        <w:spacing w:before="0" w:after="0" w:line="240" w:lineRule="auto"/>
+        <w:spacing w:line="276" w:lineRule="auto"/>
         <w:jc w:val="center"/>
-        <w:rPr>
-          <w:sz w:val="28"/>
-          <w:szCs w:val="28"/>
-        </w:rPr>
-      </w:pPr>
-      <w:r>
-        <w:rPr>
-          <w:sz w:val="28"/>
-          <w:szCs w:val="28"/>
-        </w:rPr>
-        <w:t>ĐẠI HỌC QUỐC GIA HÀ NỘI</w:t>
-      </w:r>
-    </w:p>
-    <w:p>
-      <w:pPr>
-        <w:spacing w:before="0" w:after="0" w:line="240" w:lineRule="auto"/>
-        <w:jc w:val="center"/>
-        <w:rPr>
-          <w:sz w:val="28"/>
-          <w:szCs w:val="28"/>
-        </w:rPr>
-      </w:pPr>
-      <w:r>
         <w:rPr>
           <w:b/>
           <w:bCs/>
-          <w:sz w:val="28"/>
-          <w:szCs w:val="28"/>
+          <w:sz w:val="30"/>
+          <w:szCs w:val="30"/>
+        </w:rPr>
+      </w:pPr>
+    </w:p>
+    <w:p>
+      <w:pPr>
+        <w:spacing w:line="276" w:lineRule="auto"/>
+        <w:jc w:val="center"/>
+        <w:rPr>
+          <w:b/>
+          <w:bCs/>
+          <w:sz w:val="30"/>
+          <w:szCs w:val="30"/>
+        </w:rPr>
+      </w:pPr>
+      <w:r>
+        <w:rPr>
+          <w:b/>
+          <w:bCs/>
+          <w:sz w:val="30"/>
+          <w:szCs w:val="30"/>
+        </w:rPr>
+        <w:t>ĐẠI HỌC QUỐC GIA HÀ NỘI</w:t>
+      </w:r>
+    </w:p>
+    <w:p>
+      <w:pPr>
+        <w:spacing w:line="276" w:lineRule="auto"/>
+        <w:jc w:val="center"/>
+        <w:rPr>
+          <w:b/>
+          <w:bCs/>
+          <w:sz w:val="30"/>
+          <w:szCs w:val="30"/>
+        </w:rPr>
+      </w:pPr>
+      <w:r>
+        <w:rPr>
+          <w:b/>
+          <w:bCs/>
+          <w:sz w:val="30"/>
+          <w:szCs w:val="30"/>
         </w:rPr>
         <w:t>TRƯỜNG QUỐC TẾ</w:t>
       </w:r>
     </w:p>
     <w:p>
       <w:pPr>
-        <w:spacing w:before="120" w:after="1300" w:line="240" w:lineRule="auto"/>
+        <w:pStyle w:val="BodyTextIndent"/>
+        <w:spacing w:after="0" w:line="276" w:lineRule="auto"/>
+        <w:ind w:left="0"/>
         <w:jc w:val="center"/>
         <w:rPr>
-          <w:sz w:val="28"/>
-          <w:szCs w:val="28"/>
+          <w:sz w:val="30"/>
+          <w:szCs w:val="30"/>
+        </w:rPr>
+      </w:pPr>
+      <w:r>
+        <w:rPr>
+          <w:sz w:val="30"/>
+          <w:szCs w:val="30"/>
+        </w:rPr>
+        <w:t>---</w:t>
+      </w:r>
+      <w:r>
+        <w:rPr>
+          <w:sz w:val="30"/>
+          <w:szCs w:val="30"/>
+        </w:rPr>
+        <w:sym w:font="Wingdings" w:char="F040"/>
+      </w:r>
+      <w:r>
+        <w:rPr>
+          <w:sz w:val="30"/>
+          <w:szCs w:val="30"/>
+        </w:rPr>
+        <w:sym w:font="Wingdings" w:char="F026"/>
+      </w:r>
+      <w:r>
+        <w:rPr>
+          <w:sz w:val="30"/>
+          <w:szCs w:val="30"/>
+        </w:rPr>
+        <w:sym w:font="Wingdings" w:char="F03F"/>
+      </w:r>
+      <w:r>
+        <w:rPr>
+          <w:sz w:val="30"/>
+          <w:szCs w:val="30"/>
+        </w:rPr>
+        <w:t>---</w:t>
+      </w:r>
+    </w:p>
+    <w:p>
+      <w:pPr>
+        <w:spacing w:before="120" w:after="1300" w:line="276" w:lineRule="auto"/>
+        <w:jc w:val="center"/>
+        <w:rPr>
+          <w:sz w:val="30"/>
+          <w:szCs w:val="30"/>
         </w:rPr>
       </w:pPr>
       <w:r>
         <w:rPr>
           <w:noProof/>
-          <w:sz w:val="28"/>
-          <w:szCs w:val="28"/>
+          <w:sz w:val="30"/>
+          <w:szCs w:val="30"/>
         </w:rPr>
         <w:drawing>
           <wp:inline distT="0" distB="0" distL="0" distR="0" wp14:anchorId="07638A84" wp14:editId="10C5AF57">
@@ -92,214 +157,322 @@
     </w:p>
     <w:p>
       <w:pPr>
-        <w:spacing w:before="0" w:after="120" w:line="240" w:lineRule="auto"/>
+        <w:spacing w:after="120" w:line="276" w:lineRule="auto"/>
         <w:jc w:val="center"/>
         <w:rPr>
-          <w:sz w:val="26"/>
-          <w:szCs w:val="26"/>
-        </w:rPr>
-      </w:pPr>
-      <w:r>
-        <w:rPr>
-          <w:i/>
-          <w:sz w:val="26"/>
-          <w:szCs w:val="26"/>
+          <w:sz w:val="30"/>
+          <w:szCs w:val="30"/>
+        </w:rPr>
+      </w:pPr>
+      <w:r>
+        <w:rPr>
+          <w:sz w:val="30"/>
+          <w:szCs w:val="30"/>
         </w:rPr>
         <w:t>Tên đề cương nghiên cứu:</w:t>
       </w:r>
     </w:p>
     <w:p>
       <w:pPr>
-        <w:spacing w:before="0" w:after="0" w:line="312" w:lineRule="auto"/>
+        <w:pStyle w:val="BodyText"/>
+        <w:spacing w:line="276" w:lineRule="auto"/>
         <w:jc w:val="center"/>
-        <w:rPr>
-          <w:sz w:val="32"/>
-          <w:szCs w:val="32"/>
-        </w:rPr>
-      </w:pPr>
-      <w:r>
         <w:rPr>
           <w:b/>
           <w:bCs/>
-          <w:sz w:val="32"/>
-          <w:szCs w:val="32"/>
-        </w:rPr>
-        <w:t>HỢP NHẤT SÀN CHỨNG KHOÁN</w:t>
-        <w:br/>
-        <w:t>VÀ CHẤT LƯỢNG THỊ TRƯỜNG:</w:t>
-        <w:br/>
-        <w:t>BẰNG CHỨNG THỰC NGHIỆM TỪ HNX</w:t>
-        <w:br/>
-        <w:t>VÀ VỊ THẾ TÀI CHÍNH HÀ NỘI</w:t>
-      </w:r>
-    </w:p>
-    <w:p>
-      <w:pPr>
-        <w:spacing w:before="1600" w:after="1600" w:line="240" w:lineRule="auto"/>
-        <w:jc w:val="center"/>
-        <w:rPr>
-          <w:sz w:val="36"/>
-          <w:szCs w:val="36"/>
+          <w:sz w:val="30"/>
+          <w:szCs w:val="30"/>
         </w:rPr>
       </w:pPr>
       <w:r>
         <w:rPr>
           <w:b/>
           <w:bCs/>
-          <w:sz w:val="36"/>
-          <w:szCs w:val="36"/>
-        </w:rPr>
-        <w:t>ĐỀ CƯƠNG NGHIÊN CỨU</w:t>
-      </w:r>
-    </w:p>
-    <w:p>
-      <w:pPr>
-        <w:spacing w:before="0" w:after="100" w:line="240" w:lineRule="auto"/>
-        <w:ind w:left="1800"/>
-        <w:jc w:val="left"/>
-        <w:rPr>
-          <w:sz w:val="28"/>
-          <w:szCs w:val="28"/>
-        </w:rPr>
-      </w:pPr>
-      <w:r>
-        <w:rPr>
-          <w:sz w:val="28"/>
-          <w:szCs w:val="28"/>
-        </w:rPr>
-        <w:t>Chuyên ngành: Kinh tế và Quản lý</w:t>
-      </w:r>
-    </w:p>
-    <w:p>
-      <w:pPr>
-        <w:spacing w:before="0" w:after="100" w:line="240" w:lineRule="auto"/>
-        <w:ind w:left="1800"/>
-        <w:jc w:val="left"/>
-        <w:rPr>
-          <w:sz w:val="28"/>
-          <w:szCs w:val="28"/>
-        </w:rPr>
-      </w:pPr>
-      <w:r>
-        <w:rPr>
-          <w:sz w:val="28"/>
-          <w:szCs w:val="28"/>
-        </w:rPr>
-        <w:t>Mã số: 9310116.01QTD</w:t>
-      </w:r>
-    </w:p>
-    <w:p>
-      <w:pPr>
-        <w:spacing w:before="0" w:after="100" w:line="240" w:lineRule="auto"/>
-        <w:ind w:left="1800"/>
-        <w:jc w:val="left"/>
-        <w:rPr>
-          <w:sz w:val="28"/>
-          <w:szCs w:val="28"/>
-        </w:rPr>
-      </w:pPr>
-      <w:r>
-        <w:rPr>
-          <w:sz w:val="28"/>
-          <w:szCs w:val="28"/>
-        </w:rPr>
-        <w:t xml:space="preserve">Họ và tên thí sinh: </w:t>
-      </w:r>
-      <w:r>
+          <w:sz w:val="30"/>
+          <w:szCs w:val="30"/>
+        </w:rPr>
+        <w:t>HỢP NHẤT SÀN CHỨNG KHOÁN VÀ CHẤT LƯỢNG THỊ TRƯỜNG: BẰNG CHỨNG THỰC NGHIỆM TỪ HNX VÀ VỊ THẾ TÀI CHÍNH HÀ NỘI</w:t>
+      </w:r>
+    </w:p>
+    <w:p>
+      <w:pPr>
+        <w:spacing w:after="120" w:line="276" w:lineRule="auto"/>
+        <w:jc w:val="center"/>
+        <w:rPr>
+          <w:sz w:val="30"/>
+          <w:szCs w:val="30"/>
+        </w:rPr>
+      </w:pPr>
+    </w:p>
+    <w:p>
+      <w:pPr>
+        <w:pStyle w:val="BodyText"/>
+        <w:spacing w:line="276" w:lineRule="auto"/>
+        <w:jc w:val="center"/>
         <w:rPr>
           <w:b/>
           <w:bCs/>
-          <w:sz w:val="28"/>
-          <w:szCs w:val="28"/>
-        </w:rPr>
-        <w:t>NGUYỄN VĂN TRUNG</w:t>
-      </w:r>
-    </w:p>
-    <w:p>
-      <w:pPr>
-        <w:spacing w:before="0" w:after="100" w:line="240" w:lineRule="auto"/>
-        <w:ind w:left="1800"/>
-        <w:jc w:val="left"/>
-        <w:rPr>
-          <w:sz w:val="28"/>
-          <w:szCs w:val="28"/>
-        </w:rPr>
-      </w:pPr>
-      <w:r>
-        <w:rPr>
-          <w:sz w:val="28"/>
-          <w:szCs w:val="28"/>
-        </w:rPr>
-        <w:t xml:space="preserve">Cơ quan công tác: </w:t>
-      </w:r>
-    </w:p>
-    <w:p>
-      <w:pPr>
-        <w:spacing w:before="0" w:after="100" w:line="240" w:lineRule="auto"/>
-        <w:ind w:left="1800"/>
-        <w:jc w:val="left"/>
-        <w:rPr>
-          <w:sz w:val="28"/>
-          <w:szCs w:val="28"/>
-        </w:rPr>
-      </w:pPr>
-      <w:r>
-        <w:rPr>
-          <w:sz w:val="28"/>
-          <w:szCs w:val="28"/>
-        </w:rPr>
-        <w:t>Người hướng dẫn khoa học (dự kiến):</w:t>
-      </w:r>
-    </w:p>
-    <w:p>
-      <w:pPr>
-        <w:spacing w:before="0" w:after="0" w:line="240" w:lineRule="auto"/>
-        <w:ind w:left="1800"/>
-        <w:jc w:val="left"/>
-        <w:rPr>
-          <w:sz w:val="28"/>
-          <w:szCs w:val="28"/>
-        </w:rPr>
-      </w:pPr>
-      <w:r>
-        <w:rPr>
-          <w:sz w:val="28"/>
-          <w:szCs w:val="28"/>
-        </w:rPr>
-        <w:t xml:space="preserve">- </w:t>
-      </w:r>
+          <w:sz w:val="30"/>
+          <w:szCs w:val="30"/>
+        </w:rPr>
+      </w:pPr>
       <w:r>
         <w:rPr>
           <w:b/>
           <w:bCs/>
-          <w:sz w:val="28"/>
-          <w:szCs w:val="28"/>
-        </w:rPr>
-        <w:t xml:space="preserve">PGS.TS. Hà Hồng Hạnh</w:t>
-      </w:r>
-      <w:r>
-        <w:rPr>
-          <w:sz w:val="28"/>
-          <w:szCs w:val="28"/>
-        </w:rPr>
-        <w:t xml:space="preserve"> - Trường Đại học Kinh tế Quốc dân</w:t>
-      </w:r>
-    </w:p>
-    <w:p>
-      <w:pPr>
-        <w:spacing w:before="2000" w:after="0" w:line="240" w:lineRule="auto"/>
-        <w:jc w:val="center"/>
-        <w:rPr>
-          <w:sz w:val="28"/>
-          <w:szCs w:val="28"/>
-        </w:rPr>
-      </w:pPr>
-      <w:r>
+          <w:sz w:val="30"/>
+          <w:szCs w:val="30"/>
+        </w:rPr>
+        <w:t>ĐỀ CƯƠNG NGHIÊN CỨU</w:t>
+      </w:r>
+    </w:p>
+    <w:p>
+      <w:pPr>
+        <w:spacing w:after="100" w:line="276" w:lineRule="auto"/>
+        <w:ind w:left="1800"/>
+        <w:rPr>
+          <w:sz w:val="30"/>
+          <w:szCs w:val="30"/>
+        </w:rPr>
+      </w:pPr>
+      <w:r>
+        <w:rPr>
+          <w:sz w:val="30"/>
+          <w:szCs w:val="30"/>
+        </w:rPr>
+        <w:t>Chuyên ngành: Kinh tế và Quản lý</w:t>
+      </w:r>
+    </w:p>
+    <w:p>
+      <w:pPr>
+        <w:spacing w:after="100" w:line="276" w:lineRule="auto"/>
+        <w:ind w:left="1800"/>
+        <w:rPr>
+          <w:sz w:val="30"/>
+          <w:szCs w:val="30"/>
+        </w:rPr>
+      </w:pPr>
+      <w:r>
+        <w:rPr>
+          <w:sz w:val="30"/>
+          <w:szCs w:val="30"/>
+        </w:rPr>
+        <w:t>Mã số: 9310116.01QTD</w:t>
+      </w:r>
+    </w:p>
+    <w:p>
+      <w:pPr>
+        <w:spacing w:after="100" w:line="276" w:lineRule="auto"/>
+        <w:ind w:left="1800"/>
         <w:rPr>
           <w:b/>
           <w:bCs/>
-          <w:sz w:val="28"/>
-          <w:szCs w:val="28"/>
+          <w:sz w:val="30"/>
+          <w:szCs w:val="30"/>
+        </w:rPr>
+      </w:pPr>
+      <w:r>
+        <w:rPr>
+          <w:sz w:val="30"/>
+          <w:szCs w:val="30"/>
+        </w:rPr>
+        <w:t xml:space="preserve">Họ và tên thí sinh: </w:t>
+      </w:r>
+      <w:r>
+        <w:rPr>
+          <w:b/>
+          <w:bCs/>
+          <w:sz w:val="30"/>
+          <w:szCs w:val="30"/>
+        </w:rPr>
+        <w:t>Nguyễn Văn Trun</w:t>
+      </w:r>
+      <w:r>
+        <w:rPr>
+          <w:b/>
+          <w:bCs/>
+          <w:sz w:val="30"/>
+          <w:szCs w:val="30"/>
+        </w:rPr>
+        <w:t>g</w:t>
+      </w:r>
+    </w:p>
+    <w:p>
+      <w:pPr>
+        <w:spacing w:after="100" w:line="276" w:lineRule="auto"/>
+        <w:ind w:left="1800"/>
+        <w:rPr>
+          <w:sz w:val="30"/>
+          <w:szCs w:val="30"/>
+        </w:rPr>
+      </w:pPr>
+      <w:r>
+        <w:rPr>
+          <w:sz w:val="30"/>
+          <w:szCs w:val="30"/>
+        </w:rPr>
+        <w:t xml:space="preserve">Cơ quan công tác: </w:t>
+      </w:r>
+    </w:p>
+    <w:p>
+      <w:pPr>
+        <w:spacing w:after="100" w:line="276" w:lineRule="auto"/>
+        <w:ind w:left="1800"/>
+        <w:rPr>
+          <w:sz w:val="30"/>
+          <w:szCs w:val="30"/>
+        </w:rPr>
+      </w:pPr>
+      <w:r>
+        <w:rPr>
+          <w:sz w:val="30"/>
+          <w:szCs w:val="30"/>
+        </w:rPr>
+        <w:t>Người hướng dẫn khoa học (dự kiến):</w:t>
+      </w:r>
+    </w:p>
+    <w:p>
+      <w:pPr>
+        <w:spacing w:line="276" w:lineRule="auto"/>
+        <w:ind w:left="1800"/>
+        <w:rPr>
+          <w:sz w:val="30"/>
+          <w:szCs w:val="30"/>
+        </w:rPr>
+      </w:pPr>
+      <w:r>
+        <w:rPr>
+          <w:sz w:val="30"/>
+          <w:szCs w:val="30"/>
+        </w:rPr>
+        <w:t xml:space="preserve">- </w:t>
+      </w:r>
+      <w:r>
+        <w:rPr>
+          <w:b/>
+          <w:bCs/>
+          <w:sz w:val="30"/>
+          <w:szCs w:val="30"/>
+        </w:rPr>
+        <w:t>PGS.TS. Hà Hồng Hạnh</w:t>
+      </w:r>
+      <w:r>
+        <w:rPr>
+          <w:sz w:val="30"/>
+          <w:szCs w:val="30"/>
+        </w:rPr>
+        <w:t xml:space="preserve"> - Trường Đại học Kinh tế Quốc dân</w:t>
+      </w:r>
+    </w:p>
+    <w:p>
+      <w:pPr>
+        <w:pStyle w:val="BodyText"/>
+        <w:spacing w:line="276" w:lineRule="auto"/>
+        <w:jc w:val="center"/>
+        <w:rPr>
+          <w:b/>
+          <w:bCs/>
+          <w:sz w:val="30"/>
+          <w:szCs w:val="30"/>
+        </w:rPr>
+      </w:pPr>
+    </w:p>
+    <w:p>
+      <w:pPr>
+        <w:pStyle w:val="BodyText"/>
+        <w:spacing w:line="276" w:lineRule="auto"/>
+        <w:jc w:val="center"/>
+        <w:rPr>
+          <w:b/>
+          <w:bCs/>
+          <w:sz w:val="30"/>
+          <w:szCs w:val="30"/>
+        </w:rPr>
+      </w:pPr>
+    </w:p>
+    <w:p>
+      <w:pPr>
+        <w:pStyle w:val="BodyText"/>
+        <w:spacing w:line="276" w:lineRule="auto"/>
+        <w:jc w:val="center"/>
+        <w:rPr>
+          <w:b/>
+          <w:bCs/>
+          <w:sz w:val="30"/>
+          <w:szCs w:val="30"/>
+        </w:rPr>
+      </w:pPr>
+    </w:p>
+    <w:p>
+      <w:pPr>
+        <w:pStyle w:val="BodyText"/>
+        <w:spacing w:line="276" w:lineRule="auto"/>
+        <w:jc w:val="center"/>
+        <w:rPr>
+          <w:b/>
+          <w:bCs/>
+          <w:sz w:val="30"/>
+          <w:szCs w:val="30"/>
+        </w:rPr>
+      </w:pPr>
+    </w:p>
+    <w:p>
+      <w:pPr>
+        <w:pStyle w:val="BodyText"/>
+        <w:spacing w:line="276" w:lineRule="auto"/>
+        <w:jc w:val="center"/>
+        <w:rPr>
+          <w:b/>
+          <w:bCs/>
+          <w:sz w:val="30"/>
+          <w:szCs w:val="30"/>
+        </w:rPr>
+      </w:pPr>
+    </w:p>
+    <w:p>
+      <w:pPr>
+        <w:pStyle w:val="BodyText"/>
+        <w:spacing w:line="276" w:lineRule="auto"/>
+        <w:jc w:val="center"/>
+        <w:rPr>
+          <w:b/>
+          <w:bCs/>
+          <w:sz w:val="30"/>
+          <w:szCs w:val="30"/>
+        </w:rPr>
+      </w:pPr>
+    </w:p>
+    <w:p>
+      <w:pPr>
+        <w:pStyle w:val="BodyText"/>
+        <w:spacing w:line="276" w:lineRule="auto"/>
+        <w:jc w:val="center"/>
+        <w:rPr>
+          <w:b/>
+          <w:bCs/>
+          <w:sz w:val="30"/>
+          <w:szCs w:val="30"/>
+        </w:rPr>
+      </w:pPr>
+    </w:p>
+    <w:p>
+      <w:pPr>
+        <w:pStyle w:val="BodyText"/>
+        <w:spacing w:line="276" w:lineRule="auto"/>
+        <w:jc w:val="center"/>
+        <w:rPr>
+          <w:b/>
+          <w:bCs/>
+          <w:sz w:val="30"/>
+          <w:szCs w:val="30"/>
+        </w:rPr>
+      </w:pPr>
+      <w:r>
+        <w:rPr>
+          <w:b/>
+          <w:bCs/>
+          <w:sz w:val="30"/>
+          <w:szCs w:val="30"/>
         </w:rPr>
         <w:t>HÀ NỘI – 2026</w:t>
       </w:r>
@@ -310,7 +483,7 @@
           <w:footerReference w:type="default" r:id="rId9"/>
           <w:pgSz w:w="11906" w:h="16838"/>
           <w:pgMar w:top="850" w:right="850" w:bottom="850" w:left="1134" w:header="567" w:footer="567" w:gutter="0"/>
-          <w:pgBorders w:offsetFrom="text">
+          <w:pgBorders>
             <w:top w:val="thinThickSmallGap" w:sz="24" w:space="4" w:color="auto"/>
             <w:left w:val="thinThickSmallGap" w:sz="24" w:space="4" w:color="auto"/>
             <w:bottom w:val="thickThinSmallGap" w:sz="24" w:space="4" w:color="auto"/>
@@ -327,7 +500,13 @@
       </w:pPr>
       <w:r>
         <w:lastRenderedPageBreak/>
-        <w:t>1. Tên đề cương nghiên cứu (không quá 30 từ): Hợp nhất sàn chứng khoán và chất lượng thị trường: Bằng chứng thực nghiệm từ HNX và vị thế tài chính Hà Nội</w:t>
+        <w:t xml:space="preserve">1. </w:t>
+      </w:r>
+      <w:r>
+        <w:t>Tên đề cương nghiên cứu</w:t>
+      </w:r>
+      <w:r>
+        <w:t xml:space="preserve"> (không quá 30 từ): Hợp nhất sàn chứng khoán và chất lượng thị trường: Bằng chứng thực nghiệm từ HNX và vị thế tài chính Hà Nội</w:t>
       </w:r>
     </w:p>
     <w:p>
@@ -338,10 +517,6 @@
         <w:t xml:space="preserve">2. </w:t>
       </w:r>
       <w:r>
-        <w:rPr>
-          <w:b/>
-          <w:bCs/>
-        </w:rPr>
         <w:t>Người thực hiện:</w:t>
       </w:r>
       <w:r>
@@ -356,10 +531,6 @@
         <w:t xml:space="preserve">3. </w:t>
       </w:r>
       <w:r>
-        <w:rPr>
-          <w:b/>
-          <w:bCs/>
-        </w:rPr>
         <w:t>Đơn vị công tác:</w:t>
       </w:r>
     </w:p>
@@ -1450,7 +1621,7 @@
             <w:noProof/>
             <w:webHidden/>
           </w:rPr>
-          <w:t>23</w:t>
+          <w:t>22</w:t>
         </w:r>
         <w:r>
           <w:rPr>
@@ -1521,7 +1692,7 @@
             <w:noProof/>
             <w:webHidden/>
           </w:rPr>
-          <w:t>24</w:t>
+          <w:t>23</w:t>
         </w:r>
         <w:r>
           <w:rPr>
@@ -2021,7 +2192,7 @@
             <w:noProof/>
             <w:webHidden/>
           </w:rPr>
-          <w:t>27</w:t>
+          <w:t>26</w:t>
         </w:r>
         <w:r>
           <w:rPr>
@@ -2451,7 +2622,7 @@
             <w:noProof/>
             <w:webHidden/>
           </w:rPr>
-          <w:t>32</w:t>
+          <w:t>31</w:t>
         </w:r>
         <w:r>
           <w:rPr>
@@ -3014,15 +3185,13 @@
     </w:p>
     <w:p>
       <w:pPr>
-        <w:pStyle w:val="TableofFigures"/>
-        <w:rPr>
-          <w:rFonts w:asciiTheme="minorHAnsi" w:eastAsiaTheme="minorEastAsia" w:hAnsiTheme="minorHAnsi" w:cstheme="minorBidi"/>
+        <w:pStyle w:val="TOC4"/>
+        <w:tabs>
+          <w:tab w:val="right" w:leader="dot" w:pos="8778"/>
+        </w:tabs>
+        <w:ind w:left="0"/>
+        <w:rPr>
           <w:noProof/>
-          <w:kern w:val="2"/>
-          <w:sz w:val="24"/>
-          <w:szCs w:val="24"/>
-          <w:lang w:val="en-US"/>
-          <w14:ligatures w14:val="standardContextual"/>
         </w:rPr>
       </w:pPr>
       <w:r>
@@ -3034,7 +3203,7 @@
       <w:r>
         <w:fldChar w:fldCharType="separate"/>
       </w:r>
-      <w:hyperlink w:anchor="_Toc242353163" w:history="1">
+      <w:hyperlink w:anchor="_Toc243171420" w:history="1">
         <w:r>
           <w:rPr>
             <w:rStyle w:val="Hyperlink"/>
@@ -3061,7 +3230,7 @@
             <w:noProof/>
             <w:webHidden/>
           </w:rPr>
-          <w:instrText xml:space="preserve"> PAGEREF _Toc242353163 \h </w:instrText>
+          <w:instrText xml:space="preserve"> PAGEREF _Toc243171420 \h </w:instrText>
         </w:r>
         <w:r>
           <w:rPr>
@@ -3081,7 +3250,7 @@
             <w:noProof/>
             <w:webHidden/>
           </w:rPr>
-          <w:t>7</w:t>
+          <w:t>8</w:t>
         </w:r>
         <w:r>
           <w:rPr>
@@ -3094,18 +3263,16 @@
     </w:p>
     <w:p>
       <w:pPr>
-        <w:pStyle w:val="TableofFigures"/>
-        <w:rPr>
-          <w:rFonts w:asciiTheme="minorHAnsi" w:eastAsiaTheme="minorEastAsia" w:hAnsiTheme="minorHAnsi" w:cstheme="minorBidi"/>
+        <w:pStyle w:val="TOC4"/>
+        <w:tabs>
+          <w:tab w:val="right" w:leader="dot" w:pos="8778"/>
+        </w:tabs>
+        <w:ind w:left="0"/>
+        <w:rPr>
           <w:noProof/>
-          <w:kern w:val="2"/>
-          <w:sz w:val="24"/>
-          <w:szCs w:val="24"/>
-          <w:lang w:val="en-US"/>
-          <w14:ligatures w14:val="standardContextual"/>
-        </w:rPr>
-      </w:pPr>
-      <w:hyperlink w:anchor="_Toc242353164" w:history="1">
+        </w:rPr>
+      </w:pPr>
+      <w:hyperlink w:anchor="_Toc243171421" w:history="1">
         <w:r>
           <w:rPr>
             <w:rStyle w:val="Hyperlink"/>
@@ -3132,7 +3299,7 @@
             <w:noProof/>
             <w:webHidden/>
           </w:rPr>
-          <w:instrText xml:space="preserve"> PAGEREF _Toc242353164 \h </w:instrText>
+          <w:instrText xml:space="preserve"> PAGEREF _Toc243171421 \h </w:instrText>
         </w:r>
         <w:r>
           <w:rPr>
@@ -3152,7 +3319,7 @@
             <w:noProof/>
             <w:webHidden/>
           </w:rPr>
-          <w:t>12</w:t>
+          <w:t>15</w:t>
         </w:r>
         <w:r>
           <w:rPr>
@@ -3165,18 +3332,16 @@
     </w:p>
     <w:p>
       <w:pPr>
-        <w:pStyle w:val="TableofFigures"/>
-        <w:rPr>
-          <w:rFonts w:asciiTheme="minorHAnsi" w:eastAsiaTheme="minorEastAsia" w:hAnsiTheme="minorHAnsi" w:cstheme="minorBidi"/>
+        <w:pStyle w:val="TOC4"/>
+        <w:tabs>
+          <w:tab w:val="right" w:leader="dot" w:pos="8778"/>
+        </w:tabs>
+        <w:ind w:left="0"/>
+        <w:rPr>
           <w:noProof/>
-          <w:kern w:val="2"/>
-          <w:sz w:val="24"/>
-          <w:szCs w:val="24"/>
-          <w:lang w:val="en-US"/>
-          <w14:ligatures w14:val="standardContextual"/>
-        </w:rPr>
-      </w:pPr>
-      <w:hyperlink w:anchor="_Toc242353165" w:history="1">
+        </w:rPr>
+      </w:pPr>
+      <w:hyperlink w:anchor="_Toc243171422" w:history="1">
         <w:r>
           <w:rPr>
             <w:rStyle w:val="Hyperlink"/>
@@ -3203,7 +3368,7 @@
             <w:noProof/>
             <w:webHidden/>
           </w:rPr>
-          <w:instrText xml:space="preserve"> PAGEREF _Toc242353165 \h </w:instrText>
+          <w:instrText xml:space="preserve"> PAGEREF _Toc243171422 \h </w:instrText>
         </w:r>
         <w:r>
           <w:rPr>
@@ -3223,7 +3388,7 @@
             <w:noProof/>
             <w:webHidden/>
           </w:rPr>
-          <w:t>14</w:t>
+          <w:t>21</w:t>
         </w:r>
         <w:r>
           <w:rPr>
@@ -4794,7 +4959,9 @@
     </w:p>
     <w:p>
       <w:pPr>
-        <w:pStyle w:val="FigureBox"/>
+        <w:keepNext/>
+        <w:spacing w:before="120" w:after="60"/>
+        <w:jc w:val="center"/>
       </w:pPr>
       <w:r>
         <w:rPr>
@@ -4803,10 +4970,10 @@
         <mc:AlternateContent>
           <mc:Choice Requires="wpg">
             <w:drawing>
-              <wp:inline distT="0" distB="0" distL="0" distR="0" wp14:anchorId="0AE457BA" wp14:editId="75063A1B">
-                <wp:extent cx="5544000" cy="3024000"/>
+              <wp:inline distT="0" distB="0" distL="0" distR="0" wp14:anchorId="3C7E6BF1" wp14:editId="58FFDE42">
+                <wp:extent cx="4680000" cy="1980000"/>
                 <wp:effectExtent l="0" t="0" r="0" b="0"/>
-                <wp:docPr id="501" name="Hình 1. Khung phân tích"/>
+                <wp:docPr id="701" name="Hình khung phân tích"/>
                 <wp:cNvGraphicFramePr/>
                 <a:graphic xmlns:a="http://schemas.openxmlformats.org/drawingml/2006/main">
                   <a:graphicData uri="http://schemas.microsoft.com/office/word/2010/wordprocessingGroup">
@@ -4815,18 +4982,18 @@
                       <wpg:grpSpPr>
                         <a:xfrm>
                           <a:off x="0" y="0"/>
-                          <a:ext cx="5544000" cy="3024000"/>
+                          <a:ext cx="4680000" cy="1980000"/>
                           <a:chOff x="0" y="0"/>
-                          <a:chExt cx="5544000" cy="3024000"/>
+                          <a:chExt cx="4680000" cy="1980000"/>
                         </a:xfrm>
                       </wpg:grpSpPr>
                       <wps:wsp>
-                        <wps:cNvPr id="1" name="Shape 1"/>
-                        <wps:cNvSpPr/>
+                        <wps:cNvPr id="101" name="Hop 101"/>
+                        <wps:cNvSpPr txBox="1"/>
                         <wps:spPr>
                           <a:xfrm>
                             <a:off x="0" y="0"/>
-                            <a:ext cx="1584000" cy="1188000"/>
+                            <a:ext cx="1440000" cy="792000"/>
                           </a:xfrm>
                           <a:prstGeom prst="rect">
                             <a:avLst/>
@@ -4845,18 +5012,14 @@
                             <w:p>
                               <w:pPr>
                                 <w:jc w:val="center"/>
-                                <w:rPr>
-                                  <w:sz w:val="20"/>
-                                  <w:szCs w:val="20"/>
-                                </w:rPr>
                               </w:pPr>
                               <w:r>
                                 <w:rPr>
                                   <w:b/>
                                   <w:bCs/>
                                   <w:color w:val="000000"/>
-                                  <w:sz w:val="20"/>
-                                  <w:szCs w:val="20"/>
+                                  <w:sz w:val="18"/>
+                                  <w:szCs w:val="18"/>
                                 </w:rPr>
                                 <w:t>Trước hợp nhất</w:t>
                               </w:r>
@@ -4864,41 +5027,20 @@
                             <w:p>
                               <w:pPr>
                                 <w:jc w:val="center"/>
-                                <w:rPr>
-                                  <w:sz w:val="20"/>
-                                  <w:szCs w:val="20"/>
-                                </w:rPr>
                               </w:pPr>
                               <w:r>
                                 <w:rPr>
                                   <w:color w:val="000000"/>
-                                  <w:sz w:val="20"/>
-                                  <w:szCs w:val="20"/>
-                                </w:rPr>
-                                <w:t>Chỉ số chất lượng</w:t>
-                              </w:r>
-                            </w:p>
-                            <w:p>
-                              <w:pPr>
-                                <w:jc w:val="center"/>
-                                <w:rPr>
-                                  <w:sz w:val="20"/>
-                                  <w:szCs w:val="20"/>
-                                </w:rPr>
-                              </w:pPr>
-                              <w:r>
-                                <w:rPr>
-                                  <w:color w:val="000000"/>
-                                  <w:sz w:val="20"/>
-                                  <w:szCs w:val="20"/>
+                                  <w:sz w:val="18"/>
+                                  <w:szCs w:val="18"/>
                                 </w:rPr>
                                 <w:t>HNX so với HOSE (H</w:t>
                               </w:r>
                               <w:r>
                                 <w:rPr>
                                   <w:color w:val="000000"/>
-                                  <w:sz w:val="20"/>
-                                  <w:szCs w:val="20"/>
+                                  <w:sz w:val="18"/>
+                                  <w:szCs w:val="18"/>
                                   <w:vertAlign w:val="subscript"/>
                                 </w:rPr>
                                 <w:t>2</w:t>
@@ -4906,8 +5048,8 @@
                               <w:r>
                                 <w:rPr>
                                   <w:color w:val="000000"/>
-                                  <w:sz w:val="20"/>
-                                  <w:szCs w:val="20"/>
+                                  <w:sz w:val="18"/>
+                                  <w:szCs w:val="18"/>
                                 </w:rPr>
                                 <w:t>)</w:t>
                               </w:r>
@@ -4915,33 +5057,29 @@
                             <w:p>
                               <w:pPr>
                                 <w:jc w:val="center"/>
-                                <w:rPr>
-                                  <w:sz w:val="20"/>
-                                  <w:szCs w:val="20"/>
-                                </w:rPr>
                               </w:pPr>
                               <w:r>
                                 <w:rPr>
                                   <w:color w:val="000000"/>
-                                  <w:sz w:val="20"/>
-                                  <w:szCs w:val="20"/>
+                                  <w:sz w:val="18"/>
+                                  <w:szCs w:val="18"/>
                                 </w:rPr>
-                                <w:t>Giai đoạn 6/2009–6/2025</w:t>
+                                <w:t>6/2009–6/2025</w:t>
                               </w:r>
                             </w:p>
                           </w:txbxContent>
                         </wps:txbx>
-                        <wps:bodyPr rot="0" vert="horz" wrap="square" lIns="54000" tIns="36000" rIns="54000" bIns="36000" anchor="ctr" anchorCtr="0">
+                        <wps:bodyPr rot="0" vert="horz" wrap="square" lIns="36000" tIns="18000" rIns="36000" bIns="18000" anchor="ctr" anchorCtr="0">
                           <a:noAutofit/>
                         </wps:bodyPr>
                       </wps:wsp>
                       <wps:wsp>
-                        <wps:cNvPr id="2" name="Shape 2"/>
-                        <wps:cNvSpPr/>
+                        <wps:cNvPr id="102" name="Hop 102"/>
+                        <wps:cNvSpPr txBox="1"/>
                         <wps:spPr>
                           <a:xfrm>
-                            <a:off x="1980000" y="0"/>
-                            <a:ext cx="1584000" cy="1188000"/>
+                            <a:off x="1620000" y="0"/>
+                            <a:ext cx="1440000" cy="792000"/>
                           </a:xfrm>
                           <a:prstGeom prst="rect">
                             <a:avLst/>
@@ -4960,18 +5098,14 @@
                             <w:p>
                               <w:pPr>
                                 <w:jc w:val="center"/>
-                                <w:rPr>
-                                  <w:sz w:val="20"/>
-                                  <w:szCs w:val="20"/>
-                                </w:rPr>
                               </w:pPr>
                               <w:r>
                                 <w:rPr>
                                   <w:b/>
                                   <w:bCs/>
                                   <w:color w:val="000000"/>
-                                  <w:sz w:val="20"/>
-                                  <w:szCs w:val="20"/>
+                                  <w:sz w:val="18"/>
+                                  <w:szCs w:val="18"/>
                                 </w:rPr>
                                 <w:t>Sự kiện 28/12/2026</w:t>
                               </w:r>
@@ -4979,41 +5113,20 @@
                             <w:p>
                               <w:pPr>
                                 <w:jc w:val="center"/>
-                                <w:rPr>
-                                  <w:sz w:val="20"/>
-                                  <w:szCs w:val="20"/>
-                                </w:rPr>
                               </w:pPr>
                               <w:r>
                                 <w:rPr>
                                   <w:color w:val="000000"/>
-                                  <w:sz w:val="20"/>
-                                  <w:szCs w:val="20"/>
-                                </w:rPr>
-                                <w:t>Chuyển sàn sang HOSE</w:t>
-                              </w:r>
-                            </w:p>
-                            <w:p>
-                              <w:pPr>
-                                <w:jc w:val="center"/>
-                                <w:rPr>
-                                  <w:sz w:val="20"/>
-                                  <w:szCs w:val="20"/>
-                                </w:rPr>
-                              </w:pPr>
-                              <w:r>
-                                <w:rPr>
-                                  <w:color w:val="000000"/>
-                                  <w:sz w:val="20"/>
-                                  <w:szCs w:val="20"/>
+                                  <w:sz w:val="18"/>
+                                  <w:szCs w:val="18"/>
                                 </w:rPr>
                                 <w:t>Thanh khoản (H</w:t>
                               </w:r>
                               <w:r>
                                 <w:rPr>
                                   <w:color w:val="000000"/>
-                                  <w:sz w:val="20"/>
-                                  <w:szCs w:val="20"/>
+                                  <w:sz w:val="18"/>
+                                  <w:szCs w:val="18"/>
                                   <w:vertAlign w:val="subscript"/>
                                 </w:rPr>
                                 <w:t>3</w:t>
@@ -5021,8 +5134,8 @@
                               <w:r>
                                 <w:rPr>
                                   <w:color w:val="000000"/>
-                                  <w:sz w:val="20"/>
-                                  <w:szCs w:val="20"/>
+                                  <w:sz w:val="18"/>
+                                  <w:szCs w:val="18"/>
                                 </w:rPr>
                                 <w:t>)</w:t>
                               </w:r>
@@ -5030,24 +5143,20 @@
                             <w:p>
                               <w:pPr>
                                 <w:jc w:val="center"/>
-                                <w:rPr>
-                                  <w:sz w:val="20"/>
-                                  <w:szCs w:val="20"/>
-                                </w:rPr>
                               </w:pPr>
                               <w:r>
                                 <w:rPr>
                                   <w:color w:val="000000"/>
-                                  <w:sz w:val="20"/>
-                                  <w:szCs w:val="20"/>
+                                  <w:sz w:val="18"/>
+                                  <w:szCs w:val="18"/>
                                 </w:rPr>
                                 <w:t>Khả năng đầu tư (H</w:t>
                               </w:r>
                               <w:r>
                                 <w:rPr>
                                   <w:color w:val="000000"/>
-                                  <w:sz w:val="20"/>
-                                  <w:szCs w:val="20"/>
+                                  <w:sz w:val="18"/>
+                                  <w:szCs w:val="18"/>
                                   <w:vertAlign w:val="subscript"/>
                                 </w:rPr>
                                 <w:t>4</w:t>
@@ -5055,25 +5164,25 @@
                               <w:r>
                                 <w:rPr>
                                   <w:color w:val="000000"/>
-                                  <w:sz w:val="20"/>
-                                  <w:szCs w:val="20"/>
+                                  <w:sz w:val="18"/>
+                                  <w:szCs w:val="18"/>
                                 </w:rPr>
                                 <w:t>)</w:t>
                               </w:r>
                             </w:p>
                           </w:txbxContent>
                         </wps:txbx>
-                        <wps:bodyPr rot="0" vert="horz" wrap="square" lIns="54000" tIns="36000" rIns="54000" bIns="36000" anchor="ctr" anchorCtr="0">
+                        <wps:bodyPr rot="0" vert="horz" wrap="square" lIns="36000" tIns="18000" rIns="36000" bIns="18000" anchor="ctr" anchorCtr="0">
                           <a:noAutofit/>
                         </wps:bodyPr>
                       </wps:wsp>
                       <wps:wsp>
-                        <wps:cNvPr id="3" name="Shape 3"/>
-                        <wps:cNvSpPr/>
+                        <wps:cNvPr id="103" name="Hop 103"/>
+                        <wps:cNvSpPr txBox="1"/>
                         <wps:spPr>
                           <a:xfrm>
-                            <a:off x="3960000" y="0"/>
-                            <a:ext cx="1584000" cy="1188000"/>
+                            <a:off x="3240000" y="0"/>
+                            <a:ext cx="1440000" cy="792000"/>
                           </a:xfrm>
                           <a:prstGeom prst="rect">
                             <a:avLst/>
@@ -5092,18 +5201,14 @@
                             <w:p>
                               <w:pPr>
                                 <w:jc w:val="center"/>
-                                <w:rPr>
-                                  <w:sz w:val="20"/>
-                                  <w:szCs w:val="20"/>
-                                </w:rPr>
                               </w:pPr>
                               <w:r>
                                 <w:rPr>
                                   <w:b/>
                                   <w:bCs/>
                                   <w:color w:val="000000"/>
-                                  <w:sz w:val="20"/>
-                                  <w:szCs w:val="20"/>
+                                  <w:sz w:val="18"/>
+                                  <w:szCs w:val="18"/>
                                 </w:rPr>
                                 <w:t>Hàm ý cho Hà Nội</w:t>
                               </w:r>
@@ -5111,16 +5216,12 @@
                             <w:p>
                               <w:pPr>
                                 <w:jc w:val="center"/>
-                                <w:rPr>
-                                  <w:sz w:val="20"/>
-                                  <w:szCs w:val="20"/>
-                                </w:rPr>
                               </w:pPr>
                               <w:r>
                                 <w:rPr>
                                   <w:color w:val="000000"/>
-                                  <w:sz w:val="20"/>
-                                  <w:szCs w:val="20"/>
+                                  <w:sz w:val="18"/>
+                                  <w:szCs w:val="18"/>
                                 </w:rPr>
                                 <w:t>Chuyên môn hóa thị trường</w:t>
                               </w:r>
@@ -5128,91 +5229,29 @@
                             <w:p>
                               <w:pPr>
                                 <w:jc w:val="center"/>
-                                <w:rPr>
-                                  <w:sz w:val="20"/>
-                                  <w:szCs w:val="20"/>
-                                </w:rPr>
                               </w:pPr>
                               <w:r>
                                 <w:rPr>
                                   <w:color w:val="000000"/>
-                                  <w:sz w:val="20"/>
-                                  <w:szCs w:val="20"/>
-                                </w:rPr>
-                                <w:t>Trái phiếu, phái sinh, UPCoM</w:t>
-                              </w:r>
-                            </w:p>
-                            <w:p>
-                              <w:pPr>
-                                <w:jc w:val="center"/>
-                                <w:rPr>
-                                  <w:sz w:val="20"/>
-                                  <w:szCs w:val="20"/>
-                                </w:rPr>
-                              </w:pPr>
-                              <w:r>
-                                <w:rPr>
-                                  <w:color w:val="000000"/>
-                                  <w:sz w:val="20"/>
-                                  <w:szCs w:val="20"/>
+                                  <w:sz w:val="18"/>
+                                  <w:szCs w:val="18"/>
                                 </w:rPr>
                                 <w:t>Hạ tầng dữ liệu</w:t>
                               </w:r>
                             </w:p>
                           </w:txbxContent>
                         </wps:txbx>
-                        <wps:bodyPr rot="0" vert="horz" wrap="square" lIns="54000" tIns="36000" rIns="54000" bIns="36000" anchor="ctr" anchorCtr="0">
+                        <wps:bodyPr rot="0" vert="horz" wrap="square" lIns="36000" tIns="18000" rIns="36000" bIns="18000" anchor="ctr" anchorCtr="0">
                           <a:noAutofit/>
                         </wps:bodyPr>
                       </wps:wsp>
                       <wps:wsp>
-                        <wps:cNvPr id="4" name="Connector 4"/>
-                        <wps:cNvCnPr/>
+                        <wps:cNvPr id="104" name="Hop 104"/>
+                        <wps:cNvSpPr txBox="1"/>
                         <wps:spPr>
                           <a:xfrm>
-                            <a:off x="1584000" y="594000"/>
-                            <a:ext cx="395999" cy="0"/>
-                          </a:xfrm>
-                          <a:prstGeom prst="straightConnector1">
-                            <a:avLst/>
-                          </a:prstGeom>
-                          <a:ln w="12700">
-                            <a:solidFill>
-                              <a:srgbClr val="000000"/>
-                            </a:solidFill>
-                            <a:tailEnd type="triangle"/>
-                          </a:ln>
-                        </wps:spPr>
-                        <wps:bodyPr/>
-                      </wps:wsp>
-                      <wps:wsp>
-                        <wps:cNvPr id="5" name="Connector 5"/>
-                        <wps:cNvCnPr/>
-                        <wps:spPr>
-                          <a:xfrm>
-                            <a:off x="3564000" y="594000"/>
-                            <a:ext cx="395999" cy="0"/>
-                          </a:xfrm>
-                          <a:prstGeom prst="straightConnector1">
-                            <a:avLst/>
-                          </a:prstGeom>
-                          <a:ln w="12700">
-                            <a:solidFill>
-                              <a:srgbClr val="000000"/>
-                            </a:solidFill>
-                            <a:prstDash val="dash"/>
-                            <a:tailEnd type="triangle"/>
-                          </a:ln>
-                        </wps:spPr>
-                        <wps:bodyPr/>
-                      </wps:wsp>
-                      <wps:wsp>
-                        <wps:cNvPr id="6" name="Shape 6"/>
-                        <wps:cNvSpPr/>
-                        <wps:spPr>
-                          <a:xfrm>
-                            <a:off x="846000" y="1800000"/>
-                            <a:ext cx="1872000" cy="1188000"/>
+                            <a:off x="1620000" y="1188000"/>
+                            <a:ext cx="1440000" cy="792000"/>
                           </a:xfrm>
                           <a:prstGeom prst="rect">
                             <a:avLst/>
@@ -5231,18 +5270,14 @@
                             <w:p>
                               <w:pPr>
                                 <w:jc w:val="center"/>
-                                <w:rPr>
-                                  <w:sz w:val="20"/>
-                                  <w:szCs w:val="20"/>
-                                </w:rPr>
                               </w:pPr>
                               <w:r>
                                 <w:rPr>
                                   <w:b/>
                                   <w:bCs/>
                                   <w:color w:val="000000"/>
-                                  <w:sz w:val="20"/>
-                                  <w:szCs w:val="20"/>
+                                  <w:sz w:val="18"/>
+                                  <w:szCs w:val="18"/>
                                 </w:rPr>
                                 <w:t>Nhóm đối chứng</w:t>
                               </w:r>
@@ -5250,16 +5285,12 @@
                             <w:p>
                               <w:pPr>
                                 <w:jc w:val="center"/>
-                                <w:rPr>
-                                  <w:sz w:val="20"/>
-                                  <w:szCs w:val="20"/>
-                                </w:rPr>
                               </w:pPr>
                               <w:r>
                                 <w:rPr>
                                   <w:color w:val="000000"/>
-                                  <w:sz w:val="20"/>
-                                  <w:szCs w:val="20"/>
+                                  <w:sz w:val="18"/>
+                                  <w:szCs w:val="18"/>
                                 </w:rPr>
                                 <w:t>Cổ phiếu HOSE đối sánh</w:t>
                               </w:r>
@@ -5267,50 +5298,29 @@
                             <w:p>
                               <w:pPr>
                                 <w:jc w:val="center"/>
-                                <w:rPr>
-                                  <w:sz w:val="20"/>
-                                  <w:szCs w:val="20"/>
-                                </w:rPr>
                               </w:pPr>
                               <w:r>
                                 <w:rPr>
                                   <w:color w:val="000000"/>
-                                  <w:sz w:val="20"/>
-                                  <w:szCs w:val="20"/>
+                                  <w:sz w:val="18"/>
+                                  <w:szCs w:val="18"/>
                                 </w:rPr>
                                 <w:t>Cổ phiếu UPCoM</w:t>
                               </w:r>
                             </w:p>
-                            <w:p>
-                              <w:pPr>
-                                <w:jc w:val="center"/>
-                                <w:rPr>
-                                  <w:sz w:val="20"/>
-                                  <w:szCs w:val="20"/>
-                                </w:rPr>
-                              </w:pPr>
-                              <w:r>
-                                <w:rPr>
-                                  <w:color w:val="000000"/>
-                                  <w:sz w:val="20"/>
-                                  <w:szCs w:val="20"/>
-                                </w:rPr>
-                                <w:t>Khác biệt kép</w:t>
-                              </w:r>
-                            </w:p>
                           </w:txbxContent>
                         </wps:txbx>
-                        <wps:bodyPr rot="0" vert="horz" wrap="square" lIns="54000" tIns="36000" rIns="54000" bIns="36000" anchor="ctr" anchorCtr="0">
+                        <wps:bodyPr rot="0" vert="horz" wrap="square" lIns="36000" tIns="18000" rIns="36000" bIns="18000" anchor="ctr" anchorCtr="0">
                           <a:noAutofit/>
                         </wps:bodyPr>
                       </wps:wsp>
                       <wps:wsp>
-                        <wps:cNvPr id="7" name="Shape 7"/>
-                        <wps:cNvSpPr/>
+                        <wps:cNvPr id="105" name="Hop 105"/>
+                        <wps:cNvSpPr txBox="1"/>
                         <wps:spPr>
                           <a:xfrm>
-                            <a:off x="2826000" y="1800000"/>
-                            <a:ext cx="1872000" cy="1188000"/>
+                            <a:off x="3240000" y="1188000"/>
+                            <a:ext cx="1440000" cy="792000"/>
                           </a:xfrm>
                           <a:prstGeom prst="rect">
                             <a:avLst/>
@@ -5329,18 +5339,14 @@
                             <w:p>
                               <w:pPr>
                                 <w:jc w:val="center"/>
-                                <w:rPr>
-                                  <w:sz w:val="20"/>
-                                  <w:szCs w:val="20"/>
-                                </w:rPr>
                               </w:pPr>
                               <w:r>
                                 <w:rPr>
                                   <w:b/>
                                   <w:bCs/>
                                   <w:color w:val="000000"/>
-                                  <w:sz w:val="20"/>
-                                  <w:szCs w:val="20"/>
+                                  <w:sz w:val="18"/>
+                                  <w:szCs w:val="18"/>
                                 </w:rPr>
                                 <w:t>Bằng chứng quốc tế</w:t>
                               </w:r>
@@ -5348,24 +5354,20 @@
                             <w:p>
                               <w:pPr>
                                 <w:jc w:val="center"/>
-                                <w:rPr>
-                                  <w:sz w:val="20"/>
-                                  <w:szCs w:val="20"/>
-                                </w:rPr>
                               </w:pPr>
                               <w:r>
                                 <w:rPr>
                                   <w:color w:val="000000"/>
-                                  <w:sz w:val="20"/>
-                                  <w:szCs w:val="20"/>
+                                  <w:sz w:val="18"/>
+                                  <w:szCs w:val="18"/>
                                 </w:rPr>
                                 <w:t>Điểm GFCI (H</w:t>
                               </w:r>
                               <w:r>
                                 <w:rPr>
                                   <w:color w:val="000000"/>
-                                  <w:sz w:val="20"/>
-                                  <w:szCs w:val="20"/>
+                                  <w:sz w:val="18"/>
+                                  <w:szCs w:val="18"/>
                                   <w:vertAlign w:val="subscript"/>
                                 </w:rPr>
                                 <w:t>1</w:t>
@@ -5373,8 +5375,8 @@
                               <w:r>
                                 <w:rPr>
                                   <w:color w:val="000000"/>
-                                  <w:sz w:val="20"/>
-                                  <w:szCs w:val="20"/>
+                                  <w:sz w:val="18"/>
+                                  <w:szCs w:val="18"/>
                                 </w:rPr>
                                 <w:t>)</w:t>
                               </w:r>
@@ -5382,90 +5384,117 @@
                             <w:p>
                               <w:pPr>
                                 <w:jc w:val="center"/>
-                                <w:rPr>
-                                  <w:sz w:val="20"/>
-                                  <w:szCs w:val="20"/>
-                                </w:rPr>
                               </w:pPr>
                               <w:r>
                                 <w:rPr>
                                   <w:color w:val="000000"/>
-                                  <w:sz w:val="20"/>
-                                  <w:szCs w:val="20"/>
-                                </w:rPr>
-                                <w:t>Phát triển thị trường</w:t>
-                              </w:r>
-                            </w:p>
-                            <w:p>
-                              <w:pPr>
-                                <w:jc w:val="center"/>
-                                <w:rPr>
-                                  <w:sz w:val="20"/>
-                                  <w:szCs w:val="20"/>
-                                </w:rPr>
-                              </w:pPr>
-                              <w:r>
-                                <w:rPr>
-                                  <w:color w:val="000000"/>
-                                  <w:sz w:val="20"/>
-                                  <w:szCs w:val="20"/>
+                                  <w:sz w:val="18"/>
+                                  <w:szCs w:val="18"/>
                                 </w:rPr>
                                 <w:t>Thể chế, thu nhập</w:t>
                               </w:r>
                             </w:p>
                           </w:txbxContent>
                         </wps:txbx>
-                        <wps:bodyPr rot="0" vert="horz" wrap="square" lIns="54000" tIns="36000" rIns="54000" bIns="36000" anchor="ctr" anchorCtr="0">
+                        <wps:bodyPr rot="0" vert="horz" wrap="square" lIns="36000" tIns="18000" rIns="36000" bIns="18000" anchor="ctr" anchorCtr="0">
                           <a:noAutofit/>
                         </wps:bodyPr>
                       </wps:wsp>
                       <wps:wsp>
-                        <wps:cNvPr id="8" name="Connector 8"/>
+                        <wps:cNvPr id="106" name="Mui ten 106"/>
                         <wps:cNvCnPr/>
                         <wps:spPr>
-                          <a:xfrm flipV="1">
-                            <a:off x="1782000" y="594000"/>
-                            <a:ext cx="0" cy="1206000"/>
+                          <a:xfrm>
+                            <a:off x="1440000" y="396000"/>
+                            <a:ext cx="180000" cy="0"/>
                           </a:xfrm>
                           <a:prstGeom prst="straightConnector1">
                             <a:avLst/>
                           </a:prstGeom>
+                          <a:noFill/>
                           <a:ln w="12700">
                             <a:solidFill>
                               <a:srgbClr val="000000"/>
                             </a:solidFill>
-                            <a:tailEnd type="triangle"/>
+                            <a:prstDash val="solid"/>
+                            <a:tailEnd type="triangle" w="med" len="med"/>
                           </a:ln>
                         </wps:spPr>
                         <wps:bodyPr/>
                       </wps:wsp>
                       <wps:wsp>
-                        <wps:cNvPr id="9" name="Connector 9"/>
+                        <wps:cNvPr id="107" name="Mui ten 107"/>
                         <wps:cNvCnPr/>
                         <wps:spPr>
-                          <a:xfrm flipV="1">
-                            <a:off x="3761999" y="594000"/>
-                            <a:ext cx="0" cy="1206000"/>
+                          <a:xfrm>
+                            <a:off x="3060000" y="396000"/>
+                            <a:ext cx="180000" cy="0"/>
                           </a:xfrm>
                           <a:prstGeom prst="straightConnector1">
                             <a:avLst/>
                           </a:prstGeom>
+                          <a:noFill/>
                           <a:ln w="12700">
                             <a:solidFill>
                               <a:srgbClr val="000000"/>
                             </a:solidFill>
-                            <a:tailEnd type="triangle"/>
+                            <a:prstDash val="dash"/>
+                            <a:tailEnd type="triangle" w="med" len="med"/>
                           </a:ln>
                         </wps:spPr>
                         <wps:bodyPr/>
                       </wps:wsp>
                       <wps:wsp>
-                        <wps:cNvPr id="10" name="Shape 10"/>
-                        <wps:cNvSpPr/>
+                        <wps:cNvPr id="108" name="Mui ten 108"/>
+                        <wps:cNvCnPr/>
+                        <wps:spPr>
+                          <a:xfrm flipV="1">
+                            <a:off x="2340000" y="792000"/>
+                            <a:ext cx="0" cy="396000"/>
+                          </a:xfrm>
+                          <a:prstGeom prst="straightConnector1">
+                            <a:avLst/>
+                          </a:prstGeom>
+                          <a:noFill/>
+                          <a:ln w="12700">
+                            <a:solidFill>
+                              <a:srgbClr val="000000"/>
+                            </a:solidFill>
+                            <a:prstDash val="solid"/>
+                            <a:tailEnd type="triangle" w="med" len="med"/>
+                          </a:ln>
+                        </wps:spPr>
+                        <wps:bodyPr/>
+                      </wps:wsp>
+                      <wps:wsp>
+                        <wps:cNvPr id="109" name="Mui ten 109"/>
+                        <wps:cNvCnPr/>
+                        <wps:spPr>
+                          <a:xfrm flipV="1">
+                            <a:off x="3960000" y="792000"/>
+                            <a:ext cx="0" cy="396000"/>
+                          </a:xfrm>
+                          <a:prstGeom prst="straightConnector1">
+                            <a:avLst/>
+                          </a:prstGeom>
+                          <a:noFill/>
+                          <a:ln w="12700">
+                            <a:solidFill>
+                              <a:srgbClr val="000000"/>
+                            </a:solidFill>
+                            <a:prstDash val="dash"/>
+                            <a:tailEnd type="triangle" w="med" len="med"/>
+                          </a:ln>
+                        </wps:spPr>
+                        <wps:bodyPr/>
+                      </wps:wsp>
+                      <wps:wsp>
+                        <wps:cNvPr id="110" name="Hop 110"/>
+                        <wps:cNvSpPr txBox="1"/>
                         <wps:spPr>
                           <a:xfrm>
-                            <a:off x="1566000" y="288000"/>
-                            <a:ext cx="432000" cy="216000"/>
+                            <a:off x="2376000" y="828000"/>
+                            <a:ext cx="720000" cy="324000"/>
                           </a:xfrm>
                           <a:prstGeom prst="rect">
                             <a:avLst/>
@@ -5480,25 +5509,29 @@
                             <w:p>
                               <w:pPr>
                                 <w:jc w:val="center"/>
+                              </w:pPr>
+                              <w:r>
                                 <w:rPr>
-                                  <w:sz w:val="20"/>
-                                  <w:szCs w:val="20"/>
+                                  <w:color w:val="000000"/>
+                                  <w:sz w:val="16"/>
+                                  <w:szCs w:val="16"/>
                                 </w:rPr>
-                              </w:pPr>
+                                <w:t>khác biệt kép</w:t>
+                              </w:r>
                             </w:p>
                           </w:txbxContent>
                         </wps:txbx>
-                        <wps:bodyPr rot="0" vert="horz" wrap="square" lIns="54000" tIns="36000" rIns="54000" bIns="36000" anchor="ctr" anchorCtr="0">
+                        <wps:bodyPr rot="0" vert="horz" wrap="square" lIns="36000" tIns="18000" rIns="36000" bIns="18000" anchor="ctr" anchorCtr="0">
                           <a:noAutofit/>
                         </wps:bodyPr>
                       </wps:wsp>
                       <wps:wsp>
-                        <wps:cNvPr id="11" name="Shape 11"/>
-                        <wps:cNvSpPr/>
+                        <wps:cNvPr id="111" name="Hop 111"/>
+                        <wps:cNvSpPr txBox="1"/>
                         <wps:spPr>
                           <a:xfrm>
-                            <a:off x="1800000" y="1332000"/>
-                            <a:ext cx="684000" cy="216000"/>
+                            <a:off x="3996000" y="828000"/>
+                            <a:ext cx="720000" cy="324000"/>
                           </a:xfrm>
                           <a:prstGeom prst="rect">
                             <a:avLst/>
@@ -5513,55 +5546,19 @@
                             <w:p>
                               <w:pPr>
                                 <w:jc w:val="center"/>
-                                <w:rPr>
-                                  <w:sz w:val="20"/>
-                                  <w:szCs w:val="20"/>
-                                </w:rPr>
                               </w:pPr>
                               <w:r>
                                 <w:rPr>
-                                  <w:sz w:val="20"/>
-                                  <w:szCs w:val="20"/>
+                                  <w:color w:val="000000"/>
+                                  <w:sz w:val="16"/>
+                                  <w:szCs w:val="16"/>
                                 </w:rPr>
-                                <w:t>đối chứng</w:t>
+                                <w:t>bối cảnh</w:t>
                               </w:r>
                             </w:p>
                           </w:txbxContent>
                         </wps:txbx>
-                        <wps:bodyPr rot="0" vert="horz" wrap="square" lIns="54000" tIns="36000" rIns="54000" bIns="36000" anchor="ctr" anchorCtr="0">
-                          <a:noAutofit/>
-                        </wps:bodyPr>
-                      </wps:wsp>
-                      <wps:wsp>
-                        <wps:cNvPr id="12" name="Shape 12"/>
-                        <wps:cNvSpPr/>
-                        <wps:spPr>
-                          <a:xfrm>
-                            <a:off x="3780000" y="1332000"/>
-                            <a:ext cx="432000" cy="216000"/>
-                          </a:xfrm>
-                          <a:prstGeom prst="rect">
-                            <a:avLst/>
-                          </a:prstGeom>
-                          <a:noFill/>
-                          <a:ln>
-                            <a:noFill/>
-                          </a:ln>
-                        </wps:spPr>
-                        <wps:txbx>
-                          <w:txbxContent>
-                            <w:p>
-                              <w:pPr>
-                                <w:jc w:val="center"/>
-                                <w:rPr>
-                                  <w:sz w:val="20"/>
-                                  <w:szCs w:val="20"/>
-                                </w:rPr>
-                              </w:pPr>
-                            </w:p>
-                          </w:txbxContent>
-                        </wps:txbx>
-                        <wps:bodyPr rot="0" vert="horz" wrap="square" lIns="54000" tIns="36000" rIns="54000" bIns="36000" anchor="ctr" anchorCtr="0">
+                        <wps:bodyPr rot="0" vert="horz" wrap="square" lIns="36000" tIns="18000" rIns="36000" bIns="18000" anchor="ctr" anchorCtr="0">
                           <a:noAutofit/>
                         </wps:bodyPr>
                       </wps:wsp>
@@ -5573,25 +5570,25 @@
           </mc:Choice>
           <mc:Fallback>
             <w:pict>
-              <v:group w14:anchorId="0AE457BA" id="Hình 1. Khung phân tích" o:spid="_x0000_s1026" style="width:436.55pt;height:238.1pt;mso-position-horizontal-relative:char;mso-position-vertical-relative:line" coordsize="55440,30240" o:gfxdata="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">
-                <v:rect id="Shape 1" o:spid="_x0000_s1027" style="position:absolute;width:15840;height:11880;visibility:visible;mso-wrap-style:square;v-text-anchor:middle" o:gfxdata="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">
-                  <v:textbox inset="1.5mm,1mm,1.5mm,1mm">
+              <v:group w14:anchorId="3C7E6BF1" id="Hình khung phân tích" o:spid="_x0000_s1026" style="width:368.5pt;height:155.9pt;mso-position-horizontal-relative:char;mso-position-vertical-relative:line" coordsize="46800,19800" o:gfxdata="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">
+                <v:shapetype id="_x0000_t202" coordsize="21600,21600" o:spt="202" path="m,l,21600r21600,l21600,xe">
+                  <v:stroke joinstyle="miter"/>
+                  <v:path gradientshapeok="t" o:connecttype="rect"/>
+                </v:shapetype>
+                <v:shape id="Hop 101" o:spid="_x0000_s1027" type="#_x0000_t202" style="position:absolute;width:14400;height:7920;visibility:visible;mso-wrap-style:square;v-text-anchor:middle" o:gfxdata="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">
+                  <v:textbox inset="1mm,.5mm,1mm,.5mm">
                     <w:txbxContent>
                       <w:p>
                         <w:pPr>
                           <w:jc w:val="center"/>
-                          <w:rPr>
-                            <w:sz w:val="20"/>
-                            <w:szCs w:val="20"/>
-                          </w:rPr>
                         </w:pPr>
                         <w:r>
                           <w:rPr>
                             <w:b/>
                             <w:bCs/>
                             <w:color w:val="000000"/>
-                            <w:sz w:val="20"/>
-                            <w:szCs w:val="20"/>
+                            <w:sz w:val="18"/>
+                            <w:szCs w:val="18"/>
                           </w:rPr>
                           <w:t>Trước hợp nhất</w:t>
                         </w:r>
@@ -5599,41 +5596,20 @@
                       <w:p>
                         <w:pPr>
                           <w:jc w:val="center"/>
-                          <w:rPr>
-                            <w:sz w:val="20"/>
-                            <w:szCs w:val="20"/>
-                          </w:rPr>
                         </w:pPr>
                         <w:r>
                           <w:rPr>
                             <w:color w:val="000000"/>
-                            <w:sz w:val="20"/>
-                            <w:szCs w:val="20"/>
-                          </w:rPr>
-                          <w:t>Chỉ số chất lượng</w:t>
-                        </w:r>
-                      </w:p>
-                      <w:p>
-                        <w:pPr>
-                          <w:jc w:val="center"/>
-                          <w:rPr>
-                            <w:sz w:val="20"/>
-                            <w:szCs w:val="20"/>
-                          </w:rPr>
-                        </w:pPr>
-                        <w:r>
-                          <w:rPr>
-                            <w:color w:val="000000"/>
-                            <w:sz w:val="20"/>
-                            <w:szCs w:val="20"/>
+                            <w:sz w:val="18"/>
+                            <w:szCs w:val="18"/>
                           </w:rPr>
                           <w:t>HNX so với HOSE (H</w:t>
                         </w:r>
                         <w:r>
                           <w:rPr>
                             <w:color w:val="000000"/>
-                            <w:sz w:val="20"/>
-                            <w:szCs w:val="20"/>
+                            <w:sz w:val="18"/>
+                            <w:szCs w:val="18"/>
                             <w:vertAlign w:val="subscript"/>
                           </w:rPr>
                           <w:t>2</w:t>
@@ -5641,8 +5617,8 @@
                         <w:r>
                           <w:rPr>
                             <w:color w:val="000000"/>
-                            <w:sz w:val="20"/>
-                            <w:szCs w:val="20"/>
+                            <w:sz w:val="18"/>
+                            <w:szCs w:val="18"/>
                           </w:rPr>
                           <w:t>)</w:t>
                         </w:r>
@@ -5650,41 +5626,33 @@
                       <w:p>
                         <w:pPr>
                           <w:jc w:val="center"/>
-                          <w:rPr>
-                            <w:sz w:val="20"/>
-                            <w:szCs w:val="20"/>
-                          </w:rPr>
                         </w:pPr>
                         <w:r>
                           <w:rPr>
                             <w:color w:val="000000"/>
-                            <w:sz w:val="20"/>
-                            <w:szCs w:val="20"/>
+                            <w:sz w:val="18"/>
+                            <w:szCs w:val="18"/>
                           </w:rPr>
-                          <w:t>Giai đoạn 6/2009–6/2025</w:t>
+                          <w:t>6/2009–6/2025</w:t>
                         </w:r>
                       </w:p>
                     </w:txbxContent>
                   </v:textbox>
-                </v:rect>
-                <v:rect id="Shape 2" o:spid="_x0000_s1028" style="position:absolute;left:19800;width:15840;height:11880;visibility:visible;mso-wrap-style:square;v-text-anchor:middle" o:gfxdata="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">
-                  <v:textbox inset="1.5mm,1mm,1.5mm,1mm">
+                </v:shape>
+                <v:shape id="Hop 102" o:spid="_x0000_s1028" type="#_x0000_t202" style="position:absolute;left:16200;width:14400;height:7920;visibility:visible;mso-wrap-style:square;v-text-anchor:middle" o:gfxdata="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">
+                  <v:textbox inset="1mm,.5mm,1mm,.5mm">
                     <w:txbxContent>
                       <w:p>
                         <w:pPr>
                           <w:jc w:val="center"/>
-                          <w:rPr>
-                            <w:sz w:val="20"/>
-                            <w:szCs w:val="20"/>
-                          </w:rPr>
                         </w:pPr>
                         <w:r>
                           <w:rPr>
                             <w:b/>
                             <w:bCs/>
                             <w:color w:val="000000"/>
-                            <w:sz w:val="20"/>
-                            <w:szCs w:val="20"/>
+                            <w:sz w:val="18"/>
+                            <w:szCs w:val="18"/>
                           </w:rPr>
                           <w:t>Sự kiện 28/12/2026</w:t>
                         </w:r>
@@ -5692,41 +5660,20 @@
                       <w:p>
                         <w:pPr>
                           <w:jc w:val="center"/>
-                          <w:rPr>
-                            <w:sz w:val="20"/>
-                            <w:szCs w:val="20"/>
-                          </w:rPr>
                         </w:pPr>
                         <w:r>
                           <w:rPr>
                             <w:color w:val="000000"/>
-                            <w:sz w:val="20"/>
-                            <w:szCs w:val="20"/>
-                          </w:rPr>
-                          <w:t>Chuyển sàn sang HOSE</w:t>
-                        </w:r>
-                      </w:p>
-                      <w:p>
-                        <w:pPr>
-                          <w:jc w:val="center"/>
-                          <w:rPr>
-                            <w:sz w:val="20"/>
-                            <w:szCs w:val="20"/>
-                          </w:rPr>
-                        </w:pPr>
-                        <w:r>
-                          <w:rPr>
-                            <w:color w:val="000000"/>
-                            <w:sz w:val="20"/>
-                            <w:szCs w:val="20"/>
+                            <w:sz w:val="18"/>
+                            <w:szCs w:val="18"/>
                           </w:rPr>
                           <w:t>Thanh khoản (H</w:t>
                         </w:r>
                         <w:r>
                           <w:rPr>
                             <w:color w:val="000000"/>
-                            <w:sz w:val="20"/>
-                            <w:szCs w:val="20"/>
+                            <w:sz w:val="18"/>
+                            <w:szCs w:val="18"/>
                             <w:vertAlign w:val="subscript"/>
                           </w:rPr>
                           <w:t>3</w:t>
@@ -5734,8 +5681,8 @@
                         <w:r>
                           <w:rPr>
                             <w:color w:val="000000"/>
-                            <w:sz w:val="20"/>
-                            <w:szCs w:val="20"/>
+                            <w:sz w:val="18"/>
+                            <w:szCs w:val="18"/>
                           </w:rPr>
                           <w:t>)</w:t>
                         </w:r>
@@ -5743,24 +5690,20 @@
                       <w:p>
                         <w:pPr>
                           <w:jc w:val="center"/>
-                          <w:rPr>
-                            <w:sz w:val="20"/>
-                            <w:szCs w:val="20"/>
-                          </w:rPr>
                         </w:pPr>
                         <w:r>
                           <w:rPr>
                             <w:color w:val="000000"/>
-                            <w:sz w:val="20"/>
-                            <w:szCs w:val="20"/>
+                            <w:sz w:val="18"/>
+                            <w:szCs w:val="18"/>
                           </w:rPr>
                           <w:t>Khả năng đầu tư (H</w:t>
                         </w:r>
                         <w:r>
                           <w:rPr>
                             <w:color w:val="000000"/>
-                            <w:sz w:val="20"/>
-                            <w:szCs w:val="20"/>
+                            <w:sz w:val="18"/>
+                            <w:szCs w:val="18"/>
                             <w:vertAlign w:val="subscript"/>
                           </w:rPr>
                           <w:t>4</w:t>
@@ -5768,33 +5711,29 @@
                         <w:r>
                           <w:rPr>
                             <w:color w:val="000000"/>
-                            <w:sz w:val="20"/>
-                            <w:szCs w:val="20"/>
+                            <w:sz w:val="18"/>
+                            <w:szCs w:val="18"/>
                           </w:rPr>
                           <w:t>)</w:t>
                         </w:r>
                       </w:p>
                     </w:txbxContent>
                   </v:textbox>
-                </v:rect>
-                <v:rect id="Shape 3" o:spid="_x0000_s1029" style="position:absolute;left:39600;width:15840;height:11880;visibility:visible;mso-wrap-style:square;v-text-anchor:middle" o:gfxdata="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">
-                  <v:textbox inset="1.5mm,1mm,1.5mm,1mm">
+                </v:shape>
+                <v:shape id="Hop 103" o:spid="_x0000_s1029" type="#_x0000_t202" style="position:absolute;left:32400;width:14400;height:7920;visibility:visible;mso-wrap-style:square;v-text-anchor:middle" o:gfxdata="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">
+                  <v:textbox inset="1mm,.5mm,1mm,.5mm">
                     <w:txbxContent>
                       <w:p>
                         <w:pPr>
                           <w:jc w:val="center"/>
-                          <w:rPr>
-                            <w:sz w:val="20"/>
-                            <w:szCs w:val="20"/>
-                          </w:rPr>
                         </w:pPr>
                         <w:r>
                           <w:rPr>
                             <w:b/>
                             <w:bCs/>
                             <w:color w:val="000000"/>
-                            <w:sz w:val="20"/>
-                            <w:szCs w:val="20"/>
+                            <w:sz w:val="18"/>
+                            <w:szCs w:val="18"/>
                           </w:rPr>
                           <w:t>Hàm ý cho Hà Nội</w:t>
                         </w:r>
@@ -5802,16 +5741,12 @@
                       <w:p>
                         <w:pPr>
                           <w:jc w:val="center"/>
-                          <w:rPr>
-                            <w:sz w:val="20"/>
-                            <w:szCs w:val="20"/>
-                          </w:rPr>
                         </w:pPr>
                         <w:r>
                           <w:rPr>
                             <w:color w:val="000000"/>
-                            <w:sz w:val="20"/>
-                            <w:szCs w:val="20"/>
+                            <w:sz w:val="18"/>
+                            <w:szCs w:val="18"/>
                           </w:rPr>
                           <w:t>Chuyên môn hóa thị trường</w:t>
                         </w:r>
@@ -5819,68 +5754,33 @@
                       <w:p>
                         <w:pPr>
                           <w:jc w:val="center"/>
-                          <w:rPr>
-                            <w:sz w:val="20"/>
-                            <w:szCs w:val="20"/>
-                          </w:rPr>
                         </w:pPr>
                         <w:r>
                           <w:rPr>
                             <w:color w:val="000000"/>
-                            <w:sz w:val="20"/>
-                            <w:szCs w:val="20"/>
-                          </w:rPr>
-                          <w:t>Trái phiếu, phái sinh, UPCoM</w:t>
-                        </w:r>
-                      </w:p>
-                      <w:p>
-                        <w:pPr>
-                          <w:jc w:val="center"/>
-                          <w:rPr>
-                            <w:sz w:val="20"/>
-                            <w:szCs w:val="20"/>
-                          </w:rPr>
-                        </w:pPr>
-                        <w:r>
-                          <w:rPr>
-                            <w:color w:val="000000"/>
-                            <w:sz w:val="20"/>
-                            <w:szCs w:val="20"/>
+                            <w:sz w:val="18"/>
+                            <w:szCs w:val="18"/>
                           </w:rPr>
                           <w:t>Hạ tầng dữ liệu</w:t>
                         </w:r>
                       </w:p>
                     </w:txbxContent>
                   </v:textbox>
-                </v:rect>
-                <v:shapetype id="_x0000_t32" coordsize="21600,21600" o:spt="32" o:oned="t" path="m,l21600,21600e" filled="f">
-                  <v:path arrowok="t" fillok="f" o:connecttype="none"/>
-                  <o:lock v:ext="edit" shapetype="t"/>
-                </v:shapetype>
-                <v:shape id="Connector 4" o:spid="_x0000_s1030" type="#_x0000_t32" style="position:absolute;left:15840;top:5940;width:3959;height:0;visibility:visible;mso-wrap-style:square" o:connectortype="straight" o:gfxdata="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" strokeweight="1pt">
-                  <v:stroke endarrow="block"/>
                 </v:shape>
-                <v:shape id="Connector 5" o:spid="_x0000_s1031" type="#_x0000_t32" style="position:absolute;left:35640;top:5940;width:3959;height:0;visibility:visible;mso-wrap-style:square" o:connectortype="straight" o:gfxdata="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" strokeweight="1pt">
-                  <v:stroke dashstyle="dash" endarrow="block"/>
-                </v:shape>
-                <v:rect id="Shape 6" o:spid="_x0000_s1032" style="position:absolute;left:8460;top:18000;width:18720;height:11880;visibility:visible;mso-wrap-style:square;v-text-anchor:middle" o:gfxdata="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">
-                  <v:textbox inset="1.5mm,1mm,1.5mm,1mm">
+                <v:shape id="Hop 104" o:spid="_x0000_s1030" type="#_x0000_t202" style="position:absolute;left:16200;top:11880;width:14400;height:7920;visibility:visible;mso-wrap-style:square;v-text-anchor:middle" o:gfxdata="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">
+                  <v:textbox inset="1mm,.5mm,1mm,.5mm">
                     <w:txbxContent>
                       <w:p>
                         <w:pPr>
                           <w:jc w:val="center"/>
-                          <w:rPr>
-                            <w:sz w:val="20"/>
-                            <w:szCs w:val="20"/>
-                          </w:rPr>
                         </w:pPr>
                         <w:r>
                           <w:rPr>
                             <w:b/>
                             <w:bCs/>
                             <w:color w:val="000000"/>
-                            <w:sz w:val="20"/>
-                            <w:szCs w:val="20"/>
+                            <w:sz w:val="18"/>
+                            <w:szCs w:val="18"/>
                           </w:rPr>
                           <w:t>Nhóm đối chứng</w:t>
                         </w:r>
@@ -5888,16 +5788,12 @@
                       <w:p>
                         <w:pPr>
                           <w:jc w:val="center"/>
-                          <w:rPr>
-                            <w:sz w:val="20"/>
-                            <w:szCs w:val="20"/>
-                          </w:rPr>
                         </w:pPr>
                         <w:r>
                           <w:rPr>
                             <w:color w:val="000000"/>
-                            <w:sz w:val="20"/>
-                            <w:szCs w:val="20"/>
+                            <w:sz w:val="18"/>
+                            <w:szCs w:val="18"/>
                           </w:rPr>
                           <w:t>Cổ phiếu HOSE đối sánh</w:t>
                         </w:r>
@@ -5905,58 +5801,33 @@
                       <w:p>
                         <w:pPr>
                           <w:jc w:val="center"/>
-                          <w:rPr>
-                            <w:sz w:val="20"/>
-                            <w:szCs w:val="20"/>
-                          </w:rPr>
                         </w:pPr>
                         <w:r>
                           <w:rPr>
                             <w:color w:val="000000"/>
-                            <w:sz w:val="20"/>
-                            <w:szCs w:val="20"/>
+                            <w:sz w:val="18"/>
+                            <w:szCs w:val="18"/>
                           </w:rPr>
                           <w:t>Cổ phiếu UPCoM</w:t>
                         </w:r>
                       </w:p>
-                      <w:p>
-                        <w:pPr>
-                          <w:jc w:val="center"/>
-                          <w:rPr>
-                            <w:sz w:val="20"/>
-                            <w:szCs w:val="20"/>
-                          </w:rPr>
-                        </w:pPr>
-                        <w:r>
-                          <w:rPr>
-                            <w:color w:val="000000"/>
-                            <w:sz w:val="20"/>
-                            <w:szCs w:val="20"/>
-                          </w:rPr>
-                          <w:t>Khác biệt kép</w:t>
-                        </w:r>
-                      </w:p>
                     </w:txbxContent>
                   </v:textbox>
-                </v:rect>
-                <v:rect id="Shape 7" o:spid="_x0000_s1033" style="position:absolute;left:28260;top:18000;width:18720;height:11880;visibility:visible;mso-wrap-style:square;v-text-anchor:middle" o:gfxdata="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">
-                  <v:textbox inset="1.5mm,1mm,1.5mm,1mm">
+                </v:shape>
+                <v:shape id="Hop 105" o:spid="_x0000_s1031" type="#_x0000_t202" style="position:absolute;left:32400;top:11880;width:14400;height:7920;visibility:visible;mso-wrap-style:square;v-text-anchor:middle" o:gfxdata="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">
+                  <v:textbox inset="1mm,.5mm,1mm,.5mm">
                     <w:txbxContent>
                       <w:p>
                         <w:pPr>
                           <w:jc w:val="center"/>
-                          <w:rPr>
-                            <w:sz w:val="20"/>
-                            <w:szCs w:val="20"/>
-                          </w:rPr>
                         </w:pPr>
                         <w:r>
                           <w:rPr>
                             <w:b/>
                             <w:bCs/>
                             <w:color w:val="000000"/>
-                            <w:sz w:val="20"/>
-                            <w:szCs w:val="20"/>
+                            <w:sz w:val="18"/>
+                            <w:szCs w:val="18"/>
                           </w:rPr>
                           <w:t>Bằng chứng quốc tế</w:t>
                         </w:r>
@@ -5964,24 +5835,20 @@
                       <w:p>
                         <w:pPr>
                           <w:jc w:val="center"/>
-                          <w:rPr>
-                            <w:sz w:val="20"/>
-                            <w:szCs w:val="20"/>
-                          </w:rPr>
                         </w:pPr>
                         <w:r>
                           <w:rPr>
                             <w:color w:val="000000"/>
-                            <w:sz w:val="20"/>
-                            <w:szCs w:val="20"/>
+                            <w:sz w:val="18"/>
+                            <w:szCs w:val="18"/>
                           </w:rPr>
                           <w:t>Điểm GFCI (H</w:t>
                         </w:r>
                         <w:r>
                           <w:rPr>
                             <w:color w:val="000000"/>
-                            <w:sz w:val="20"/>
-                            <w:szCs w:val="20"/>
+                            <w:sz w:val="18"/>
+                            <w:szCs w:val="18"/>
                             <w:vertAlign w:val="subscript"/>
                           </w:rPr>
                           <w:t>1</w:t>
@@ -5989,8 +5856,8 @@
                         <w:r>
                           <w:rPr>
                             <w:color w:val="000000"/>
-                            <w:sz w:val="20"/>
-                            <w:szCs w:val="20"/>
+                            <w:sz w:val="18"/>
+                            <w:szCs w:val="18"/>
                           </w:rPr>
                           <w:t>)</w:t>
                         </w:r>
@@ -5998,98 +5865,73 @@
                       <w:p>
                         <w:pPr>
                           <w:jc w:val="center"/>
-                          <w:rPr>
-                            <w:sz w:val="20"/>
-                            <w:szCs w:val="20"/>
-                          </w:rPr>
                         </w:pPr>
                         <w:r>
                           <w:rPr>
                             <w:color w:val="000000"/>
-                            <w:sz w:val="20"/>
-                            <w:szCs w:val="20"/>
-                          </w:rPr>
-                          <w:t>Phát triển thị trường</w:t>
-                        </w:r>
-                      </w:p>
-                      <w:p>
-                        <w:pPr>
-                          <w:jc w:val="center"/>
-                          <w:rPr>
-                            <w:sz w:val="20"/>
-                            <w:szCs w:val="20"/>
-                          </w:rPr>
-                        </w:pPr>
-                        <w:r>
-                          <w:rPr>
-                            <w:color w:val="000000"/>
-                            <w:sz w:val="20"/>
-                            <w:szCs w:val="20"/>
+                            <w:sz w:val="18"/>
+                            <w:szCs w:val="18"/>
                           </w:rPr>
                           <w:t>Thể chế, thu nhập</w:t>
                         </w:r>
                       </w:p>
                     </w:txbxContent>
                   </v:textbox>
-                </v:rect>
-                <v:shape id="Connector 8" o:spid="_x0000_s1034" type="#_x0000_t32" style="position:absolute;left:17820;top:5940;width:0;height:12060;flip:y;visibility:visible;mso-wrap-style:square" o:connectortype="straight" o:gfxdata="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" strokeweight="1pt">
+                </v:shape>
+                <v:shapetype id="_x0000_t32" coordsize="21600,21600" o:spt="32" o:oned="t" path="m,l21600,21600e" filled="f">
+                  <v:path arrowok="t" fillok="f" o:connecttype="none"/>
+                  <o:lock v:ext="edit" shapetype="t"/>
+                </v:shapetype>
+                <v:shape id="Mui ten 106" o:spid="_x0000_s1032" type="#_x0000_t32" style="position:absolute;left:14400;top:3960;width:1800;height:0;visibility:visible;mso-wrap-style:square" o:connectortype="straight" o:gfxdata="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" strokeweight="1pt">
                   <v:stroke endarrow="block"/>
                 </v:shape>
-                <v:shape id="Connector 9" o:spid="_x0000_s1035" type="#_x0000_t32" style="position:absolute;left:37619;top:5940;width:0;height:12060;flip:y;visibility:visible;mso-wrap-style:square" o:connectortype="straight" o:gfxdata="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" strokeweight="1pt">
+                <v:shape id="Mui ten 107" o:spid="_x0000_s1033" type="#_x0000_t32" style="position:absolute;left:30600;top:3960;width:1800;height:0;visibility:visible;mso-wrap-style:square" o:connectortype="straight" o:gfxdata="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" strokeweight="1pt">
+                  <v:stroke dashstyle="dash" endarrow="block"/>
+                </v:shape>
+                <v:shape id="Mui ten 108" o:spid="_x0000_s1034" type="#_x0000_t32" style="position:absolute;left:23400;top:7920;width:0;height:3960;flip:y;visibility:visible;mso-wrap-style:square" o:connectortype="straight" o:gfxdata="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" strokeweight="1pt">
                   <v:stroke endarrow="block"/>
                 </v:shape>
-                <v:rect id="Shape 10" o:spid="_x0000_s1036" style="position:absolute;left:15660;top:2880;width:4320;height:2160;visibility:visible;mso-wrap-style:square;v-text-anchor:middle" o:gfxdata="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" filled="f" stroked="f">
-                  <v:textbox inset="1.5mm,1mm,1.5mm,1mm">
+                <v:shape id="Mui ten 109" o:spid="_x0000_s1035" type="#_x0000_t32" style="position:absolute;left:39600;top:7920;width:0;height:3960;flip:y;visibility:visible;mso-wrap-style:square" o:connectortype="straight" o:gfxdata="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" strokeweight="1pt">
+                  <v:stroke dashstyle="dash" endarrow="block"/>
+                </v:shape>
+                <v:shape id="Hop 110" o:spid="_x0000_s1036" type="#_x0000_t202" style="position:absolute;left:23760;top:8280;width:7200;height:3240;visibility:visible;mso-wrap-style:square;v-text-anchor:middle" o:gfxdata="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" filled="f" stroked="f">
+                  <v:textbox inset="1mm,.5mm,1mm,.5mm">
                     <w:txbxContent>
                       <w:p>
                         <w:pPr>
                           <w:jc w:val="center"/>
+                        </w:pPr>
+                        <w:r>
                           <w:rPr>
-                            <w:sz w:val="20"/>
-                            <w:szCs w:val="20"/>
+                            <w:color w:val="000000"/>
+                            <w:sz w:val="16"/>
+                            <w:szCs w:val="16"/>
                           </w:rPr>
-                        </w:pPr>
+                          <w:t>khác biệt kép</w:t>
+                        </w:r>
                       </w:p>
                     </w:txbxContent>
                   </v:textbox>
-                </v:rect>
-                <v:rect id="Shape 11" o:spid="_x0000_s1037" style="position:absolute;left:18000;top:13320;width:6840;height:2160;visibility:visible;mso-wrap-style:square;v-text-anchor:middle" o:gfxdata="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" filled="f" stroked="f">
-                  <v:textbox inset="1.5mm,1mm,1.5mm,1mm">
+                </v:shape>
+                <v:shape id="Hop 111" o:spid="_x0000_s1037" type="#_x0000_t202" style="position:absolute;left:39960;top:8280;width:7200;height:3240;visibility:visible;mso-wrap-style:square;v-text-anchor:middle" o:gfxdata="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" filled="f" stroked="f">
+                  <v:textbox inset="1mm,.5mm,1mm,.5mm">
                     <w:txbxContent>
                       <w:p>
                         <w:pPr>
                           <w:jc w:val="center"/>
-                          <w:rPr>
-                            <w:sz w:val="20"/>
-                            <w:szCs w:val="20"/>
-                          </w:rPr>
                         </w:pPr>
                         <w:r>
                           <w:rPr>
-                            <w:sz w:val="20"/>
-                            <w:szCs w:val="20"/>
+                            <w:color w:val="000000"/>
+                            <w:sz w:val="16"/>
+                            <w:szCs w:val="16"/>
                           </w:rPr>
-                          <w:t>đối chứng</w:t>
+                          <w:t>bối cảnh</w:t>
                         </w:r>
                       </w:p>
                     </w:txbxContent>
                   </v:textbox>
-                </v:rect>
-                <v:rect id="Shape 12" o:spid="_x0000_s1038" style="position:absolute;left:37800;top:13320;width:4320;height:2160;visibility:visible;mso-wrap-style:square;v-text-anchor:middle" o:gfxdata="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" filled="f" stroked="f">
-                  <v:textbox inset="1.5mm,1mm,1.5mm,1mm">
-                    <w:txbxContent>
-                      <w:p>
-                        <w:pPr>
-                          <w:jc w:val="center"/>
-                          <w:rPr>
-                            <w:sz w:val="20"/>
-                            <w:szCs w:val="20"/>
-                          </w:rPr>
-                        </w:pPr>
-                      </w:p>
-                    </w:txbxContent>
-                  </v:textbox>
-                </v:rect>
+                </v:shape>
                 <w10:anchorlock/>
               </v:group>
             </w:pict>
@@ -6101,9 +5943,11 @@
       <w:pPr>
         <w:pStyle w:val="Heading4"/>
       </w:pPr>
+      <w:bookmarkStart w:id="13" w:name="_Toc243171420"/>
       <w:r>
         <w:t>Khung phân tích: hợp nhất sàn, chất lượng thị trường và khả năng đầu tư</w:t>
       </w:r>
+      <w:bookmarkEnd w:id="13"/>
     </w:p>
     <w:p>
       <w:pPr>
@@ -6113,7 +5957,7 @@
           <w:szCs w:val="26"/>
         </w:rPr>
       </w:pPr>
-      <w:bookmarkStart w:id="13" w:name="_Toc242353157"/>
+      <w:bookmarkStart w:id="14" w:name="_Toc242353157"/>
       <w:r>
         <w:rPr>
           <w:sz w:val="26"/>
@@ -6129,7 +5973,7 @@
       <w:r>
         <w:t>Giả thuyết, thước đo và cơ sở lý thuyết</w:t>
       </w:r>
-      <w:bookmarkEnd w:id="13"/>
+      <w:bookmarkEnd w:id="14"/>
     </w:p>
     <w:tbl>
       <w:tblPr>
@@ -6326,15 +6170,7 @@
                 <w:sz w:val="26"/>
                 <w:szCs w:val="26"/>
               </w:rPr>
-              <w:t xml:space="preserve">: Trong giai đoạn tham chiếu từ tháng 6/2009 đến </w:t>
-            </w:r>
-            <w:r>
-              <w:rPr>
-                <w:sz w:val="26"/>
-                <w:szCs w:val="26"/>
-              </w:rPr>
-              <w:lastRenderedPageBreak/>
-              <w:t>tháng 6/2025, Chỉ số chất lượng thị trường vốn của sàn niêm yết HNX thấp hơn của HOSE (câu hỏi 2)</w:t>
+              <w:t>: Trong giai đoạn tham chiếu từ tháng 6/2009 đến tháng 6/2025, Chỉ số chất lượng thị trường vốn của sàn niêm yết HNX thấp hơn của HOSE (câu hỏi 2)</w:t>
             </w:r>
           </w:p>
         </w:tc>
@@ -6355,16 +6191,7 @@
                 <w:sz w:val="26"/>
                 <w:szCs w:val="26"/>
               </w:rPr>
-              <w:lastRenderedPageBreak/>
-              <w:t xml:space="preserve">Chỉ số gộp từ độ phi thanh khoản Amihud, tỷ lệ ngày </w:t>
-            </w:r>
-            <w:r>
-              <w:rPr>
-                <w:sz w:val="26"/>
-                <w:szCs w:val="26"/>
-              </w:rPr>
-              <w:lastRenderedPageBreak/>
-              <w:t>lợi suất bằng 0, chênh lệch mua-bán ước lượng, tỷ số phương sai, độ trễ giá, số ngày trễ hạn công bố</w:t>
+              <w:t>Chỉ số gộp từ độ phi thanh khoản Amihud, tỷ lệ ngày lợi suất bằng 0, chênh lệch mua-bán ước lượng, tỷ số phương sai, độ trễ giá, số ngày trễ hạn công bố</w:t>
             </w:r>
           </w:p>
         </w:tc>
@@ -6385,16 +6212,15 @@
                 <w:sz w:val="26"/>
                 <w:szCs w:val="26"/>
               </w:rPr>
+              <w:t xml:space="preserve">Amihud (2002); Lesmond và cộng sự (1999); Corwin và Schultz (2012); Lo và MacKinlay (1988); Hou và </w:t>
+            </w:r>
+            <w:r>
+              <w:rPr>
+                <w:sz w:val="26"/>
+                <w:szCs w:val="26"/>
+              </w:rPr>
               <w:lastRenderedPageBreak/>
-              <w:t xml:space="preserve">Amihud (2002); Lesmond và cộng sự </w:t>
-            </w:r>
-            <w:r>
-              <w:rPr>
-                <w:sz w:val="26"/>
-                <w:szCs w:val="26"/>
-              </w:rPr>
-              <w:lastRenderedPageBreak/>
-              <w:t>(1999); Corwin và Schultz (2012); Lo và MacKinlay (1988); Hou và Moskowitz (2005); OECD (2008)</w:t>
+              <w:t>Moskowitz (2005); OECD (2008)</w:t>
             </w:r>
           </w:p>
         </w:tc>
@@ -6653,11 +6479,11 @@
         <w:pStyle w:val="BodyText"/>
       </w:pPr>
       <w:r>
-        <w:t xml:space="preserve">Bước giá cũng khác nhau. Với giao dịch khớp lệnh cổ phiếu, bước giá ở HOSE là 10 đồng khi giá dưới 10.000 đồng, 50 đồng khi giá từ 10.000 đến 49.950 đồng và </w:t>
+        <w:t xml:space="preserve">Bước giá cũng khác nhau. Với giao dịch khớp lệnh cổ phiếu, bước giá ở HOSE là 10 đồng khi giá dưới 10.000 đồng, 50 đồng khi giá từ 10.000 đến 49.950 đồng và 100 đồng từ 50.000 đồng trở lên (Sở Giao dịch Chứng khoán Thành phố Hồ Chí Minh, 2025), còn ở HNX là 100 đồng cho mọi mức giá (Sở Giao dịch Chứng khoán Hà Nội, 2016, Điều 23). Bảng bước giá hiện hành của HOSE áp dụng từ ngày </w:t>
       </w:r>
       <w:r>
         <w:lastRenderedPageBreak/>
-        <w:t>100 đồng từ 50.000 đồng trở lên (Sở Giao dịch Chứng khoán Thành phố Hồ Chí Minh, 2025), còn ở HNX là 100 đồng cho mọi mức giá (Sở Giao dịch Chứng khoán Hà Nội, 2016, Điều 23). Bảng bước giá hiện hành của HOSE áp dụng từ ngày 12/9/2016 theo quy chế giao dịch ban hành kèm Quyết định số 341/QĐ-SGDHCM (Sở Giao dịch Chứng khoán Thành phố Hồ Chí Minh, 2016). Khi chuyển sàn, bước giá vì vậy giảm mười lần ở mã giá dưới 10.000 đồng, giảm một nửa ở mã giá từ 10.000 đến 49.950 đồng và không đổi ở mã giá cao hơn.</w:t>
+        <w:t>12/9/2016 theo quy chế giao dịch ban hành kèm Quyết định số 341/QĐ-SGDHCM (Sở Giao dịch Chứng khoán Thành phố Hồ Chí Minh, 2016). Khi chuyển sàn, bước giá vì vậy giảm mười lần ở mã giá dưới 10.000 đồng, giảm một nửa ở mã giá từ 10.000 đến 49.950 đồng và không đổi ở mã giá cao hơn.</w:t>
       </w:r>
     </w:p>
     <w:p>
@@ -6715,37 +6541,88 @@
         <w:pStyle w:val="BodyText"/>
       </w:pPr>
       <w:r>
+        <w:t>Với H</w:t>
+      </w:r>
+      <w:r>
+        <w:rPr>
+          <w:vertAlign w:val="subscript"/>
+        </w:rPr>
+        <w:t>4</w:t>
+      </w:r>
+      <w:r>
+        <w:t>, quy tắc 1/N có thể xóa khoảng cách vì không cần ước lượng tham số (DeMiguel và cộng sự, 2009), nên đề tài báo cáo khoảng cách riêng cho từng mô hình.</w:t>
+      </w:r>
+    </w:p>
+    <w:p>
+      <w:pPr>
+        <w:pStyle w:val="Heading3"/>
+      </w:pPr>
+      <w:bookmarkStart w:id="15" w:name="_Toc243136577"/>
+      <w:bookmarkStart w:id="16" w:name="dữ-liệu"/>
+      <w:bookmarkEnd w:id="12"/>
+      <w:r>
         <w:lastRenderedPageBreak/>
-        <w:t>Với H</w:t>
-      </w:r>
-      <w:r>
-        <w:rPr>
-          <w:vertAlign w:val="subscript"/>
-        </w:rPr>
-        <w:t>4</w:t>
-      </w:r>
-      <w:r>
-        <w:t>, quy tắc 1/N có thể xóa khoảng cách vì không cần ước lượng tham số (DeMiguel và cộng sự, 2009), nên đề tài báo cáo khoảng cách riêng cho từng mô hình.</w:t>
+        <w:t>4.3.3. Dữ liệu</w:t>
+      </w:r>
+      <w:bookmarkEnd w:id="15"/>
+    </w:p>
+    <w:p>
+      <w:pPr>
+        <w:pStyle w:val="FirstParagraph"/>
+      </w:pPr>
+      <w:r>
+        <w:t>Đề tài dùng hai bộ dữ liệu. Bộ dữ liệu quốc tế cho câu hỏi 1 gồm điểm và thứ hạng GFCI các kỳ 1–40, do Z/Yen công bố công khai từ năm 2007, được thí sinh số hóa từ báo cáo từng kỳ nếu Long Finance cho phép (nếu không, xem phương án dự phòng ở mục 4.3.10) và ghép với các chỉ báo thị trường cổ phiếu cấp quốc gia (Čihák và cộng sự, 2012) và các chỉ số quản trị nhà nước (Kaufmann và cộng sự, 2011).</w:t>
+      </w:r>
+    </w:p>
+    <w:p>
+      <w:pPr>
+        <w:pStyle w:val="FirstParagraph"/>
+      </w:pPr>
+      <w:r>
+        <w:t>Bộ dữ liệu Việt Nam gồm giá điều chỉnh, khối lượng và giá trị giao dịch theo ngày của cổ phiếu trên sàn niêm yết HNX, UPCoM và HOSE, kể cả mã đã hủy niêm yết hoặc chuyển sàn, cùng các chỉ số thị trường, lợi suất trái phiếu chính phủ kỳ hạn một năm và thời điểm công bố báo cáo tài chính quý. Nguồn là HNX, HOSE và một nhà cung cấp dữ liệu thương mại; dữ liệu không chứa thông tin cá nhân.</w:t>
+      </w:r>
+    </w:p>
+    <w:p>
+      <w:pPr>
+        <w:pStyle w:val="BodyText"/>
+      </w:pPr>
+      <w:r>
+        <w:t>Mẫu bắt đầu từ tháng 6/2009, khi UPCoM khai trương (ngày 24/6/2009). Vì HNX ngừng tiếp nhận hồ sơ đăng ký niêm yết cổ phiếu mới từ ngày 01/7/2025 (Bộ Tài chính, 2023), giai đoạn tham chiếu kết thúc ngày 30/6/2025. Giai đoạn từ tháng 7/2025 đến tháng 12/2026 là giai đoạn chuyển tiếp, được báo cáo riêng (phiên bản nghiên cứu sự kiện và phần mô tả), không dùng trong các kiểm định chính; giai đoạn sau sự kiện kéo dài 24 tháng từ tháng 1/2027.</w:t>
+      </w:r>
+    </w:p>
+    <w:p>
+      <w:pPr>
+        <w:pStyle w:val="BodyText"/>
+      </w:pPr>
+      <w:r>
+        <w:t>Ngày bị đình chỉ giao dịch được loại khỏi mẫu số của tỷ lệ ngày lợi suất bằng 0. Độ phi thanh khoản Amihud được winsorize tại phân vị 1% và 99% tính trên mẫu gộp các sàn trong từng tháng, để ngưỡng không đổi khi cổ phiếu đổi sàn.</w:t>
+      </w:r>
+    </w:p>
+    <w:p>
+      <w:pPr>
+        <w:pStyle w:val="BodyText"/>
+      </w:pPr>
+      <w:r>
+        <w:t>Giai đoạn căng thẳng, chỉ dùng cho phân tích mô tả, gồm đại dịch COVID-19 năm 2020 (Dao và cộng sự, 2021) và biến cố thị trường trái phiếu doanh nghiệp từ quý 4/2022 (International Monetary Fund, 2023; Vu và cộng sự, 2024).</w:t>
       </w:r>
     </w:p>
     <w:p>
       <w:pPr>
         <w:pStyle w:val="Heading3"/>
       </w:pPr>
-      <w:bookmarkStart w:id="14" w:name="_Toc243136577"/>
-      <w:bookmarkStart w:id="15" w:name="dữ-liệu"/>
-      <w:bookmarkEnd w:id="12"/>
-      <w:r>
-        <w:t>4.3.3. Dữ liệu</w:t>
-      </w:r>
-      <w:bookmarkEnd w:id="14"/>
+      <w:bookmarkStart w:id="17" w:name="_Toc243136578"/>
+      <w:bookmarkEnd w:id="16"/>
+      <w:r>
+        <w:t>4.3.4. Chỉ số chất lượng thị trường vốn</w:t>
+      </w:r>
+      <w:bookmarkEnd w:id="17"/>
     </w:p>
     <w:p>
       <w:pPr>
         <w:pStyle w:val="FirstParagraph"/>
       </w:pPr>
       <w:r>
-        <w:t>Đề tài dùng hai bộ dữ liệu. Bộ dữ liệu quốc tế cho câu hỏi 1 gồm điểm và thứ hạng GFCI các kỳ 1–40, do Z/Yen công bố công khai từ năm 2007, được thí sinh số hóa từ báo cáo từng kỳ nếu Long Finance cho phép (nếu không, xem phương án dự phòng ở mục 4.3.10) và ghép với các chỉ báo thị trường cổ phiếu cấp quốc gia (Čihák và cộng sự, 2012) và các chỉ số quản trị nhà nước (Kaufmann và cộng sự, 2011).</w:t>
+        <w:t>Với mỗi cổ phiếu và mỗi tháng, đề tài tính sáu chỉ báo thuộc ba chiều. Chiều thanh khoản gồm độ phi thanh khoản Amihud (Amihud, 2002), tỷ lệ ngày có lợi suất bằng 0 (Lesmond và cộng sự, 1999) và chênh lệch mua-bán ước lượng từ giá cao nhất và thấp nhất (Corwin &amp; Schultz, 2012). Hai chỉ báo đầu là chỉ báo chính vì đã được dùng rộng rãi ở thị trường mới nổi (Bekaert và cộng sự, 2007; Lesmond, 2005) và đã được so sánh với chuẩn tính từ dữ liệu trong ngày trên mẫu toàn cầu (Fong và cộng sự, 2017).</w:t>
       </w:r>
     </w:p>
     <w:p>
@@ -6753,61 +6630,7 @@
         <w:pStyle w:val="FirstParagraph"/>
       </w:pPr>
       <w:r>
-        <w:t>Bộ dữ liệu Việt Nam gồm giá điều chỉnh, khối lượng và giá trị giao dịch theo ngày của cổ phiếu trên sàn niêm yết HNX, UPCoM và HOSE, kể cả mã đã hủy niêm yết hoặc chuyển sàn, cùng các chỉ số thị trường, lợi suất trái phiếu chính phủ kỳ hạn một năm và thời điểm công bố báo cáo tài chính quý. Nguồn là HNX, HOSE và một nhà cung cấp dữ liệu thương mại; dữ liệu không chứa thông tin cá nhân.</w:t>
-      </w:r>
-    </w:p>
-    <w:p>
-      <w:pPr>
-        <w:pStyle w:val="BodyText"/>
-      </w:pPr>
-      <w:r>
-        <w:t>Mẫu bắt đầu từ tháng 6/2009, khi UPCoM khai trương (ngày 24/6/2009). Vì HNX ngừng tiếp nhận hồ sơ đăng ký niêm yết cổ phiếu mới từ ngày 01/7/2025 (Bộ Tài chính, 2023), giai đoạn tham chiếu kết thúc ngày 30/6/2025. Giai đoạn từ tháng 7/2025 đến tháng 12/2026 là giai đoạn chuyển tiếp, được báo cáo riêng (phiên bản nghiên cứu sự kiện và phần mô tả), không dùng trong các kiểm định chính; giai đoạn sau sự kiện kéo dài 24 tháng từ tháng 1/2027.</w:t>
-      </w:r>
-    </w:p>
-    <w:p>
-      <w:pPr>
-        <w:pStyle w:val="BodyText"/>
-      </w:pPr>
-      <w:r>
-        <w:t>Ngày bị đình chỉ giao dịch được loại khỏi mẫu số của tỷ lệ ngày lợi suất bằng 0. Độ phi thanh khoản Amihud được winsorize tại phân vị 1% và 99% tính trên mẫu gộp các sàn trong từng tháng, để ngưỡng không đổi khi cổ phiếu đổi sàn.</w:t>
-      </w:r>
-    </w:p>
-    <w:p>
-      <w:pPr>
-        <w:pStyle w:val="BodyText"/>
-      </w:pPr>
-      <w:r>
-        <w:t>Giai đoạn căng thẳng, chỉ dùng cho phân tích mô tả, gồm đại dịch COVID-19 năm 2020 (Dao và cộng sự, 2021) và biến cố thị trường trái phiếu doanh nghiệp từ quý 4/2022 (International Monetary Fund, 2023; Vu và cộng sự, 2024).</w:t>
-      </w:r>
-    </w:p>
-    <w:p>
-      <w:pPr>
-        <w:pStyle w:val="Heading3"/>
-      </w:pPr>
-      <w:bookmarkStart w:id="16" w:name="_Toc243136578"/>
-      <w:bookmarkEnd w:id="15"/>
-      <w:r>
-        <w:t>4.3.4. Chỉ số chất lượng thị trường vốn</w:t>
-      </w:r>
-      <w:bookmarkEnd w:id="16"/>
-    </w:p>
-    <w:p>
-      <w:pPr>
-        <w:pStyle w:val="FirstParagraph"/>
-      </w:pPr>
-      <w:r>
-        <w:t xml:space="preserve">Với mỗi cổ phiếu và mỗi tháng, đề tài tính sáu chỉ báo thuộc ba chiều. Chiều thanh khoản gồm độ phi thanh khoản Amihud (Amihud, 2002), tỷ lệ ngày có lợi suất bằng 0 (Lesmond và cộng sự, 1999) và chênh lệch mua-bán ước lượng từ giá cao nhất và thấp nhất (Corwin &amp; Schultz, 2012). Hai chỉ báo đầu là chỉ báo chính vì đã được </w:t>
-      </w:r>
-      <w:r>
         <w:lastRenderedPageBreak/>
-        <w:t>dùng rộng rãi ở thị trường mới nổi (Bekaert và cộng sự, 2007; Lesmond, 2005) và đã được so sánh với chuẩn tính từ dữ liệu trong ngày trên mẫu toàn cầu (Fong và cộng sự, 2017).</w:t>
-      </w:r>
-    </w:p>
-    <w:p>
-      <w:pPr>
-        <w:pStyle w:val="FirstParagraph"/>
-      </w:pPr>
-      <w:r>
         <w:t>Chiều hiệu quả thông tin gồm độ lệch của tỷ số phương sai khỏi 1 (Lo &amp; MacKinlay, 1988) và độ trễ giá (Hou &amp; Moskowitz, 2005); vì hai thước đo này có thể cho kết luận sai khi môi trường thông tin khác nhau (Griffin và cộng sự, 2010), chỉ số được tính lại khi bỏ chiều này. Chiều minh bạch là số ngày trễ hạn công bố báo cáo tài chính quý.</w:t>
       </w:r>
     </w:p>
@@ -7070,33 +6893,30 @@
       <w:pPr>
         <w:pStyle w:val="Heading3"/>
       </w:pPr>
-      <w:bookmarkStart w:id="17" w:name="_Toc243136579"/>
+      <w:bookmarkStart w:id="18" w:name="_Toc243136579"/>
       <w:r>
         <w:t>4.3.5. Mô hình phân bổ dùng làm công cụ đo và đăng ký trước</w:t>
       </w:r>
-      <w:bookmarkEnd w:id="17"/>
+      <w:bookmarkEnd w:id="18"/>
     </w:p>
     <w:p>
       <w:pPr>
         <w:pStyle w:val="FirstParagraph"/>
       </w:pPr>
       <w:r>
-        <w:t xml:space="preserve">Đề tài đo khả năng đầu tư bằng bảy mô hình phân bổ (Bảng 3), đại diện cho các hướng tiếp cận ở nhóm tài liệu (D) và cho quy tắc có trạng thái thị trường (Hamilton, </w:t>
-      </w:r>
+        <w:t>Đề tài đo khả năng đầu tư bằng bảy mô hình phân bổ (Bảng 3), đại diện cho các hướng tiếp cận ở nhóm tài liệu (D) và cho quy tắc có trạng thái thị trường (Hamilton, 1989; Kritzman và cộng sự, 2012). Bình quân theo bảy mô hình làm kết luận ít phụ thuộc vào sai số ước lượng của một mô hình, còn độ phân tán giữa các mô hình cho biết mức phụ thuộc đó.</w:t>
+      </w:r>
+    </w:p>
+    <w:p>
+      <w:pPr>
+        <w:pStyle w:val="Heading5"/>
+      </w:pPr>
+      <w:bookmarkStart w:id="19" w:name="_Toc242353158"/>
       <w:r>
         <w:lastRenderedPageBreak/>
-        <w:t>1989; Kritzman và cộng sự, 2012). Bình quân theo bảy mô hình làm kết luận ít phụ thuộc vào sai số ước lượng của một mô hình, còn độ phân tán giữa các mô hình cho biết mức phụ thuộc đó.</w:t>
-      </w:r>
-    </w:p>
-    <w:p>
-      <w:pPr>
-        <w:pStyle w:val="Heading5"/>
-      </w:pPr>
-      <w:bookmarkStart w:id="18" w:name="_Toc242353158"/>
-      <w:r>
         <w:t>Bảy mô hình phân bổ dùng làm công cụ đo khả năng đầu tư</w:t>
       </w:r>
-      <w:bookmarkEnd w:id="18"/>
+      <w:bookmarkEnd w:id="19"/>
     </w:p>
     <w:tbl>
       <w:tblPr>
@@ -7777,23 +7597,20 @@
         <w:pStyle w:val="BodyText"/>
       </w:pPr>
       <w:r>
-        <w:t xml:space="preserve">Tệp đăng ký cố định trước mọi lựa chọn có thể ảnh hưởng tới kết quả: chỉ báo và trọng số; quy tắc lập rổ và ghép đối chứng; chi phí giao dịch và siêu tham số của bảy mô hình; đặc tả các phương trình (5)–(7) và thủ tục suy luận; ngưỡng lợi suất khi tính Amihud; quy tắc chọn cửa sổ trước theo điểm gãy cấu trúc; định nghĩa mức chịu </w:t>
-      </w:r>
+        <w:t>Tệp đăng ký cố định trước mọi lựa chọn có thể ảnh hưởng tới kết quả: chỉ báo và trọng số; quy tắc lập rổ và ghép đối chứng; chi phí giao dịch và siêu tham số của bảy mô hình; đặc tả các phương trình (5)–(7) và thủ tục suy luận; ngưỡng lợi suất khi tính Amihud; quy tắc chọn cửa sổ trước theo điểm gãy cấu trúc; định nghĩa mức chịu cú sốc và biến trụ sở; mức ý nghĩa và cách hiệu chỉnh so sánh bội. Mọi thay đổi sau ngày đăng ký được ghi là lệch khỏi kế hoạch.</w:t>
+      </w:r>
+    </w:p>
+    <w:p>
+      <w:pPr>
+        <w:pStyle w:val="Heading3"/>
+      </w:pPr>
+      <w:bookmarkStart w:id="20" w:name="_Toc243136580"/>
+      <w:bookmarkStart w:id="21" w:name="thước-đo-rủi-ro-lựa-chọn-mô-hình"/>
       <w:r>
         <w:lastRenderedPageBreak/>
-        <w:t>cú sốc và biến trụ sở; mức ý nghĩa và cách hiệu chỉnh so sánh bội. Mọi thay đổi sau ngày đăng ký được ghi là lệch khỏi kế hoạch.</w:t>
-      </w:r>
-    </w:p>
-    <w:p>
-      <w:pPr>
-        <w:pStyle w:val="Heading3"/>
-      </w:pPr>
-      <w:bookmarkStart w:id="19" w:name="_Toc243136580"/>
-      <w:bookmarkStart w:id="20" w:name="thước-đo-rủi-ro-lựa-chọn-mô-hình"/>
-      <w:r>
         <w:t>4.3.6. Chỉ số khả năng đầu tư</w:t>
       </w:r>
-      <w:bookmarkEnd w:id="19"/>
+      <w:bookmarkEnd w:id="20"/>
     </w:p>
     <w:p>
       <w:pPr>
@@ -8273,18 +8090,15 @@
         <w:pStyle w:val="FirstParagraph"/>
       </w:pPr>
       <w:r>
-        <w:t xml:space="preserve">Rổ CS gồm tối đa 30 cổ phiếu chuyển sàn có giá trị giao dịch bình quân ba tháng lớn nhất tại ngày tham chiếu 30/6/2025. Rổ H gồm, cho mỗi mã của rổ CS, cổ phiếu HOSE gần nhất về vốn hóa, ngành và độ phi thanh khoản tại cùng ngày, ghép có hoàn lại. Thành phần hai rổ được giữ nguyên để so sánh cùng các cổ phiếu quanh sự kiện; </w:t>
-      </w:r>
+        <w:t>Rổ CS gồm tối đa 30 cổ phiếu chuyển sàn có giá trị giao dịch bình quân ba tháng lớn nhất tại ngày tham chiếu 30/6/2025. Rổ H gồm, cho mỗi mã của rổ CS, cổ phiếu HOSE gần nhất về vốn hóa, ngành và độ phi thanh khoản tại cùng ngày, ghép có hoàn lại. Thành phần hai rổ được giữ nguyên để so sánh cùng các cổ phiếu quanh sự kiện; vì hai rổ được lập theo cùng quy tắc, thiên lệch do thông tin tại ngày tham chiếu lỗi thời ở các cửa sổ xa hay do hồi quy về trung bình tác động lên cả hai rổ.</w:t>
+      </w:r>
+    </w:p>
+    <w:p>
+      <w:pPr>
+        <w:pStyle w:val="BodyText"/>
+      </w:pPr>
       <w:r>
         <w:lastRenderedPageBreak/>
-        <w:t>vì hai rổ được lập theo cùng quy tắc, thiên lệch do thông tin tại ngày tham chiếu lỗi thời ở các cửa sổ xa hay do hồi quy về trung bình tác động lên cả hai rổ.</w:t>
-      </w:r>
-    </w:p>
-    <w:p>
-      <w:pPr>
-        <w:pStyle w:val="BodyText"/>
-      </w:pPr>
-      <w:r>
         <w:t>Mỗi mô hình được ước lượng trên cửa sổ 104 tuần và đánh giá trên cửa sổ 3 tháng không chồng lấn (Hình 2): 20 cửa sổ từ quý 3/2020 đến quý 2/2025 và 8 cửa sổ từ quý 1/2027 đến quý 4/2028. Cửa sổ ước lượng sau sự kiện vẫn chứa dữ liệu trước ngày chuyển sàn, nên khoảng cách của M</w:t>
       </w:r>
       <w:r>
@@ -8893,8 +8707,8 @@
           </mc:Choice>
           <mc:Fallback>
             <w:pict>
-              <v:group w14:anchorId="7EE40C07" id="Hình 2. Thiết kế cửa sổ" o:spid="_x0000_s1039" style="width:436.55pt;height:175.75pt;mso-position-horizontal-relative:char;mso-position-vertical-relative:line" coordsize="55440,22320" o:gfxdata="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">
-                <v:rect id="Shape 1" o:spid="_x0000_s1040" style="position:absolute;width:8100;height:3420;visibility:visible;mso-wrap-style:square;v-text-anchor:middle" o:gfxdata="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" filled="f" stroked="f">
+              <v:group w14:anchorId="7EE40C07" id="Hình 2. Thiết kế cửa sổ" o:spid="_x0000_s1038" style="width:436.55pt;height:175.75pt;mso-position-horizontal-relative:char;mso-position-vertical-relative:line" coordsize="55440,22320" o:gfxdata="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">
+                <v:rect id="Shape 1" o:spid="_x0000_s1039" style="position:absolute;width:8100;height:3420;visibility:visible;mso-wrap-style:square;v-text-anchor:middle" o:gfxdata="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" filled="f" stroked="f">
                   <v:textbox inset="1.5mm,1mm,1.5mm,1mm">
                     <w:txbxContent>
                       <w:p>
@@ -8912,7 +8726,7 @@
                     </w:txbxContent>
                   </v:textbox>
                 </v:rect>
-                <v:rect id="Shape 2" o:spid="_x0000_s1041" style="position:absolute;left:8640;width:25200;height:3420;visibility:visible;mso-wrap-style:square;v-text-anchor:middle" o:gfxdata="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">
+                <v:rect id="Shape 2" o:spid="_x0000_s1040" style="position:absolute;left:8640;width:25200;height:3420;visibility:visible;mso-wrap-style:square;v-text-anchor:middle" o:gfxdata="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">
                   <v:textbox inset="1.5mm,1mm,1.5mm,1mm">
                     <w:txbxContent>
                       <w:p>
@@ -8931,7 +8745,7 @@
                     </w:txbxContent>
                   </v:textbox>
                 </v:rect>
-                <v:rect id="Shape 3" o:spid="_x0000_s1042" style="position:absolute;left:33840;width:6300;height:3420;visibility:visible;mso-wrap-style:square;v-text-anchor:middle" o:gfxdata="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">
+                <v:rect id="Shape 3" o:spid="_x0000_s1041" style="position:absolute;left:33840;width:6300;height:3420;visibility:visible;mso-wrap-style:square;v-text-anchor:middle" o:gfxdata="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">
                   <v:textbox inset="1.5mm,1mm,1.5mm,1mm">
                     <w:txbxContent>
                       <w:p>
@@ -8963,7 +8777,7 @@
                     </w:txbxContent>
                   </v:textbox>
                 </v:rect>
-                <v:rect id="Shape 4" o:spid="_x0000_s1043" style="position:absolute;top:4679;width:8100;height:3420;visibility:visible;mso-wrap-style:square;v-text-anchor:middle" o:gfxdata="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" filled="f" stroked="f">
+                <v:rect id="Shape 4" o:spid="_x0000_s1042" style="position:absolute;top:4679;width:8100;height:3420;visibility:visible;mso-wrap-style:square;v-text-anchor:middle" o:gfxdata="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" filled="f" stroked="f">
                   <v:textbox inset="1.5mm,1mm,1.5mm,1mm">
                     <w:txbxContent>
                       <w:p>
@@ -8981,7 +8795,7 @@
                     </w:txbxContent>
                   </v:textbox>
                 </v:rect>
-                <v:rect id="Shape 5" o:spid="_x0000_s1044" style="position:absolute;left:14940;top:4679;width:25200;height:3420;visibility:visible;mso-wrap-style:square;v-text-anchor:middle" o:gfxdata="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">
+                <v:rect id="Shape 5" o:spid="_x0000_s1043" style="position:absolute;left:14940;top:4679;width:25200;height:3420;visibility:visible;mso-wrap-style:square;v-text-anchor:middle" o:gfxdata="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">
                   <v:textbox inset="1.5mm,1mm,1.5mm,1mm">
                     <w:txbxContent>
                       <w:p>
@@ -9000,7 +8814,7 @@
                     </w:txbxContent>
                   </v:textbox>
                 </v:rect>
-                <v:rect id="Shape 6" o:spid="_x0000_s1045" style="position:absolute;left:40140;top:4679;width:6300;height:3420;visibility:visible;mso-wrap-style:square;v-text-anchor:middle" o:gfxdata="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">
+                <v:rect id="Shape 6" o:spid="_x0000_s1044" style="position:absolute;left:40140;top:4679;width:6300;height:3420;visibility:visible;mso-wrap-style:square;v-text-anchor:middle" o:gfxdata="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">
                   <v:textbox inset="1.5mm,1mm,1.5mm,1mm">
                     <w:txbxContent>
                       <w:p>
@@ -9032,7 +8846,7 @@
                     </w:txbxContent>
                   </v:textbox>
                 </v:rect>
-                <v:rect id="Shape 7" o:spid="_x0000_s1046" style="position:absolute;top:9359;width:8100;height:3420;visibility:visible;mso-wrap-style:square;v-text-anchor:middle" o:gfxdata="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" filled="f" stroked="f">
+                <v:rect id="Shape 7" o:spid="_x0000_s1045" style="position:absolute;top:9359;width:8100;height:3420;visibility:visible;mso-wrap-style:square;v-text-anchor:middle" o:gfxdata="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" filled="f" stroked="f">
                   <v:textbox inset="1.5mm,1mm,1.5mm,1mm">
                     <w:txbxContent>
                       <w:p>
@@ -9050,7 +8864,7 @@
                     </w:txbxContent>
                   </v:textbox>
                 </v:rect>
-                <v:rect id="Shape 8" o:spid="_x0000_s1047" style="position:absolute;left:21240;top:9359;width:25200;height:3420;visibility:visible;mso-wrap-style:square;v-text-anchor:middle" o:gfxdata="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">
+                <v:rect id="Shape 8" o:spid="_x0000_s1046" style="position:absolute;left:21240;top:9359;width:25200;height:3420;visibility:visible;mso-wrap-style:square;v-text-anchor:middle" o:gfxdata="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">
                   <v:textbox inset="1.5mm,1mm,1.5mm,1mm">
                     <w:txbxContent>
                       <w:p>
@@ -9069,7 +8883,7 @@
                     </w:txbxContent>
                   </v:textbox>
                 </v:rect>
-                <v:rect id="Shape 9" o:spid="_x0000_s1048" style="position:absolute;left:46440;top:9359;width:6300;height:3420;visibility:visible;mso-wrap-style:square;v-text-anchor:middle" o:gfxdata="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">
+                <v:rect id="Shape 9" o:spid="_x0000_s1047" style="position:absolute;left:46440;top:9359;width:6300;height:3420;visibility:visible;mso-wrap-style:square;v-text-anchor:middle" o:gfxdata="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">
                   <v:textbox inset="1.5mm,1mm,1.5mm,1mm">
                     <w:txbxContent>
                       <w:p>
@@ -9101,10 +8915,10 @@
                     </w:txbxContent>
                   </v:textbox>
                 </v:rect>
-                <v:shape id="Connector 10" o:spid="_x0000_s1049" type="#_x0000_t32" style="position:absolute;left:8640;top:14580;width:46440;height:0;visibility:visible;mso-wrap-style:square" o:connectortype="straight" o:gfxdata="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" strokeweight="1pt">
+                <v:shape id="Connector 10" o:spid="_x0000_s1048" type="#_x0000_t32" style="position:absolute;left:8640;top:14580;width:46440;height:0;visibility:visible;mso-wrap-style:square" o:connectortype="straight" o:gfxdata="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" strokeweight="1pt">
                   <v:stroke endarrow="block"/>
                 </v:shape>
-                <v:rect id="Shape 11" o:spid="_x0000_s1050" style="position:absolute;left:47880;top:14759;width:7200;height:1800;visibility:visible;mso-wrap-style:square;v-text-anchor:middle" o:gfxdata="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" filled="f" stroked="f">
+                <v:rect id="Shape 11" o:spid="_x0000_s1049" style="position:absolute;left:47880;top:14759;width:7200;height:1800;visibility:visible;mso-wrap-style:square;v-text-anchor:middle" o:gfxdata="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" filled="f" stroked="f">
                   <v:textbox inset="1.5mm,1mm,1.5mm,1mm">
                     <w:txbxContent>
                       <w:p>
@@ -9122,16 +8936,16 @@
                     </w:txbxContent>
                   </v:textbox>
                 </v:rect>
-                <v:shape id="Connector 12" o:spid="_x0000_s1051" type="#_x0000_t32" style="position:absolute;left:33840;top:14759;width:0;height:2340;flip:y;visibility:visible;mso-wrap-style:square" o:connectortype="straight" o:gfxdata="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" strokeweight="1pt">
+                <v:shape id="Connector 12" o:spid="_x0000_s1050" type="#_x0000_t32" style="position:absolute;left:33840;top:14759;width:0;height:2340;flip:y;visibility:visible;mso-wrap-style:square" o:connectortype="straight" o:gfxdata="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" strokeweight="1pt">
                   <v:stroke endarrow="block"/>
                 </v:shape>
-                <v:shape id="Connector 13" o:spid="_x0000_s1052" type="#_x0000_t32" style="position:absolute;left:40140;top:14759;width:0;height:2340;flip:y;visibility:visible;mso-wrap-style:square" o:connectortype="straight" o:gfxdata="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" strokeweight="1pt">
+                <v:shape id="Connector 13" o:spid="_x0000_s1051" type="#_x0000_t32" style="position:absolute;left:40140;top:14759;width:0;height:2340;flip:y;visibility:visible;mso-wrap-style:square" o:connectortype="straight" o:gfxdata="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" strokeweight="1pt">
                   <v:stroke endarrow="block"/>
                 </v:shape>
-                <v:shape id="Connector 14" o:spid="_x0000_s1053" type="#_x0000_t32" style="position:absolute;left:46440;top:14759;width:0;height:2340;flip:y;visibility:visible;mso-wrap-style:square" o:connectortype="straight" o:gfxdata="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" strokeweight="1pt">
+                <v:shape id="Connector 14" o:spid="_x0000_s1052" type="#_x0000_t32" style="position:absolute;left:46440;top:14759;width:0;height:2340;flip:y;visibility:visible;mso-wrap-style:square" o:connectortype="straight" o:gfxdata="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" strokeweight="1pt">
                   <v:stroke endarrow="block"/>
                 </v:shape>
-                <v:rect id="Shape 15" o:spid="_x0000_s1054" style="position:absolute;left:10440;top:17280;width:39600;height:4500;visibility:visible;mso-wrap-style:square;v-text-anchor:middle" o:gfxdata="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" filled="f" stroked="f">
+                <v:rect id="Shape 15" o:spid="_x0000_s1053" style="position:absolute;left:10440;top:17280;width:39600;height:4500;visibility:visible;mso-wrap-style:square;v-text-anchor:middle" o:gfxdata="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" filled="f" stroked="f">
                   <v:textbox inset="1.5mm,1mm,1.5mm,1mm">
                     <w:txbxContent>
                       <w:p>
@@ -9158,11 +8972,11 @@
       <w:pPr>
         <w:pStyle w:val="Heading4"/>
       </w:pPr>
-      <w:bookmarkStart w:id="21" w:name="_Toc242353164"/>
+      <w:bookmarkStart w:id="22" w:name="_Toc243171421"/>
       <w:r>
         <w:t>Cửa sổ ước lượng, cửa sổ đánh giá và cách tính khoảng cách khả năng đầu tư</w:t>
       </w:r>
-      <w:bookmarkEnd w:id="21"/>
+      <w:bookmarkEnd w:id="22"/>
     </w:p>
     <w:p>
       <w:pPr>
@@ -9199,13 +9013,13 @@
       <w:pPr>
         <w:pStyle w:val="Heading3"/>
       </w:pPr>
-      <w:bookmarkStart w:id="22" w:name="_Toc243136581"/>
-      <w:bookmarkStart w:id="23" w:name="kiểm-định-giả-thuyết"/>
-      <w:bookmarkEnd w:id="20"/>
+      <w:bookmarkStart w:id="23" w:name="_Toc243136581"/>
+      <w:bookmarkStart w:id="24" w:name="kiểm-định-giả-thuyết"/>
+      <w:bookmarkEnd w:id="21"/>
       <w:r>
         <w:t>4.3.7. Kiểm định giả thuyết</w:t>
       </w:r>
-      <w:bookmarkEnd w:id="22"/>
+      <w:bookmarkEnd w:id="23"/>
     </w:p>
     <w:p>
       <w:pPr>
@@ -9514,11 +9328,7 @@
         <w:t>t</w:t>
       </w:r>
       <w:r>
-        <w:t xml:space="preserve"> là hiệu </w:t>
-      </w:r>
-      <w:r>
-        <w:lastRenderedPageBreak/>
-        <w:t xml:space="preserve">ứng cố định theo cổ phiếu và theo tháng; </w:t>
+        <w:t xml:space="preserve"> là hiệu ứng cố định theo cổ phiếu và theo tháng; </w:t>
       </w:r>
       <w:r>
         <w:rPr>
@@ -9552,6 +9362,7 @@
         <w:pStyle w:val="BodyText"/>
       </w:pPr>
       <w:r>
+        <w:lastRenderedPageBreak/>
         <w:t>Phương trình (5) được ước lượng trên giai đoạn tham chiếu (đến tháng 6/2025) và giai đoạn sau sự kiện (từ tháng 1/2027); các tháng từ 7/2025 đến 12/2026, gồm tháng chuyển sàn, chỉ được đưa vào phương trình (6). Vì giai đoạn tham chiếu dài 16 năm, cửa sổ trước của ước lượng chính bắt đầu sau điểm gãy cấu trúc cuối cùng của chuỗi chênh lệch theo tháng định nghĩa ở đoạn sau (Bai &amp; Perron, 1998), và ước lượng với cửa sổ trước 24 tháng (7/2023–6/2025) được báo cáo kèm.</w:t>
       </w:r>
     </w:p>
@@ -9895,11 +9706,7 @@
         <w:t>kt</w:t>
       </w:r>
       <w:r>
-        <w:t xml:space="preserve"> bằng 1 nếu tháng t là tháng k, với k chạy từ tháng 1/2024 đến tháng 12/2028 và bỏ tháng 6/2025 làm tháng gốc; các tháng trước 1/2024 được gộp thành </w:t>
-      </w:r>
-      <w:r>
-        <w:lastRenderedPageBreak/>
-        <w:t xml:space="preserve">một nhóm. Các hệ số </w:t>
+        <w:t xml:space="preserve"> bằng 1 nếu tháng t là tháng k, với k chạy từ tháng 1/2024 đến tháng 12/2028 và bỏ tháng 6/2025 làm tháng gốc; các tháng trước 1/2024 được gộp thành một nhóm. Các hệ số </w:t>
       </w:r>
       <w:r>
         <w:rPr>
@@ -9931,7 +9738,11 @@
         <w:t>k</w:t>
       </w:r>
       <w:r>
-        <w:t xml:space="preserve"> từ tháng 1/2024 đến tháng 5/2025 bằng 0. Độ nhạy của kết luận trước các vi phạm xu hướng song song được đánh giá theo Rambachan và Roth (2023). Vì giữa tháng gốc và giai đoạn sau có 18 tháng chuyển tiếp, khoảng tin cậy theo cách này có thể rất rộng.</w:t>
+        <w:t xml:space="preserve"> từ tháng 1/2024 đến tháng 5/2025 </w:t>
+      </w:r>
+      <w:r>
+        <w:lastRenderedPageBreak/>
+        <w:t>bằng 0. Độ nhạy của kết luận trước các vi phạm xu hướng song song được đánh giá theo Rambachan và Roth (2023). Vì giữa tháng gốc và giai đoạn sau có 18 tháng chuyển tiếp, khoảng tin cậy theo cách này có thể rất rộng.</w:t>
       </w:r>
     </w:p>
     <w:p>
@@ -10064,8 +9875,11 @@
         <w:pStyle w:val="BodyText"/>
       </w:pPr>
       <w:r>
+        <w:t xml:space="preserve">Giả định nhận dạng là: nếu không chuyển sàn, chênh lệch thanh khoản giữa mã chịu cú sốc mạnh và mã chịu cú sốc yếu trong nhóm chuyển sàn sẽ biến động như ở </w:t>
+      </w:r>
+      <w:r>
         <w:lastRenderedPageBreak/>
-        <w:t>Giả định nhận dạng là: nếu không chuyển sàn, chênh lệch thanh khoản giữa mã chịu cú sốc mạnh và mã chịu cú sốc yếu trong nhóm chuyển sàn sẽ biến động như ở nhóm đối chứng; giả định này được kiểm tra bằng các hệ số trước sự kiện. Vì các mức chịu cú sốc có thể tương quan với nhau và với quy mô, hệ số tương tác không đo riêng tác động của từng quy tắc; mô hình có thêm tương tác với quy mô và với logarit Amihud ban đầu.</w:t>
+        <w:t>nhóm đối chứng; giả định này được kiểm tra bằng các hệ số trước sự kiện. Vì các mức chịu cú sốc có thể tương quan với nhau và với quy mô, hệ số tương tác không đo riêng tác động của từng quy tắc; mô hình có thêm tương tác với quy mô và với logarit Amihud ban đầu.</w:t>
       </w:r>
     </w:p>
     <w:p>
@@ -10139,18 +9953,15 @@
         <w:t>4</w:t>
       </w:r>
       <w:r>
-        <w:t xml:space="preserve"> được báo cáo bằng chênh lệch của chỉ số khả năng đầu tư bình quân giữa giai đoạn sau sự kiện và giai đoạn tham chiếu, kèm khoảng tin cậy bootstrap khối dừng trên chuỗi lợi suất tuần của hai rổ, được lấy mẫu lại đồng thời, và số mô hình </w:t>
-      </w:r>
+        <w:t xml:space="preserve"> được báo cáo bằng chênh lệch của chỉ số khả năng đầu tư bình quân giữa giai đoạn sau sự kiện và giai đoạn tham chiếu, kèm khoảng tin cậy bootstrap khối dừng trên chuỗi lợi suất tuần của hai rổ, được lấy mẫu lại đồng thời, và số mô hình có cùng dấu. Chênh lệch tỷ số Sharpe, một thước đo phụ, được kiểm định theo Ledoit và Wolf (2008).</w:t>
+      </w:r>
+    </w:p>
+    <w:p>
+      <w:pPr>
+        <w:pStyle w:val="FirstParagraph"/>
+      </w:pPr>
       <w:r>
         <w:lastRenderedPageBreak/>
-        <w:t>có cùng dấu. Chênh lệch tỷ số Sharpe, một thước đo phụ, được kiểm định theo Ledoit và Wolf (2008).</w:t>
-      </w:r>
-    </w:p>
-    <w:p>
-      <w:pPr>
-        <w:pStyle w:val="FirstParagraph"/>
-      </w:pPr>
-      <w:r>
         <w:t>Đề tài kiểm định H</w:t>
       </w:r>
       <w:r>
@@ -10564,13 +10375,13 @@
       <w:pPr>
         <w:pStyle w:val="Heading3"/>
       </w:pPr>
-      <w:bookmarkStart w:id="24" w:name="_Toc243136582"/>
-      <w:bookmarkStart w:id="25" w:name="cơ-chế-giảm-thiểu"/>
-      <w:bookmarkEnd w:id="23"/>
+      <w:bookmarkStart w:id="25" w:name="_Toc243136582"/>
+      <w:bookmarkStart w:id="26" w:name="cơ-chế-giảm-thiểu"/>
+      <w:bookmarkEnd w:id="24"/>
       <w:r>
         <w:t>4.3.8. Thiết kế khác biệt kép quanh ngày chuyển sàn</w:t>
       </w:r>
-      <w:bookmarkEnd w:id="24"/>
+      <w:bookmarkEnd w:id="25"/>
     </w:p>
     <w:p>
       <w:pPr>
@@ -10585,11 +10396,11 @@
         <w:pStyle w:val="FirstParagraph"/>
       </w:pPr>
       <w:r>
-        <w:t>Thứ hai, nhóm đối chứng không chịu tác động của sự kiện. Nhóm đối chứng HOSE chịu ba thay đổi trùng thời gian: FTSE Russell đưa cổ phiếu Việt Nam vào chỉ số theo bốn đợt từ tháng 9/2026 đến tháng 9/2027 (FTSE Russell, 2026b); HOSE dự kiến công bố phân loại cổ phiếu vào Bảng Chính và Bảng Tiêu chuẩn lần đầu ngày 28/12/2026, theo dự thảo quy chế đang lấy ý kiến (Tuổi Trẻ Online, 2026a); và VN-</w:t>
+        <w:t xml:space="preserve">Thứ hai, nhóm đối chứng không chịu tác động của sự kiện. Nhóm đối chứng HOSE chịu ba thay đổi trùng thời gian: FTSE Russell đưa cổ phiếu Việt Nam vào chỉ số theo bốn đợt từ tháng 9/2026 đến tháng 9/2027 (FTSE Russell, 2026b); HOSE dự kiến công bố phân loại cổ phiếu vào Bảng Chính và Bảng Tiêu chuẩn lần đầu ngày 28/12/2026, theo dự thảo quy chế đang lấy ý kiến (Tuổi Trẻ Online, 2026a); và VN-Index, vốn tự động cập nhật danh mục sau ngày giao dịch đầu tiên của cổ phiếu niêm yết mới (Sở Giao dịch Chứng khoán Thành phố Hồ Chí Minh, 2026), nhiều khả năng nhận các mã chuyển sàn từ phiên thứ hai trên HOSE. Ngày vào chỉ số thực tế của </w:t>
       </w:r>
       <w:r>
         <w:lastRenderedPageBreak/>
-        <w:t>Index, vốn tự động cập nhật danh mục sau ngày giao dịch đầu tiên của cổ phiếu niêm yết mới (Sở Giao dịch Chứng khoán Thành phố Hồ Chí Minh, 2026), nhiều khả năng nhận các mã chuyển sàn từ phiên thứ hai trên HOSE. Ngày vào chỉ số thực tế của từng mã và quy chế phân bảng chính thức, khi được ban hành, được ghi lại từ công bố của HOSE và đưa vào ước lượng.</w:t>
+        <w:t>từng mã và quy chế phân bảng chính thức, khi được ban hành, được ghi lại từ công bố của HOSE và đưa vào ước lượng.</w:t>
       </w:r>
     </w:p>
     <w:p>
@@ -10661,13 +10472,13 @@
       <w:pPr>
         <w:pStyle w:val="Heading3"/>
       </w:pPr>
-      <w:bookmarkStart w:id="26" w:name="_Toc243136583"/>
-      <w:bookmarkStart w:id="27" w:name="quy-trình-nghiên-cứu"/>
-      <w:bookmarkEnd w:id="25"/>
+      <w:bookmarkStart w:id="27" w:name="_Toc243136583"/>
+      <w:bookmarkStart w:id="28" w:name="quy-trình-nghiên-cứu"/>
+      <w:bookmarkEnd w:id="26"/>
       <w:r>
         <w:t>4.3.9. Quy trình nghiên cứu</w:t>
       </w:r>
-      <w:bookmarkEnd w:id="26"/>
+      <w:bookmarkEnd w:id="27"/>
     </w:p>
     <w:p>
       <w:pPr>
@@ -10692,41 +10503,38 @@
         <w:t>1</w:t>
       </w:r>
       <w:r>
-        <w:t xml:space="preserve"> trên dữ liệu bảng quốc tế; ước lượng tác động của sự kiện chuyển sàn lên thanh khoản </w:t>
-      </w:r>
-      <w:r>
+        <w:t xml:space="preserve"> trên dữ liệu bảng quốc tế; ước lượng tác động của sự kiện chuyển sàn lên thanh khoản (H</w:t>
+      </w:r>
+      <w:r>
+        <w:rPr>
+          <w:vertAlign w:val="subscript"/>
+        </w:rPr>
+        <w:t>3</w:t>
+      </w:r>
+      <w:r>
+        <w:t>) và khả năng đầu tư (H</w:t>
+      </w:r>
+      <w:r>
+        <w:rPr>
+          <w:vertAlign w:val="subscript"/>
+        </w:rPr>
+        <w:t>4</w:t>
+      </w:r>
+      <w:r>
+        <w:t>); tổng hợp định hướng chuyên môn hóa cho thị trường vốn Hà Nội. Thí sinh đăng ký trước kế hoạch phân tích trước ngày 28/12/2026.</w:t>
+      </w:r>
+    </w:p>
+    <w:p>
+      <w:pPr>
+        <w:pStyle w:val="FigureBox"/>
+      </w:pPr>
+      <w:r>
+        <w:rPr>
+          <w:noProof/>
+        </w:rPr>
         <w:lastRenderedPageBreak/>
-        <w:t>(H</w:t>
-      </w:r>
-      <w:r>
-        <w:rPr>
-          <w:vertAlign w:val="subscript"/>
-        </w:rPr>
-        <w:t>3</w:t>
-      </w:r>
-      <w:r>
-        <w:t>) và khả năng đầu tư (H</w:t>
-      </w:r>
-      <w:r>
-        <w:rPr>
-          <w:vertAlign w:val="subscript"/>
-        </w:rPr>
-        <w:t>4</w:t>
-      </w:r>
-      <w:r>
-        <w:t>); tổng hợp định hướng chuyên môn hóa cho thị trường vốn Hà Nội. Thí sinh đăng ký trước kế hoạch phân tích trước ngày 28/12/2026.</w:t>
-      </w:r>
-    </w:p>
-    <w:p>
-      <w:pPr>
-        <w:pStyle w:val="FigureBox"/>
-      </w:pPr>
-      <w:r>
-        <w:rPr>
-          <w:noProof/>
-        </w:rPr>
         <w:drawing>
-          <wp:inline distT="0" distB="0" distL="0" distR="0" wp14:anchorId="0A2AD25B" wp14:editId="1CA3DE65">
+          <wp:inline distT="0" distB="0" distL="0" distR="0" wp14:anchorId="0A2AD25B" wp14:editId="182FB11C">
             <wp:extent cx="5544000" cy="3600000"/>
             <wp:effectExtent l="12700" t="0" r="6350" b="6985"/>
             <wp:docPr id="503" name="Hình 3. Quy trình (SmartArt)"/>
@@ -10744,11 +10552,11 @@
       <w:pPr>
         <w:pStyle w:val="Heading4"/>
       </w:pPr>
-      <w:bookmarkStart w:id="28" w:name="_Toc242353165"/>
+      <w:bookmarkStart w:id="29" w:name="_Toc243171422"/>
       <w:r>
         <w:t>Quy trình nghiên cứu</w:t>
       </w:r>
-      <w:bookmarkEnd w:id="28"/>
+      <w:bookmarkEnd w:id="29"/>
     </w:p>
     <w:p>
       <w:pPr>
@@ -10770,13 +10578,13 @@
       <w:pPr>
         <w:pStyle w:val="Heading3"/>
       </w:pPr>
-      <w:bookmarkStart w:id="29" w:name="_Toc243136584"/>
-      <w:bookmarkStart w:id="30" w:name="X81817220d6d5bbf0df11c749e7dd390a45a905f"/>
-      <w:bookmarkEnd w:id="27"/>
+      <w:bookmarkStart w:id="30" w:name="_Toc243136584"/>
+      <w:bookmarkStart w:id="31" w:name="X81817220d6d5bbf0df11c749e7dd390a45a905f"/>
+      <w:bookmarkEnd w:id="28"/>
       <w:r>
         <w:t>4.3.10. Độ tin cậy, giới hạn và khả năng thực hiện</w:t>
       </w:r>
-      <w:bookmarkEnd w:id="29"/>
+      <w:bookmarkEnd w:id="30"/>
     </w:p>
     <w:p>
       <w:pPr>
@@ -10816,133 +10624,139 @@
         <w:pStyle w:val="FirstParagraph"/>
       </w:pPr>
       <w:r>
+        <w:t>H</w:t>
+      </w:r>
+      <w:r>
+        <w:rPr>
+          <w:vertAlign w:val="subscript"/>
+        </w:rPr>
+        <w:t>4</w:t>
+      </w:r>
+      <w:r>
+        <w:t xml:space="preserve"> có ít cửa sổ nên chỉ được báo cáo ở dạng ước lượng, và so sánh theo hai giai đoạn căng thẳng chỉ ở dạng mô tả. Giá trị p đưa vào thủ tục Holm (1979) ở mức 5% </w:t>
+      </w:r>
+      <w:r>
         <w:lastRenderedPageBreak/>
-        <w:t>H</w:t>
+        <w:t>là giá trị p một phía: phân cụm theo quốc gia cho H</w:t>
       </w:r>
       <w:r>
         <w:rPr>
           <w:vertAlign w:val="subscript"/>
         </w:rPr>
-        <w:t>4</w:t>
-      </w:r>
-      <w:r>
-        <w:t xml:space="preserve"> có ít cửa sổ nên chỉ được báo cáo ở dạng ước lượng, và so sánh theo hai giai đoạn căng thẳng chỉ ở dạng mô tả. Giá trị p đưa vào thủ tục Holm (1979) ở mức 5% là giá trị p một phía: phân cụm theo quốc gia cho H</w:t>
+        <w:t>1</w:t>
+      </w:r>
+      <w:r>
+        <w:t>, bootstrap khối dừng cho H</w:t>
       </w:r>
       <w:r>
         <w:rPr>
           <w:vertAlign w:val="subscript"/>
         </w:rPr>
+        <w:t>2</w:t>
+      </w:r>
+      <w:r>
+        <w:t xml:space="preserve"> và bootstrap tự hồi quy cho H</w:t>
+      </w:r>
+      <w:r>
+        <w:rPr>
+          <w:vertAlign w:val="subscript"/>
+        </w:rPr>
+        <w:t>3</w:t>
+      </w:r>
+      <w:r>
+        <w:t>.</w:t>
+      </w:r>
+    </w:p>
+    <w:p>
+      <w:pPr>
+        <w:pStyle w:val="FirstParagraph"/>
+      </w:pPr>
+      <w:r>
+        <w:t>Ở H</w:t>
+      </w:r>
+      <w:r>
+        <w:rPr>
+          <w:vertAlign w:val="subscript"/>
+        </w:rPr>
         <w:t>1</w:t>
       </w:r>
       <w:r>
-        <w:t>, bootstrap khối dừng cho H</w:t>
+        <w:t>, đề tài kiểm tra độ vững trên mẫu các trung tâm có ít nhất năm kỳ và trên mẫu cân bằng. Vì kỳ GFCI 40 đã có nhân tố trùng với SMD (Wardle &amp; Mainelli, 2026), H</w:t>
       </w:r>
       <w:r>
         <w:rPr>
           <w:vertAlign w:val="subscript"/>
         </w:rPr>
-        <w:t>2</w:t>
-      </w:r>
-      <w:r>
-        <w:t xml:space="preserve"> và bootstrap tự hồi quy cho H</w:t>
+        <w:t>1</w:t>
+      </w:r>
+      <w:r>
+        <w:t xml:space="preserve"> được ước lượng lại trên các kỳ không trùng lặp nếu đủ số kỳ.</w:t>
+      </w:r>
+    </w:p>
+    <w:p>
+      <w:pPr>
+        <w:pStyle w:val="FirstParagraph"/>
+      </w:pPr>
+      <w:r>
+        <w:t>Nếu dữ liệu không ủng hộ giả thuyết, đề tài vẫn trả lời được câu hỏi nghiên cứu bằng kích thước hiệu ứng và khoảng tin cậy; khi khoảng tin cậy chứa cả 0 lẫn những tác động lớn hơn hiệu ứng nhỏ nhất phát hiện được, kết quả được gọi là chưa đủ cơ sở kết luận, không phải bằng chứng về việc không có tác động.</w:t>
+      </w:r>
+    </w:p>
+    <w:p>
+      <w:pPr>
+        <w:pStyle w:val="BodyText"/>
+      </w:pPr>
+      <w:r>
+        <w:t>Kế hoạch có năm phương án dự phòng. Nếu không số hóa được hoặc không được phép dùng điểm GFCI theo kỳ, câu hỏi 1 được trả lời ở dạng mô tả và H</w:t>
       </w:r>
       <w:r>
         <w:rPr>
           <w:vertAlign w:val="subscript"/>
         </w:rPr>
-        <w:t>3</w:t>
-      </w:r>
-      <w:r>
-        <w:t>.</w:t>
-      </w:r>
+        <w:t>1</w:t>
+      </w:r>
+      <w:r>
+        <w:t xml:space="preserve"> không được kiểm định. Nếu việc chuyển sàn bị lùi hoặc thực hiện theo nhiều đợt, đề tài dùng ngày thực tế của từng nhóm và bộ ước lượng khác biệt kép cho xử lý so le (Callaway &amp; Sant’Anna, 2021); nếu sự kiện không diễn ra, đề tài trả lời câu hỏi 3 bằng các mã đã tự chuyển từ HNX sang HOSE trước năm 2026.</w:t>
+      </w:r>
+    </w:p>
+    <w:p>
+      <w:pPr>
+        <w:pStyle w:val="BodyText"/>
+      </w:pPr>
+      <w:r>
+        <w:t>Thông báo của VNX chỉ áp dụng cho cổ phiếu niêm yết, nên đợt chuyển ngày 28/12/2026 không gồm UPCoM (Báo Đầu tư Chứng khoán, 2026; Sở Giao dịch Chứng khoán Việt Nam, 2026), nhưng hạn chuyển cổ phiếu UPCoM sang HOSE vẫn là hết ngày 31/12/2026 (Bộ Tài chính, 2023), nên UPCoM có thể chuyển sàn theo một đợt riêng trước hết ngày 31/12/2026, tức trước cửa sổ sau, hoặc trong cửa sổ sau nếu mốc này được lùi. Khi đó, nhóm đối chứng UPCoM và chỉ số của UPCoM chỉ được dùng đến tháng liền trước ngày chuyển, ước lượng chính dựa vào nhóm đối chứng HOSE, và tương tác theo biên độ dùng thước đo thay thế ở mục 4.3.7.</w:t>
+      </w:r>
+    </w:p>
+    <w:p>
+      <w:pPr>
+        <w:pStyle w:val="BodyText"/>
+      </w:pPr>
+      <w:r>
+        <w:t>Nếu cả hai nhóm đối chứng không đạt kiểm tra xu hướng song song, đề tài dùng nhóm đối chứng tổng hợp từ các mã HOSE ngoài danh sách FTSE Russell và mã UPCoM. Nếu dữ liệu sau sự kiện ngắn hơn 24 tháng hoặc rổ CS có ít hơn 30 cổ phiếu đủ thanh khoản, đề tài dùng, tương ứng, toàn bộ tháng có sẵn hoặc rổ 20 cổ phiếu.</w:t>
+      </w:r>
+    </w:p>
+    <w:p>
+      <w:pPr>
+        <w:pStyle w:val="Heading2"/>
+      </w:pPr>
+      <w:bookmarkStart w:id="32" w:name="_Toc243136585"/>
+      <w:bookmarkStart w:id="33" w:name="đối-tượng-và-phạm-vi-nghiên-cứu"/>
+      <w:bookmarkEnd w:id="8"/>
+      <w:bookmarkEnd w:id="31"/>
+      <w:r>
+        <w:t>4.4. Đối tượng và phạm vi nghiên cứu</w:t>
+      </w:r>
+      <w:bookmarkEnd w:id="32"/>
     </w:p>
     <w:p>
       <w:pPr>
         <w:pStyle w:val="FirstParagraph"/>
       </w:pPr>
       <w:r>
-        <w:t>Ở H</w:t>
-      </w:r>
-      <w:r>
-        <w:rPr>
-          <w:vertAlign w:val="subscript"/>
-        </w:rPr>
-        <w:t>1</w:t>
-      </w:r>
-      <w:r>
-        <w:t>, đề tài kiểm tra độ vững trên mẫu các trung tâm có ít nhất năm kỳ và trên mẫu cân bằng. Vì kỳ GFCI 40 đã có nhân tố trùng với SMD (Wardle &amp; Mainelli, 2026), H</w:t>
-      </w:r>
-      <w:r>
-        <w:rPr>
-          <w:vertAlign w:val="subscript"/>
-        </w:rPr>
-        <w:t>1</w:t>
-      </w:r>
-      <w:r>
-        <w:t xml:space="preserve"> được ước lượng lại trên các kỳ không trùng lặp nếu đủ số kỳ.</w:t>
-      </w:r>
-    </w:p>
-    <w:p>
-      <w:pPr>
-        <w:pStyle w:val="FirstParagraph"/>
-      </w:pPr>
-      <w:r>
-        <w:t>Nếu dữ liệu không ủng hộ giả thuyết, đề tài vẫn trả lời được câu hỏi nghiên cứu bằng kích thước hiệu ứng và khoảng tin cậy; khi khoảng tin cậy chứa cả 0 lẫn những tác động lớn hơn hiệu ứng nhỏ nhất phát hiện được, kết quả được gọi là chưa đủ cơ sở kết luận, không phải bằng chứng về việc không có tác động.</w:t>
-      </w:r>
-    </w:p>
-    <w:p>
-      <w:pPr>
-        <w:pStyle w:val="BodyText"/>
-      </w:pPr>
-      <w:r>
-        <w:t>Kế hoạch có năm phương án dự phòng. Nếu không số hóa được hoặc không được phép dùng điểm GFCI theo kỳ, câu hỏi 1 được trả lời ở dạng mô tả và H</w:t>
-      </w:r>
-      <w:r>
-        <w:rPr>
-          <w:vertAlign w:val="subscript"/>
-        </w:rPr>
-        <w:t>1</w:t>
-      </w:r>
-      <w:r>
-        <w:t xml:space="preserve"> không được kiểm định. Nếu việc chuyển sàn bị lùi hoặc thực hiện theo nhiều đợt, đề tài dùng ngày thực tế của từng nhóm và bộ ước lượng khác biệt kép cho xử lý so le (Callaway &amp; Sant’Anna, 2021); nếu sự kiện không diễn ra, đề tài trả lời câu hỏi 3 bằng các mã đã tự chuyển từ HNX sang HOSE trước năm 2026.</w:t>
-      </w:r>
-    </w:p>
-    <w:p>
-      <w:pPr>
-        <w:pStyle w:val="BodyText"/>
-      </w:pPr>
-      <w:r>
-        <w:t>Thông báo của VNX chỉ áp dụng cho cổ phiếu niêm yết, nên đợt chuyển ngày 28/12/2026 không gồm UPCoM (Báo Đầu tư Chứng khoán, 2026; Sở Giao dịch Chứng khoán Việt Nam, 2026), nhưng hạn chuyển cổ phiếu UPCoM sang HOSE vẫn là hết ngày 31/12/2026 (Bộ Tài chính, 2023), nên UPCoM có thể chuyển sàn theo một đợt riêng trước hết ngày 31/12/2026, tức trước cửa sổ sau, hoặc trong cửa sổ sau nếu mốc này được lùi. Khi đó, nhóm đối chứng UPCoM và chỉ số của UPCoM chỉ được dùng đến tháng liền trước ngày chuyển, ước lượng chính dựa vào nhóm đối chứng HOSE, và tương tác theo biên độ dùng thước đo thay thế ở mục 4.3.7.</w:t>
-      </w:r>
-    </w:p>
-    <w:p>
-      <w:pPr>
-        <w:pStyle w:val="BodyText"/>
-      </w:pPr>
-      <w:r>
-        <w:t>Nếu cả hai nhóm đối chứng không đạt kiểm tra xu hướng song song, đề tài dùng nhóm đối chứng tổng hợp từ các mã HOSE ngoài danh sách FTSE Russell và mã UPCoM. Nếu dữ liệu sau sự kiện ngắn hơn 24 tháng hoặc rổ CS có ít hơn 30 cổ phiếu đủ thanh khoản, đề tài dùng, tương ứng, toàn bộ tháng có sẵn hoặc rổ 20 cổ phiếu.</w:t>
-      </w:r>
-    </w:p>
-    <w:p>
-      <w:pPr>
-        <w:pStyle w:val="Heading2"/>
-      </w:pPr>
-      <w:bookmarkStart w:id="31" w:name="_Toc243136585"/>
-      <w:bookmarkStart w:id="32" w:name="đối-tượng-và-phạm-vi-nghiên-cứu"/>
-      <w:bookmarkEnd w:id="8"/>
-      <w:bookmarkEnd w:id="30"/>
+        <w:t xml:space="preserve">Đối tượng nghiên cứu là khác biệt chất lượng thị trường giữa các sàn và tác động của việc đổi sàn lên thanh khoản và khả năng đầu tư, quan sát qua đợt hợp nhất </w:t>
+      </w:r>
       <w:r>
         <w:lastRenderedPageBreak/>
-        <w:t>4.4. Đối tượng và phạm vi nghiên cứu</w:t>
-      </w:r>
-      <w:bookmarkEnd w:id="31"/>
-    </w:p>
-    <w:p>
-      <w:pPr>
-        <w:pStyle w:val="FirstParagraph"/>
-      </w:pPr>
-      <w:r>
-        <w:t>Đối tượng nghiên cứu là khác biệt chất lượng thị trường giữa các sàn và tác động của việc đổi sàn lên thanh khoản và khả năng đầu tư, quan sát qua đợt hợp nhất cổ phiếu niêm yết của HNX vào HOSE, đặt trong khung năng lực cạnh tranh của trung tâm tài chính.</w:t>
+        <w:t>cổ phiếu niêm yết của HNX vào HOSE, đặt trong khung năng lực cạnh tranh của trung tâm tài chính.</w:t>
       </w:r>
     </w:p>
     <w:p>
@@ -11036,35 +10850,35 @@
       <w:pPr>
         <w:pStyle w:val="Heading2"/>
       </w:pPr>
-      <w:bookmarkStart w:id="33" w:name="_Toc243136586"/>
-      <w:bookmarkStart w:id="34" w:name="Xccd2dd38cec6218b5ae5c9b5b16db1f940f2d5f"/>
-      <w:bookmarkEnd w:id="32"/>
+      <w:bookmarkStart w:id="34" w:name="_Toc243136586"/>
+      <w:bookmarkStart w:id="35" w:name="Xccd2dd38cec6218b5ae5c9b5b16db1f940f2d5f"/>
+      <w:bookmarkEnd w:id="33"/>
+      <w:r>
+        <w:t>4.5. Dự kiến bố cục các chương</w:t>
+      </w:r>
+      <w:bookmarkEnd w:id="34"/>
+      <w:r>
+        <w:t xml:space="preserve"> </w:t>
+      </w:r>
+    </w:p>
+    <w:p>
+      <w:pPr>
+        <w:pStyle w:val="FirstParagraph"/>
+      </w:pPr>
+      <w:r>
+        <w:t>Ngoài phần kết luận, danh mục tài liệu tham khảo và phụ lục, luận án dự kiến gồm sáu chương (Bảng 4).</w:t>
+      </w:r>
+    </w:p>
+    <w:p>
+      <w:pPr>
+        <w:pStyle w:val="Heading5"/>
+      </w:pPr>
+      <w:bookmarkStart w:id="36" w:name="_Toc242353159"/>
       <w:r>
         <w:lastRenderedPageBreak/>
-        <w:t>4.5. Dự kiến bố cục các chương</w:t>
-      </w:r>
-      <w:bookmarkEnd w:id="33"/>
-      <w:r>
-        <w:t xml:space="preserve"> </w:t>
-      </w:r>
-    </w:p>
-    <w:p>
-      <w:pPr>
-        <w:pStyle w:val="FirstParagraph"/>
-      </w:pPr>
-      <w:r>
-        <w:t>Ngoài phần kết luận, danh mục tài liệu tham khảo và phụ lục, luận án dự kiến gồm sáu chương (Bảng 4).</w:t>
-      </w:r>
-    </w:p>
-    <w:p>
-      <w:pPr>
-        <w:pStyle w:val="Heading5"/>
-      </w:pPr>
-      <w:bookmarkStart w:id="35" w:name="_Toc242353159"/>
-      <w:r>
         <w:t>Dự kiến bố cục các chương và tiểu mục của luận án</w:t>
       </w:r>
-      <w:bookmarkEnd w:id="35"/>
+      <w:bookmarkEnd w:id="36"/>
     </w:p>
     <w:tbl>
       <w:tblPr>
@@ -11844,7 +11658,6 @@
                 <w:sz w:val="26"/>
                 <w:szCs w:val="26"/>
               </w:rPr>
-              <w:lastRenderedPageBreak/>
               <w:t>Chương 4</w:t>
             </w:r>
           </w:p>
@@ -11919,7 +11732,15 @@
                 <w:szCs w:val="26"/>
               </w:rPr>
               <w:br/>
-              <w:t>4.1.4 Thảo luận về tác động của hợp nhất sàn</w:t>
+              <w:t xml:space="preserve">4.1.4 Thảo luận về tác động của hợp nhất </w:t>
+            </w:r>
+            <w:r>
+              <w:rPr>
+                <w:sz w:val="26"/>
+                <w:szCs w:val="26"/>
+              </w:rPr>
+              <w:lastRenderedPageBreak/>
+              <w:t>sàn</w:t>
             </w:r>
             <w:r>
               <w:rPr>
@@ -11966,6 +11787,7 @@
                 <w:sz w:val="26"/>
                 <w:szCs w:val="26"/>
               </w:rPr>
+              <w:lastRenderedPageBreak/>
               <w:t>Kết luận</w:t>
             </w:r>
           </w:p>
@@ -12071,14 +11893,14 @@
       <w:pPr>
         <w:pStyle w:val="Heading1"/>
       </w:pPr>
-      <w:bookmarkStart w:id="36" w:name="_Toc243136587"/>
-      <w:bookmarkStart w:id="37" w:name="lý-do-chọn-cơ-sở-nghiên-cứu"/>
+      <w:bookmarkStart w:id="37" w:name="_Toc243136587"/>
+      <w:bookmarkStart w:id="38" w:name="lý-do-chọn-cơ-sở-nghiên-cứu"/>
       <w:bookmarkEnd w:id="1"/>
-      <w:bookmarkEnd w:id="34"/>
+      <w:bookmarkEnd w:id="35"/>
       <w:r>
         <w:t>5. Lý do chọn cơ sở nghiên cứu</w:t>
       </w:r>
-      <w:bookmarkEnd w:id="36"/>
+      <w:bookmarkEnd w:id="37"/>
     </w:p>
     <w:p>
       <w:pPr>
@@ -12108,56 +11930,56 @@
       <w:pPr>
         <w:pStyle w:val="Heading1"/>
       </w:pPr>
-      <w:bookmarkStart w:id="38" w:name="_Toc243136588"/>
-      <w:bookmarkStart w:id="39" w:name="Xf8e4ba5ea21963918e9abed853de8bb88860e44"/>
-      <w:bookmarkEnd w:id="37"/>
+      <w:bookmarkStart w:id="39" w:name="_Toc243136588"/>
+      <w:bookmarkStart w:id="40" w:name="Xf8e4ba5ea21963918e9abed853de8bb88860e44"/>
+      <w:bookmarkEnd w:id="38"/>
       <w:r>
         <w:t>6. Mục tiêu và mong muốn đạt được khi đăng ký đi học nghiên cứu sinh</w:t>
       </w:r>
-      <w:bookmarkEnd w:id="38"/>
+      <w:bookmarkEnd w:id="39"/>
     </w:p>
     <w:p>
       <w:pPr>
         <w:pStyle w:val="FirstParagraph"/>
       </w:pPr>
       <w:r>
-        <w:t xml:space="preserve">Mục tiêu đầu tiên của thí sinh là đạt năng lực nghiên cứu độc lập ở trình độ tiến sĩ trong tài chính định lượng: thiết kế một nghiên cứu thực nghiệm có đăng ký trước, ước lượng tác động của một sự kiện duy nhất với suy luận phù hợp, và báo cáo trung thực cả những kết quả chưa đủ cơ sở kết luận. Thí sinh muốn rèn các kỹ năng này </w:t>
+        <w:t>Mục tiêu đầu tiên của thí sinh là đạt năng lực nghiên cứu độc lập ở trình độ tiến sĩ trong tài chính định lượng: thiết kế một nghiên cứu thực nghiệm có đăng ký trước, ước lượng tác động của một sự kiện duy nhất với suy luận phù hợp, và báo cáo trung thực cả những kết quả chưa đủ cơ sở kết luận. Thí sinh muốn rèn các kỹ năng này trong một môi trường có học phần phương pháp, hội thảo định kỳ và cơ chế phản biện nội bộ.</w:t>
+      </w:r>
+    </w:p>
+    <w:p>
+      <w:pPr>
+        <w:pStyle w:val="BodyText"/>
+      </w:pPr>
+      <w:r>
+        <w:t xml:space="preserve">Mục tiêu thứ hai là tạo ra bằng chứng có ích cho hai nhóm người dùng: nhà nghiên cứu về trung tâm tài chính và cấu trúc thị trường; và Ủy ban nhân dân thành phố Hà Nội, cơ quan quản lý thị trường chứng khoán, HNX và các tổ chức đầu tư. </w:t>
       </w:r>
       <w:r>
         <w:lastRenderedPageBreak/>
-        <w:t>trong một môi trường có học phần phương pháp, hội thảo định kỳ và cơ chế phản biện nội bộ.</w:t>
-      </w:r>
-    </w:p>
-    <w:p>
-      <w:pPr>
-        <w:pStyle w:val="BodyText"/>
-      </w:pPr>
-      <w:r>
-        <w:t>Mục tiêu thứ hai là tạo ra bằng chứng có ích cho hai nhóm người dùng: nhà nghiên cứu về trung tâm tài chính và cấu trúc thị trường; và Ủy ban nhân dân thành phố Hà Nội, cơ quan quản lý thị trường chứng khoán, HNX và các tổ chức đầu tư. Thí sinh mong kết quả của luận án là một đóng góp nhỏ, có kiểm chứng, cho câu hỏi số 1 và số 3 của bài toán số 19 (mục 4.1), đúng vào thời điểm thị trường vốn Hà Nội thay đổi cấu trúc.</w:t>
+        <w:t>Thí sinh mong kết quả của luận án là một đóng góp nhỏ, có kiểm chứng, cho câu hỏi số 1 và số 3 của bài toán số 19 (mục 4.1), đúng vào thời điểm thị trường vốn Hà Nội thay đổi cấu trúc.</w:t>
       </w:r>
     </w:p>
     <w:p>
       <w:pPr>
         <w:pStyle w:val="Heading1"/>
       </w:pPr>
-      <w:bookmarkStart w:id="40" w:name="_Toc243136589"/>
-      <w:bookmarkStart w:id="41" w:name="X2296e1b9065b4769961ad6755f87c66660af063"/>
-      <w:bookmarkEnd w:id="39"/>
+      <w:bookmarkStart w:id="41" w:name="_Toc243136589"/>
+      <w:bookmarkStart w:id="42" w:name="X2296e1b9065b4769961ad6755f87c66660af063"/>
+      <w:bookmarkEnd w:id="40"/>
       <w:r>
         <w:t>7. Những dự định và kế hoạch để đạt được những mục tiêu mong muốn</w:t>
       </w:r>
-      <w:bookmarkEnd w:id="40"/>
+      <w:bookmarkEnd w:id="41"/>
     </w:p>
     <w:p>
       <w:pPr>
         <w:pStyle w:val="Heading2"/>
       </w:pPr>
-      <w:bookmarkStart w:id="42" w:name="_Toc243136590"/>
-      <w:bookmarkStart w:id="43" w:name="học-phần-đào-tạo-trình-độ-tiến-sĩ"/>
+      <w:bookmarkStart w:id="43" w:name="_Toc243136590"/>
+      <w:bookmarkStart w:id="44" w:name="học-phần-đào-tạo-trình-độ-tiến-sĩ"/>
       <w:r>
         <w:t>7.1. Học phần đào tạo trình độ tiến sĩ</w:t>
       </w:r>
-      <w:bookmarkEnd w:id="42"/>
+      <w:bookmarkEnd w:id="43"/>
     </w:p>
     <w:p>
       <w:pPr>
@@ -12171,13 +11993,13 @@
       <w:pPr>
         <w:pStyle w:val="Heading2"/>
       </w:pPr>
-      <w:bookmarkStart w:id="44" w:name="_Toc243136591"/>
-      <w:bookmarkStart w:id="45" w:name="chuyên-đề-tiến-sĩ"/>
-      <w:bookmarkEnd w:id="43"/>
+      <w:bookmarkStart w:id="45" w:name="_Toc243136591"/>
+      <w:bookmarkStart w:id="46" w:name="chuyên-đề-tiến-sĩ"/>
+      <w:bookmarkEnd w:id="44"/>
       <w:r>
         <w:t>7.2. Chuyên đề tiến sĩ</w:t>
       </w:r>
-      <w:bookmarkEnd w:id="44"/>
+      <w:bookmarkEnd w:id="45"/>
     </w:p>
     <w:p>
       <w:pPr>
@@ -12191,13 +12013,13 @@
       <w:pPr>
         <w:pStyle w:val="Heading2"/>
       </w:pPr>
-      <w:bookmarkStart w:id="46" w:name="_Toc243136592"/>
-      <w:bookmarkStart w:id="47" w:name="phần-nghiên-cứu-khoa-học"/>
-      <w:bookmarkEnd w:id="45"/>
+      <w:bookmarkStart w:id="47" w:name="_Toc243136592"/>
+      <w:bookmarkStart w:id="48" w:name="phần-nghiên-cứu-khoa-học"/>
+      <w:bookmarkEnd w:id="46"/>
       <w:r>
         <w:t>7.3. Phần nghiên cứu khoa học</w:t>
       </w:r>
-      <w:bookmarkEnd w:id="46"/>
+      <w:bookmarkEnd w:id="47"/>
     </w:p>
     <w:p>
       <w:pPr>
@@ -12247,32 +12069,32 @@
       <w:pPr>
         <w:pStyle w:val="Heading2"/>
       </w:pPr>
-      <w:bookmarkStart w:id="48" w:name="_Toc243136593"/>
-      <w:bookmarkStart w:id="49" w:name="phần-thực-hiện-luận-án"/>
-      <w:bookmarkEnd w:id="47"/>
+      <w:bookmarkStart w:id="49" w:name="_Toc243136593"/>
+      <w:bookmarkStart w:id="50" w:name="phần-thực-hiện-luận-án"/>
+      <w:bookmarkEnd w:id="48"/>
+      <w:r>
+        <w:t>7.4. Phần thực hiện luận án</w:t>
+      </w:r>
+      <w:bookmarkEnd w:id="49"/>
+    </w:p>
+    <w:p>
+      <w:pPr>
+        <w:pStyle w:val="FirstParagraph"/>
+      </w:pPr>
+      <w:r>
+        <w:t>Thời gian đào tạo đối với người có bằng đại học là bốn năm, theo hình thức tập trung toàn thời gian; thời gian này không vượt quá 48 tháng, là thời gian hỗ trợ tối đa theo Điều 13 Nghị quyết số 57/2026/NQ-HĐND (Hội đồng nhân dân thành phố Hà Nội, 2026). Bảng 5 nêu kế hoạch và sản phẩm dự kiến của từng năm.</w:t>
+      </w:r>
+    </w:p>
+    <w:p>
+      <w:pPr>
+        <w:pStyle w:val="Heading5"/>
+      </w:pPr>
+      <w:bookmarkStart w:id="51" w:name="_Toc242353160"/>
       <w:r>
         <w:lastRenderedPageBreak/>
-        <w:t>7.4. Phần thực hiện luận án</w:t>
-      </w:r>
-      <w:bookmarkEnd w:id="48"/>
-    </w:p>
-    <w:p>
-      <w:pPr>
-        <w:pStyle w:val="FirstParagraph"/>
-      </w:pPr>
-      <w:r>
-        <w:t>Thời gian đào tạo đối với người có bằng đại học là bốn năm, theo hình thức tập trung toàn thời gian; thời gian này không vượt quá 48 tháng, là thời gian hỗ trợ tối đa theo Điều 13 Nghị quyết số 57/2026/NQ-HĐND (Hội đồng nhân dân thành phố Hà Nội, 2026). Bảng 5 nêu kế hoạch và sản phẩm dự kiến của từng năm.</w:t>
-      </w:r>
-    </w:p>
-    <w:p>
-      <w:pPr>
-        <w:pStyle w:val="Heading5"/>
-      </w:pPr>
-      <w:bookmarkStart w:id="50" w:name="_Toc242353160"/>
-      <w:r>
         <w:t>Kế hoạch thực hiện luận án theo bốn năm và sản phẩm dự kiến</w:t>
       </w:r>
-      <w:bookmarkEnd w:id="50"/>
+      <w:bookmarkEnd w:id="51"/>
     </w:p>
     <w:tbl>
       <w:tblPr>
@@ -12780,47 +12602,47 @@
       <w:pPr>
         <w:pStyle w:val="Heading1"/>
       </w:pPr>
-      <w:bookmarkStart w:id="51" w:name="_Toc243136594"/>
-      <w:bookmarkStart w:id="52" w:name="Xb9bc081f51ffaef1c7bc0b2210c66ae0c3d0cd6"/>
-      <w:bookmarkEnd w:id="41"/>
-      <w:bookmarkEnd w:id="49"/>
+      <w:bookmarkStart w:id="52" w:name="_Toc243136594"/>
+      <w:bookmarkStart w:id="53" w:name="Xb9bc081f51ffaef1c7bc0b2210c66ae0c3d0cd6"/>
+      <w:bookmarkEnd w:id="42"/>
+      <w:bookmarkEnd w:id="50"/>
       <w:r>
         <w:t>8. Kiến thức chuyên môn của người dự tuyển tiến sĩ</w:t>
       </w:r>
-      <w:bookmarkEnd w:id="51"/>
+      <w:bookmarkEnd w:id="52"/>
     </w:p>
     <w:p>
       <w:pPr>
         <w:pStyle w:val="Heading2"/>
       </w:pPr>
-      <w:bookmarkStart w:id="53" w:name="_Toc243136595"/>
-      <w:bookmarkStart w:id="54" w:name="kinh-nghiệm-trong-hoạt-động-chuyên-môn"/>
+      <w:bookmarkStart w:id="54" w:name="_Toc243136595"/>
+      <w:bookmarkStart w:id="55" w:name="kinh-nghiệm-trong-hoạt-động-chuyên-môn"/>
       <w:r>
         <w:t>8.1. Kinh nghiệm trong hoạt động chuyên môn</w:t>
       </w:r>
-      <w:bookmarkEnd w:id="53"/>
+      <w:bookmarkEnd w:id="54"/>
     </w:p>
     <w:p>
       <w:pPr>
         <w:pStyle w:val="FirstParagraph"/>
       </w:pPr>
       <w:r>
-        <w:t xml:space="preserve">Kinh nghiệm chuyên môn của thí sinh chủ yếu là kinh nghiệm nghiên cứu. Thí sinh chủ nhiệm đề tài nghiên cứu khoa học sinh viên “Nâng cao hiệu quả danh mục </w:t>
+        <w:t xml:space="preserve">Kinh nghiệm chuyên môn của thí sinh chủ yếu là kinh nghiệm nghiên cứu. Thí sinh chủ nhiệm đề tài nghiên cứu khoa học sinh viên “Nâng cao hiệu quả danh mục đầu tư bằng mô hình Black-Litterman: Áp dụng cho ngành ngân hàng trên thị trường chứng khoán Việt Nam”, đạt Giải Nhất cấp Khoa và Giải Nhì cấp Học viện năm 2026; đề tài đang dự Giải thưởng Khoa học và Công nghệ dành cho sinh viên năm 2026 do Bộ Giáo dục và Đào tạo tổ chức. Thí sinh còn đạt Giải Nhì nghiên cứu khoa học sinh </w:t>
       </w:r>
       <w:r>
         <w:lastRenderedPageBreak/>
-        <w:t>đầu tư bằng mô hình Black-Litterman: Áp dụng cho ngành ngân hàng trên thị trường chứng khoán Việt Nam”, đạt Giải Nhất cấp Khoa và Giải Nhì cấp Học viện năm 2026; đề tài đang dự Giải thưởng Khoa học và Công nghệ dành cho sinh viên năm 2026 do Bộ Giáo dục và Đào tạo tổ chức. Thí sinh còn đạt Giải Nhì nghiên cứu khoa học sinh viên cấp Khoa năm 2025 và Giải Khuyến khích cuộc thi Data Explorer. Bảng 6 liệt kê các công trình đã công bố hoặc đã được chấp nhận đăng.</w:t>
+        <w:t>viên cấp Khoa năm 2025 và Giải Khuyến khích cuộc thi Data Explorer. Bảng 6 liệt kê các công trình đã công bố hoặc đã được chấp nhận đăng.</w:t>
       </w:r>
     </w:p>
     <w:p>
       <w:pPr>
         <w:pStyle w:val="Heading5"/>
       </w:pPr>
-      <w:bookmarkStart w:id="55" w:name="_Toc242353161"/>
+      <w:bookmarkStart w:id="56" w:name="_Toc242353161"/>
       <w:r>
         <w:t>Công trình đã công bố hoặc đã được chấp nhận đăng</w:t>
       </w:r>
-      <w:bookmarkEnd w:id="55"/>
+      <w:bookmarkEnd w:id="56"/>
     </w:p>
     <w:tbl>
       <w:tblPr>
@@ -13267,15 +13089,7 @@
                 <w:sz w:val="26"/>
                 <w:szCs w:val="26"/>
               </w:rPr>
-              <w:t>Đã được chấp nhận đăng, công bố trực tuyến trong mục Accepted Articles ngày 09/10/2026 (mã 19322; https://malque.pub/ojs/inde</w:t>
-            </w:r>
-            <w:r>
-              <w:rPr>
-                <w:sz w:val="26"/>
-                <w:szCs w:val="26"/>
-              </w:rPr>
-              <w:lastRenderedPageBreak/>
-              <w:t>x.php/msj/article/view/19322)</w:t>
+              <w:t>Đã được chấp nhận đăng, công bố trực tuyến trong mục Accepted Articles ngày 09/10/2026 (mã 19322; https://malque.pub/ojs/index.php/msj/article/view/19322)</w:t>
             </w:r>
           </w:p>
         </w:tc>
@@ -13310,11 +13124,11 @@
       <w:pPr>
         <w:pStyle w:val="Heading5"/>
       </w:pPr>
-      <w:bookmarkStart w:id="56" w:name="_Toc242353162"/>
+      <w:bookmarkStart w:id="57" w:name="_Toc242353162"/>
       <w:r>
         <w:t>Bản thảo đã gửi tạp chí, chưa công bố tại ngày 30/9/2026</w:t>
       </w:r>
-      <w:bookmarkEnd w:id="56"/>
+      <w:bookmarkEnd w:id="57"/>
     </w:p>
     <w:tbl>
       <w:tblPr>
@@ -14125,7 +13939,6 @@
                 <w:sz w:val="26"/>
                 <w:szCs w:val="26"/>
               </w:rPr>
-              <w:lastRenderedPageBreak/>
               <w:t>6</w:t>
             </w:r>
           </w:p>
@@ -14147,7 +13960,15 @@
                 <w:sz w:val="26"/>
                 <w:szCs w:val="26"/>
               </w:rPr>
-              <w:t>Who gains from a market upgrade? Stock liquidity and prices around Vietnam’s FTSE Russell reclassification</w:t>
+              <w:t xml:space="preserve">Who gains from a market upgrade? Stock liquidity and prices </w:t>
+            </w:r>
+            <w:r>
+              <w:rPr>
+                <w:sz w:val="26"/>
+                <w:szCs w:val="26"/>
+              </w:rPr>
+              <w:lastRenderedPageBreak/>
+              <w:t>around Vietnam’s FTSE Russell reclassification</w:t>
             </w:r>
           </w:p>
         </w:tc>
@@ -14168,6 +13989,7 @@
                 <w:sz w:val="26"/>
                 <w:szCs w:val="26"/>
               </w:rPr>
+              <w:lastRenderedPageBreak/>
               <w:t>4</w:t>
             </w:r>
           </w:p>
@@ -14210,7 +14032,15 @@
                 <w:sz w:val="26"/>
                 <w:szCs w:val="26"/>
               </w:rPr>
-              <w:t>Đang phản biện vòng 1 (mã FINR-D-26-00823)</w:t>
+              <w:t xml:space="preserve">Đang phản biện vòng 1 </w:t>
+            </w:r>
+            <w:r>
+              <w:rPr>
+                <w:sz w:val="26"/>
+                <w:szCs w:val="26"/>
+              </w:rPr>
+              <w:lastRenderedPageBreak/>
+              <w:t>(mã FINR-D-26-00823)</w:t>
             </w:r>
           </w:p>
         </w:tc>
@@ -14231,7 +14061,16 @@
                 <w:sz w:val="26"/>
                 <w:szCs w:val="26"/>
               </w:rPr>
-              <w:t>Có (thanh khoản thị trường)</w:t>
+              <w:lastRenderedPageBreak/>
+              <w:t xml:space="preserve">Có (thanh </w:t>
+            </w:r>
+            <w:r>
+              <w:rPr>
+                <w:sz w:val="26"/>
+                <w:szCs w:val="26"/>
+              </w:rPr>
+              <w:lastRenderedPageBreak/>
+              <w:t>khoản thị trường)</w:t>
             </w:r>
           </w:p>
         </w:tc>
@@ -14254,6 +14093,7 @@
                 <w:sz w:val="26"/>
                 <w:szCs w:val="26"/>
               </w:rPr>
+              <w:lastRenderedPageBreak/>
               <w:t>7</w:t>
             </w:r>
           </w:p>
@@ -14513,13 +14353,13 @@
       <w:pPr>
         <w:pStyle w:val="Heading2"/>
       </w:pPr>
-      <w:bookmarkStart w:id="57" w:name="_Toc243136596"/>
-      <w:bookmarkStart w:id="58" w:name="X2759434a63208bf1118b68a60cffdc0442b6887"/>
-      <w:bookmarkEnd w:id="54"/>
+      <w:bookmarkStart w:id="58" w:name="_Toc243136596"/>
+      <w:bookmarkStart w:id="59" w:name="X2759434a63208bf1118b68a60cffdc0442b6887"/>
+      <w:bookmarkEnd w:id="55"/>
       <w:r>
         <w:t>8.2. Kiến thức, sự hiểu biết và sự chuẩn bị của thí sinh về vấn đề nghiên cứu</w:t>
       </w:r>
-      <w:bookmarkEnd w:id="57"/>
+      <w:bookmarkEnd w:id="58"/>
     </w:p>
     <w:p>
       <w:pPr>
@@ -14558,8 +14398,11 @@
         <w:pStyle w:val="BodyText"/>
       </w:pPr>
       <w:r>
+        <w:t xml:space="preserve">Thí sinh chuẩn bị cho đề tài qua các công việc nghiên cứu đã làm. Bản thảo số 6 ở Bảng 7, về thanh khoản cổ phiếu quanh đợt nâng hạng thị trường của FTSE Russell, cho thí sinh kinh nghiệm với nghiên cứu sự kiện trên thanh khoản, công cụ </w:t>
+      </w:r>
+      <w:r>
         <w:lastRenderedPageBreak/>
-        <w:t>Thí sinh chuẩn bị cho đề tài qua các công việc nghiên cứu đã làm. Bản thảo số 6 ở Bảng 7, về thanh khoản cổ phiếu quanh đợt nâng hạng thị trường của FTSE Russell, cho thí sinh kinh nghiệm với nghiên cứu sự kiện trên thanh khoản, công cụ trực tiếp của H</w:t>
+        <w:t>trực tiếp của H</w:t>
       </w:r>
       <w:r>
         <w:rPr>
@@ -14584,14 +14427,14 @@
       <w:pPr>
         <w:pStyle w:val="Heading1"/>
       </w:pPr>
-      <w:bookmarkStart w:id="59" w:name="_Toc243136597"/>
-      <w:bookmarkStart w:id="60" w:name="X49f21f7d9d867661168a79b1a8d1b70fdbb6a4d"/>
-      <w:bookmarkEnd w:id="52"/>
-      <w:bookmarkEnd w:id="58"/>
+      <w:bookmarkStart w:id="60" w:name="_Toc243136597"/>
+      <w:bookmarkStart w:id="61" w:name="X49f21f7d9d867661168a79b1a8d1b70fdbb6a4d"/>
+      <w:bookmarkEnd w:id="53"/>
+      <w:bookmarkEnd w:id="59"/>
       <w:r>
         <w:t>9. Dự kiến việc làm và các hướng nghiên cứu sau khi tốt nghiệp</w:t>
       </w:r>
-      <w:bookmarkEnd w:id="59"/>
+      <w:bookmarkEnd w:id="60"/>
     </w:p>
     <w:p>
       <w:pPr>
@@ -14621,13 +14464,13 @@
       <w:pPr>
         <w:pStyle w:val="Heading1"/>
       </w:pPr>
-      <w:bookmarkStart w:id="61" w:name="_Toc243136598"/>
-      <w:bookmarkStart w:id="62" w:name="đề-xuất-người-hướng-dẫn"/>
-      <w:bookmarkEnd w:id="60"/>
+      <w:bookmarkStart w:id="62" w:name="_Toc243136598"/>
+      <w:bookmarkStart w:id="63" w:name="đề-xuất-người-hướng-dẫn"/>
+      <w:bookmarkEnd w:id="61"/>
       <w:r>
         <w:t>10. Đề xuất người hướng dẫn</w:t>
       </w:r>
-      <w:bookmarkEnd w:id="61"/>
+      <w:bookmarkEnd w:id="62"/>
     </w:p>
     <w:p>
       <w:pPr>
@@ -14652,14 +14495,13 @@
       <w:pPr>
         <w:pStyle w:val="Heading1"/>
       </w:pPr>
-      <w:bookmarkStart w:id="63" w:name="_Toc243136599"/>
-      <w:bookmarkStart w:id="64" w:name="danh-mục-tài-liệu-tham-khảo"/>
-      <w:bookmarkEnd w:id="62"/>
-      <w:r>
-        <w:lastRenderedPageBreak/>
+      <w:bookmarkStart w:id="64" w:name="_Toc243136599"/>
+      <w:bookmarkStart w:id="65" w:name="danh-mục-tài-liệu-tham-khảo"/>
+      <w:bookmarkEnd w:id="63"/>
+      <w:r>
         <w:t>11. Danh mục tài liệu tham khảo</w:t>
       </w:r>
-      <w:bookmarkEnd w:id="63"/>
+      <w:bookmarkEnd w:id="64"/>
     </w:p>
     <w:p>
       <w:pPr>
@@ -14688,6 +14530,7 @@
           <w:sz w:val="22"/>
           <w:szCs w:val="22"/>
         </w:rPr>
+        <w:lastRenderedPageBreak/>
         <w:t>Báo Đầu tư Chứng khoán. (2026). HNX nhập HOSE, UPCoM còn doanh nghiệp nào đang chia cổ tức tốt với P/E rẻ? [Bài báo ngày 06/10/2026].</w:t>
       </w:r>
     </w:p>
@@ -15150,7 +14993,6 @@
           <w:b/>
           <w:bCs/>
         </w:rPr>
-        <w:lastRenderedPageBreak/>
         <w:t>Tài liệu tiếng Anh</w:t>
       </w:r>
     </w:p>
@@ -15217,6 +15059,7 @@
           <w:sz w:val="22"/>
           <w:szCs w:val="22"/>
         </w:rPr>
+        <w:lastRenderedPageBreak/>
         <w:t xml:space="preserve">Amihud, Y., Mendelson, H., &amp; Lauterbach, B. (1997). Market microstructure and securities values: Evidence from the Tel Aviv Stock Exchange. </w:t>
       </w:r>
       <w:r>
@@ -16064,7 +15907,6 @@
           <w:sz w:val="22"/>
           <w:szCs w:val="22"/>
         </w:rPr>
-        <w:lastRenderedPageBreak/>
         <w:t xml:space="preserve">FTSE Russell. (2026a, September). </w:t>
       </w:r>
       <w:r>
@@ -16114,7 +15956,15 @@
           <w:sz w:val="22"/>
           <w:szCs w:val="22"/>
         </w:rPr>
-        <w:t xml:space="preserve"> (Version 1.3). LSEG. https://www.lseg.com/content/dam/ftse-russell/en_us/documents/policy-documents/ftse-faq-document-vietnam-reclassification.pdf</w:t>
+        <w:t xml:space="preserve"> (Version 1.3). LSEG. </w:t>
+      </w:r>
+      <w:r>
+        <w:rPr>
+          <w:sz w:val="22"/>
+          <w:szCs w:val="22"/>
+        </w:rPr>
+        <w:lastRenderedPageBreak/>
+        <w:t>https://www.lseg.com/content/dam/ftse-russell/en_us/documents/policy-documents/ftse-faq-document-vietnam-reclassification.pdf</w:t>
       </w:r>
     </w:p>
     <w:p>
@@ -16975,7 +16825,6 @@
           <w:sz w:val="22"/>
           <w:szCs w:val="22"/>
         </w:rPr>
-        <w:lastRenderedPageBreak/>
         <w:t xml:space="preserve">Lesmond, D. A. (2005). Liquidity of emerging markets. </w:t>
       </w:r>
       <w:r>
@@ -17074,6 +16923,7 @@
           <w:sz w:val="22"/>
           <w:szCs w:val="22"/>
         </w:rPr>
+        <w:lastRenderedPageBreak/>
         <w:t xml:space="preserve">Lo, A. W., &amp; MacKinlay, A. C. (1988). Stock market prices do not follow random walks: Evidence from a simple specification test. </w:t>
       </w:r>
       <w:r>
@@ -17941,7 +17791,6 @@
           <w:sz w:val="22"/>
           <w:szCs w:val="22"/>
         </w:rPr>
-        <w:lastRenderedPageBreak/>
         <w:t xml:space="preserve">Yao, J.-M. (2012). </w:t>
       </w:r>
       <w:r>
@@ -17977,6 +17826,7 @@
           <w:i/>
           <w:iCs/>
         </w:rPr>
+        <w:lastRenderedPageBreak/>
         <w:t>Hà Nội, ngày … tháng 10 năm 2026</w:t>
       </w:r>
     </w:p>
@@ -18016,7 +17866,7 @@
         </w:rPr>
         <w:t>Nguyễn Văn Trung</w:t>
       </w:r>
-      <w:bookmarkEnd w:id="64"/>
+      <w:bookmarkEnd w:id="65"/>
     </w:p>
     <w:sectPr>
       <w:footerReference w:type="default" r:id="rId16"/>
@@ -18547,6 +18397,22 @@
     </w:lvl>
   </w:abstractNum>
   <w:abstractNum w:abstractNumId="4" w15:restartNumberingAfterBreak="0">
+    <w:nsid w:val="52513D2B"/>
+    <w:multiLevelType w:val="singleLevel"/>
+    <w:tmpl w:val="D41CC6D0"/>
+    <w:lvl w:ilvl="0">
+      <w:start w:val="1"/>
+      <w:numFmt w:val="decimal"/>
+      <w:pStyle w:val="Heading4"/>
+      <w:suff w:val="space"/>
+      <w:lvlText w:val="Hình %1."/>
+      <w:lvlJc w:val="left"/>
+      <w:pPr>
+        <w:ind w:left="0" w:firstLine="0"/>
+      </w:pPr>
+    </w:lvl>
+  </w:abstractNum>
+  <w:abstractNum w:abstractNumId="5" w15:restartNumberingAfterBreak="0">
     <w:nsid w:val="52AD6BE4"/>
     <w:multiLevelType w:val="multilevel"/>
     <w:tmpl w:val="C388CC86"/>
@@ -18659,7 +18525,7 @@
       </w:rPr>
     </w:lvl>
   </w:abstractNum>
-  <w:abstractNum w:abstractNumId="5" w15:restartNumberingAfterBreak="0">
+  <w:abstractNum w:abstractNumId="6" w15:restartNumberingAfterBreak="0">
     <w:nsid w:val="5A3D10A4"/>
     <w:multiLevelType w:val="hybridMultilevel"/>
     <w:tmpl w:val="2D4053F8"/>
@@ -18772,7 +18638,7 @@
       </w:rPr>
     </w:lvl>
   </w:abstractNum>
-  <w:abstractNum w:abstractNumId="6" w15:restartNumberingAfterBreak="0">
+  <w:abstractNum w:abstractNumId="7" w15:restartNumberingAfterBreak="0">
     <w:nsid w:val="63487A6C"/>
     <w:multiLevelType w:val="multilevel"/>
     <w:tmpl w:val="A4F01F5C"/>
@@ -18885,7 +18751,23 @@
       </w:rPr>
     </w:lvl>
   </w:abstractNum>
-  <w:abstractNum w:abstractNumId="7" w15:restartNumberingAfterBreak="0">
+  <w:abstractNum w:abstractNumId="8" w15:restartNumberingAfterBreak="0">
+    <w:nsid w:val="65540525"/>
+    <w:multiLevelType w:val="singleLevel"/>
+    <w:tmpl w:val="F4E458E2"/>
+    <w:lvl w:ilvl="0">
+      <w:start w:val="1"/>
+      <w:numFmt w:val="decimal"/>
+      <w:pStyle w:val="Heading5"/>
+      <w:suff w:val="space"/>
+      <w:lvlText w:val="Bảng %1."/>
+      <w:lvlJc w:val="left"/>
+      <w:pPr>
+        <w:ind w:left="0" w:firstLine="0"/>
+      </w:pPr>
+    </w:lvl>
+  </w:abstractNum>
+  <w:abstractNum w:abstractNumId="9" w15:restartNumberingAfterBreak="0">
     <w:nsid w:val="67C41FB2"/>
     <w:multiLevelType w:val="hybridMultilevel"/>
     <w:tmpl w:val="5EF2D71A"/>
@@ -18998,7 +18880,7 @@
       </w:rPr>
     </w:lvl>
   </w:abstractNum>
-  <w:abstractNum w:abstractNumId="8" w15:restartNumberingAfterBreak="0">
+  <w:abstractNum w:abstractNumId="10" w15:restartNumberingAfterBreak="0">
     <w:nsid w:val="724D33B9"/>
     <w:multiLevelType w:val="hybridMultilevel"/>
     <w:tmpl w:val="A614FB82"/>
@@ -19111,42 +18993,14 @@
       </w:rPr>
     </w:lvl>
   </w:abstractNum>
-  <w:abstractNum w:abstractNumId="90">
-    <w:multiLevelType w:val="singleLevel"/>
-    <w:lvl w:ilvl="0">
-      <w:start w:val="1"/>
-      <w:numFmt w:val="decimal"/>
-      <w:pStyle w:val="Heading4"/>
-      <w:suff w:val="space"/>
-      <w:lvlText w:val="Hình %1."/>
-      <w:lvlJc w:val="left"/>
-      <w:pPr>
-        <w:ind w:left="0" w:firstLine="0"/>
-      </w:pPr>
-    </w:lvl>
-  </w:abstractNum>
-  <w:abstractNum w:abstractNumId="91">
-    <w:multiLevelType w:val="singleLevel"/>
-    <w:lvl w:ilvl="0">
-      <w:start w:val="1"/>
-      <w:numFmt w:val="decimal"/>
-      <w:pStyle w:val="Heading5"/>
-      <w:suff w:val="space"/>
-      <w:lvlText w:val="Bảng %1."/>
-      <w:lvlJc w:val="left"/>
-      <w:pPr>
-        <w:ind w:left="0" w:firstLine="0"/>
-      </w:pPr>
-    </w:lvl>
-  </w:abstractNum>
   <w:num w:numId="1" w16cid:durableId="1646162494">
     <w:abstractNumId w:val="0"/>
   </w:num>
   <w:num w:numId="2" w16cid:durableId="1179588804">
-    <w:abstractNumId w:val="6"/>
+    <w:abstractNumId w:val="7"/>
   </w:num>
   <w:num w:numId="3" w16cid:durableId="1929852519">
-    <w:abstractNumId w:val="4"/>
+    <w:abstractNumId w:val="5"/>
   </w:num>
   <w:num w:numId="4" w16cid:durableId="2058046184">
     <w:abstractNumId w:val="3"/>
@@ -19155,22 +19009,22 @@
     <w:abstractNumId w:val="2"/>
   </w:num>
   <w:num w:numId="6" w16cid:durableId="925768077">
-    <w:abstractNumId w:val="8"/>
+    <w:abstractNumId w:val="10"/>
   </w:num>
   <w:num w:numId="7" w16cid:durableId="754937169">
     <w:abstractNumId w:val="1"/>
   </w:num>
   <w:num w:numId="8" w16cid:durableId="1640300872">
-    <w:abstractNumId w:val="5"/>
+    <w:abstractNumId w:val="6"/>
   </w:num>
   <w:num w:numId="9" w16cid:durableId="1111169948">
-    <w:abstractNumId w:val="7"/>
+    <w:abstractNumId w:val="9"/>
   </w:num>
-  <w:num w:numId="90">
-    <w:abstractNumId w:val="90"/>
+  <w:num w:numId="10" w16cid:durableId="143471551">
+    <w:abstractNumId w:val="4"/>
   </w:num>
-  <w:num w:numId="91">
-    <w:abstractNumId w:val="91"/>
+  <w:num w:numId="11" w16cid:durableId="55321644">
+    <w:abstractNumId w:val="8"/>
   </w:num>
 </w:numbering>
 </file>
@@ -19626,6 +19480,48 @@
       <w:i/>
       <w:iCs/>
       <w:color w:val="000000"/>
+    </w:rPr>
+  </w:style>
+  <w:style w:type="paragraph" w:styleId="Heading4">
+    <w:name w:val="heading 4"/>
+    <w:basedOn w:val="Normal"/>
+    <w:next w:val="Normal"/>
+    <w:uiPriority w:val="9"/>
+    <w:unhideWhenUsed/>
+    <w:qFormat/>
+    <w:pPr>
+      <w:keepNext/>
+      <w:numPr>
+        <w:numId w:val="10"/>
+      </w:numPr>
+      <w:spacing w:before="60" w:line="312" w:lineRule="auto"/>
+      <w:jc w:val="center"/>
+      <w:outlineLvl w:val="3"/>
+    </w:pPr>
+    <w:rPr>
+      <w:b/>
+      <w:bCs/>
+    </w:rPr>
+  </w:style>
+  <w:style w:type="paragraph" w:styleId="Heading5">
+    <w:name w:val="heading 5"/>
+    <w:basedOn w:val="Normal"/>
+    <w:next w:val="Normal"/>
+    <w:uiPriority w:val="9"/>
+    <w:unhideWhenUsed/>
+    <w:qFormat/>
+    <w:pPr>
+      <w:keepNext/>
+      <w:numPr>
+        <w:numId w:val="11"/>
+      </w:numPr>
+      <w:spacing w:before="120" w:after="60" w:line="312" w:lineRule="auto"/>
+      <w:jc w:val="center"/>
+      <w:outlineLvl w:val="4"/>
+    </w:pPr>
+    <w:rPr>
+      <w:b/>
+      <w:bCs/>
     </w:rPr>
   </w:style>
   <w:style w:type="character" w:default="1" w:styleId="DefaultParagraphFont">
@@ -20446,51 +20342,39 @@
       </w:rPr>
     </w:tblStylePr>
   </w:style>
-  <w:style w:type="paragraph" w:styleId="Heading4">
-    <w:name w:val="heading 4"/>
+  <w:style w:type="paragraph" w:styleId="TOC4">
+    <w:name w:val="toc 4"/>
     <w:basedOn w:val="Normal"/>
     <w:next w:val="Normal"/>
-    <w:uiPriority w:val="9"/>
+    <w:autoRedefine/>
+    <w:uiPriority w:val="39"/>
     <w:unhideWhenUsed/>
-    <w:qFormat/>
+    <w:rsid w:val="001D4052"/>
     <w:pPr>
-      <w:keepNext/>
-      <w:numPr>
-        <w:numId w:val="90"/>
-      </w:numPr>
-      <w:spacing w:before="60" w:line="312" w:lineRule="auto"/>
-      <w:jc w:val="center"/>
-      <w:outlineLvl w:val="3"/>
+      <w:spacing w:after="100"/>
+      <w:ind w:left="780"/>
     </w:pPr>
-    <w:rPr>
-      <w:b/>
-      <w:bCs/>
-      <w:i w:val="0"/>
-      <w:iCs w:val="0"/>
-    </w:rPr>
   </w:style>
-  <w:style w:type="paragraph" w:styleId="Heading5">
-    <w:name w:val="heading 5"/>
+  <w:style w:type="paragraph" w:styleId="BodyTextIndent">
+    <w:name w:val="Body Text Indent"/>
     <w:basedOn w:val="Normal"/>
-    <w:next w:val="Normal"/>
-    <w:uiPriority w:val="9"/>
+    <w:link w:val="BodyTextIndentChar"/>
+    <w:uiPriority w:val="99"/>
+    <w:semiHidden/>
     <w:unhideWhenUsed/>
-    <w:qFormat/>
+    <w:rsid w:val="00761826"/>
     <w:pPr>
-      <w:keepNext/>
-      <w:numPr>
-        <w:numId w:val="91"/>
-      </w:numPr>
-      <w:spacing w:before="120" w:after="60" w:line="312" w:lineRule="auto"/>
-      <w:jc w:val="center"/>
-      <w:outlineLvl w:val="4"/>
+      <w:spacing w:after="120"/>
+      <w:ind w:left="360"/>
     </w:pPr>
-    <w:rPr>
-      <w:b/>
-      <w:bCs/>
-      <w:i w:val="0"/>
-      <w:iCs w:val="0"/>
-    </w:rPr>
+  </w:style>
+  <w:style w:type="character" w:customStyle="1" w:styleId="BodyTextIndentChar">
+    <w:name w:val="Body Text Indent Char"/>
+    <w:basedOn w:val="DefaultParagraphFont"/>
+    <w:link w:val="BodyTextIndent"/>
+    <w:uiPriority w:val="99"/>
+    <w:semiHidden/>
+    <w:rsid w:val="00761826"/>
   </w:style>
 </w:styles>
 </file>

</xml_diff>